<commit_message>
chore(Student 3): My part added to the doc
</commit_message>
<xml_diff>
--- a/Design_Doc.docx
+++ b/Design_Doc.docx
@@ -3,6 +3,337 @@
 <w:document xmlns:wpc="http://schemas.microsoft.com/office/word/2010/wordprocessingCanvas" xmlns:cx="http://schemas.microsoft.com/office/drawing/2014/chartex" xmlns:cx1="http://schemas.microsoft.com/office/drawing/2015/9/8/chartex" xmlns:cx2="http://schemas.microsoft.com/office/drawing/2015/10/21/chartex" xmlns:cx3="http://schemas.microsoft.com/office/drawing/2016/5/9/chartex" xmlns:cx4="http://schemas.microsoft.com/office/drawing/2016/5/10/chartex" xmlns:cx5="http://schemas.microsoft.com/office/drawing/2016/5/11/chartex" xmlns:cx6="http://schemas.microsoft.com/office/drawing/2016/5/12/chartex" xmlns:cx7="http://schemas.microsoft.com/office/drawing/2016/5/13/chartex" xmlns:cx8="http://schemas.microsoft.com/office/drawing/2016/5/14/chartex" xmlns:mc="http://schemas.openxmlformats.org/markup-compatibility/2006" xmlns:aink="http://schemas.microsoft.com/office/drawing/2016/ink" xmlns:am3d="http://schemas.microsoft.com/office/drawing/2017/model3d" xmlns:o="urn:schemas-microsoft-com:office:office" xmlns:oel="http://schemas.microsoft.com/office/2019/extlst" xmlns:r="http://schemas.openxmlformats.org/officeDocument/2006/relationships" xmlns:m="http://schemas.openxmlformats.org/officeDocument/2006/math" xmlns:v="urn:schemas-microsoft-com:vml" xmlns:wp14="http://schemas.microsoft.com/office/word/2010/wordprocessingDrawing" xmlns:wp="http://schemas.openxmlformats.org/drawingml/2006/wordprocessingDrawing" xmlns:w10="urn:schemas-microsoft-com:office:word" xmlns:w="http://schemas.openxmlformats.org/wordprocessingml/2006/main" xmlns:w14="http://schemas.microsoft.com/office/word/2010/wordml" xmlns:w15="http://schemas.microsoft.com/office/word/2012/wordml" xmlns:w16cex="http://schemas.microsoft.com/office/word/2018/wordml/cex" xmlns:w16cid="http://schemas.microsoft.com/office/word/2016/wordml/cid" xmlns:w16="http://schemas.microsoft.com/office/word/2018/wordml" xmlns:w16du="http://schemas.microsoft.com/office/word/2023/wordml/word16du" xmlns:w16sdtdh="http://schemas.microsoft.com/office/word/2020/wordml/sdtdatahash" xmlns:w16sdtfl="http://schemas.microsoft.com/office/word/2024/wordml/sdtformatlock" xmlns:w16se="http://schemas.microsoft.com/office/word/2015/wordml/symex" xmlns:wpg="http://schemas.microsoft.com/office/word/2010/wordprocessingGroup" xmlns:wpi="http://schemas.microsoft.com/office/word/2010/wordprocessingInk" xmlns:wne="http://schemas.microsoft.com/office/word/2006/wordml" xmlns:wps="http://schemas.microsoft.com/office/word/2010/wordprocessingShape" mc:Ignorable="w14 w15 w16se w16cid w16 w16cex w16sdtdh w16sdtfl w16du wp14">
   <w:body>
     <w:p>
+      <w:pPr>
+        <w:jc w:val="center"/>
+        <w:rPr>
+          <w:sz w:val="40"/>
+          <w:szCs w:val="40"/>
+          <w:lang w:val="en-CA"/>
+        </w:rPr>
+      </w:pPr>
+    </w:p>
+    <w:p>
+      <w:pPr>
+        <w:jc w:val="center"/>
+        <w:rPr>
+          <w:sz w:val="40"/>
+          <w:szCs w:val="40"/>
+          <w:lang w:val="en-CA"/>
+        </w:rPr>
+      </w:pPr>
+    </w:p>
+    <w:p>
+      <w:pPr>
+        <w:jc w:val="center"/>
+        <w:rPr>
+          <w:sz w:val="40"/>
+          <w:szCs w:val="40"/>
+          <w:lang w:val="en-CA"/>
+        </w:rPr>
+      </w:pPr>
+    </w:p>
+    <w:p>
+      <w:pPr>
+        <w:jc w:val="center"/>
+        <w:rPr>
+          <w:sz w:val="40"/>
+          <w:szCs w:val="40"/>
+          <w:lang w:val="en-CA"/>
+        </w:rPr>
+      </w:pPr>
+    </w:p>
+    <w:p>
+      <w:pPr>
+        <w:jc w:val="center"/>
+        <w:rPr>
+          <w:sz w:val="40"/>
+          <w:szCs w:val="40"/>
+          <w:lang w:val="en-CA"/>
+        </w:rPr>
+      </w:pPr>
+    </w:p>
+    <w:p>
+      <w:pPr>
+        <w:jc w:val="center"/>
+        <w:rPr>
+          <w:sz w:val="40"/>
+          <w:szCs w:val="40"/>
+          <w:lang w:val="en-CA"/>
+        </w:rPr>
+      </w:pPr>
+    </w:p>
+    <w:p>
+      <w:pPr>
+        <w:jc w:val="center"/>
+        <w:rPr>
+          <w:sz w:val="40"/>
+          <w:szCs w:val="40"/>
+          <w:lang w:val="en-CA"/>
+        </w:rPr>
+      </w:pPr>
+    </w:p>
+    <w:p>
+      <w:pPr>
+        <w:jc w:val="center"/>
+        <w:rPr>
+          <w:sz w:val="40"/>
+          <w:szCs w:val="40"/>
+          <w:lang w:val="en-CA"/>
+        </w:rPr>
+      </w:pPr>
+    </w:p>
+    <w:p>
+      <w:pPr>
+        <w:jc w:val="center"/>
+        <w:rPr>
+          <w:sz w:val="40"/>
+          <w:szCs w:val="40"/>
+          <w:lang w:val="en-CA"/>
+        </w:rPr>
+      </w:pPr>
+      <w:r>
+        <w:rPr>
+          <w:sz w:val="40"/>
+          <w:szCs w:val="40"/>
+          <w:lang w:val="en-CA"/>
+        </w:rPr>
+        <w:t>Capstone – Crixus</w:t>
+      </w:r>
+    </w:p>
+    <w:p>
+      <w:pPr>
+        <w:jc w:val="center"/>
+        <w:rPr>
+          <w:sz w:val="40"/>
+          <w:szCs w:val="40"/>
+          <w:lang w:val="en-CA"/>
+        </w:rPr>
+      </w:pPr>
+      <w:r>
+        <w:rPr>
+          <w:sz w:val="40"/>
+          <w:szCs w:val="40"/>
+          <w:lang w:val="en-CA"/>
+        </w:rPr>
+        <w:t>Group 1:</w:t>
+      </w:r>
+    </w:p>
+    <w:p>
+      <w:pPr>
+        <w:jc w:val="center"/>
+        <w:rPr>
+          <w:sz w:val="40"/>
+          <w:szCs w:val="40"/>
+          <w:lang w:val="en-CA"/>
+        </w:rPr>
+      </w:pPr>
+      <w:r>
+        <w:rPr>
+          <w:sz w:val="40"/>
+          <w:szCs w:val="40"/>
+          <w:lang w:val="en-CA"/>
+        </w:rPr>
+        <w:t>Alexander Sturgeon, Kenneth Barclay, Gurkirat Singh</w:t>
+      </w:r>
+    </w:p>
+    <w:p>
+      <w:pPr>
+        <w:jc w:val="center"/>
+        <w:rPr>
+          <w:sz w:val="40"/>
+          <w:szCs w:val="40"/>
+          <w:lang w:val="en-CA"/>
+        </w:rPr>
+      </w:pPr>
+      <w:r>
+        <w:rPr>
+          <w:sz w:val="40"/>
+          <w:szCs w:val="40"/>
+          <w:lang w:val="en-CA"/>
+        </w:rPr>
+        <w:t>Xx, 00, 2026</w:t>
+      </w:r>
+    </w:p>
+    <w:p>
+      <w:pPr>
+        <w:jc w:val="center"/>
+        <w:rPr>
+          <w:sz w:val="40"/>
+          <w:szCs w:val="40"/>
+          <w:lang w:val="en-CA"/>
+        </w:rPr>
+      </w:pPr>
+    </w:p>
+    <w:p>
+      <w:pPr>
+        <w:jc w:val="center"/>
+        <w:rPr>
+          <w:sz w:val="40"/>
+          <w:szCs w:val="40"/>
+          <w:lang w:val="en-CA"/>
+        </w:rPr>
+      </w:pPr>
+    </w:p>
+    <w:p>
+      <w:pPr>
+        <w:jc w:val="center"/>
+        <w:rPr>
+          <w:sz w:val="40"/>
+          <w:szCs w:val="40"/>
+          <w:lang w:val="en-CA"/>
+        </w:rPr>
+      </w:pPr>
+    </w:p>
+    <w:p>
+      <w:pPr>
+        <w:jc w:val="center"/>
+        <w:rPr>
+          <w:sz w:val="40"/>
+          <w:szCs w:val="40"/>
+          <w:lang w:val="en-CA"/>
+        </w:rPr>
+      </w:pPr>
+    </w:p>
+    <w:p>
+      <w:pPr>
+        <w:jc w:val="center"/>
+        <w:rPr>
+          <w:sz w:val="40"/>
+          <w:szCs w:val="40"/>
+          <w:lang w:val="en-CA"/>
+        </w:rPr>
+      </w:pPr>
+    </w:p>
+    <w:p>
+      <w:pPr>
+        <w:jc w:val="center"/>
+        <w:rPr>
+          <w:sz w:val="40"/>
+          <w:szCs w:val="40"/>
+          <w:lang w:val="en-CA"/>
+        </w:rPr>
+      </w:pPr>
+    </w:p>
+    <w:p>
+      <w:pPr>
+        <w:jc w:val="center"/>
+        <w:rPr>
+          <w:sz w:val="40"/>
+          <w:szCs w:val="40"/>
+          <w:lang w:val="en-CA"/>
+        </w:rPr>
+      </w:pPr>
+    </w:p>
+    <w:p>
+      <w:pPr>
+        <w:jc w:val="center"/>
+        <w:rPr>
+          <w:sz w:val="40"/>
+          <w:szCs w:val="40"/>
+          <w:lang w:val="en-CA"/>
+        </w:rPr>
+      </w:pPr>
+    </w:p>
+    <w:p>
+      <w:pPr>
+        <w:jc w:val="center"/>
+        <w:rPr>
+          <w:sz w:val="40"/>
+          <w:szCs w:val="40"/>
+          <w:lang w:val="en-CA"/>
+        </w:rPr>
+      </w:pPr>
+    </w:p>
+    <w:p>
+      <w:pPr>
+        <w:jc w:val="center"/>
+        <w:rPr>
+          <w:sz w:val="40"/>
+          <w:szCs w:val="40"/>
+          <w:lang w:val="en-CA"/>
+        </w:rPr>
+      </w:pPr>
+    </w:p>
+    <w:p>
+      <w:pPr>
+        <w:jc w:val="center"/>
+        <w:rPr>
+          <w:sz w:val="40"/>
+          <w:szCs w:val="40"/>
+          <w:lang w:val="en-CA"/>
+        </w:rPr>
+      </w:pPr>
+    </w:p>
+    <w:p>
+      <w:pPr>
+        <w:jc w:val="center"/>
+        <w:rPr>
+          <w:sz w:val="40"/>
+          <w:szCs w:val="40"/>
+          <w:lang w:val="en-CA"/>
+        </w:rPr>
+      </w:pPr>
+    </w:p>
+    <w:p>
+      <w:pPr>
+        <w:jc w:val="center"/>
+        <w:rPr>
+          <w:sz w:val="40"/>
+          <w:szCs w:val="40"/>
+          <w:lang w:val="en-CA"/>
+        </w:rPr>
+      </w:pPr>
+    </w:p>
+    <w:p>
+      <w:pPr>
+        <w:jc w:val="center"/>
+        <w:rPr>
+          <w:sz w:val="40"/>
+          <w:szCs w:val="40"/>
+          <w:lang w:val="en-CA"/>
+        </w:rPr>
+      </w:pPr>
+    </w:p>
+    <w:p>
+      <w:pPr>
+        <w:jc w:val="center"/>
+        <w:rPr>
+          <w:u w:val="single"/>
+        </w:rPr>
+      </w:pPr>
+    </w:p>
+    <w:p>
+      <w:pPr>
+        <w:rPr>
+          <w:b/>
+          <w:bCs/>
+          <w:sz w:val="32"/>
+          <w:szCs w:val="32"/>
+          <w:u w:val="single"/>
+        </w:rPr>
+      </w:pPr>
+      <w:r>
+        <w:rPr>
+          <w:b/>
+          <w:bCs/>
+          <w:sz w:val="32"/>
+          <w:szCs w:val="32"/>
+          <w:u w:val="single"/>
+        </w:rPr>
+        <w:t>Student 1</w:t>
+      </w:r>
+      <w:r>
+        <w:rPr>
+          <w:b/>
+          <w:bCs/>
+          <w:sz w:val="32"/>
+          <w:szCs w:val="32"/>
+          <w:u w:val="single"/>
+        </w:rPr>
+        <w:t xml:space="preserve"> (Kenneth)</w:t>
+      </w:r>
+    </w:p>
+    <w:p>
       <w:r>
         <w:rPr>
           <w:u w:val="single"/>
@@ -12,31 +343,7 @@
     </w:p>
     <w:p>
       <w:r>
-        <w:t xml:space="preserve">Crixus is a fight organizer designed for medieval fight reenactments. This will allow for users to create a custom profile for their fighter(s), add/edit/delete fighters up to a max of 4. You can buy armor and weapons in the armory, </w:t>
-      </w:r>
-      <w:proofErr w:type="gramStart"/>
-      <w:r>
-        <w:t>with in</w:t>
-      </w:r>
-      <w:proofErr w:type="gramEnd"/>
-      <w:r>
-        <w:t xml:space="preserve"> app currency that can be equipped </w:t>
-      </w:r>
-      <w:proofErr w:type="gramStart"/>
-      <w:r>
-        <w:t>to</w:t>
-      </w:r>
-      <w:proofErr w:type="gramEnd"/>
-      <w:r>
-        <w:t xml:space="preserve"> your fighters. You can earn that in game currency by sending your fighters to the arena to have them duel in single combat or team combat. The arena combat has a </w:t>
-      </w:r>
-      <w:proofErr w:type="gramStart"/>
-      <w:r>
-        <w:t>winners</w:t>
-      </w:r>
-      <w:proofErr w:type="gramEnd"/>
-      <w:r>
-        <w:t xml:space="preserve"> bonus which will be determined based on the salary(s) of the fighter(s) you are putting in the arena.</w:t>
+        <w:t>Crixus is a fight organizer designed for medieval fight reenactments. This will allow for users to create a custom profile for their fighter(s), add/edit/delete fighters up to a max of 4. You can buy armor and weapons in the armory, with in app currency that can be equipped to your fighters. You can earn that in game currency by sending your fighters to the arena to have them duel in single combat or team combat. The arena combat has a winners bonus which will be determined based on the salary(s) of the fighter(s) you are putting in the arena.</w:t>
       </w:r>
     </w:p>
     <w:p/>
@@ -86,16 +393,418 @@
         <w:t>Backend: Express TS + Typescript</w:t>
       </w:r>
     </w:p>
+    <w:p/>
+    <w:p>
+      <w:pPr>
+        <w:rPr>
+          <w:b/>
+          <w:bCs/>
+          <w:i/>
+          <w:iCs/>
+        </w:rPr>
+      </w:pPr>
+    </w:p>
+    <w:p>
+      <w:r>
+        <w:rPr>
+          <w:b/>
+          <w:bCs/>
+          <w:i/>
+          <w:iCs/>
+        </w:rPr>
+        <w:t>Table 1-</w:t>
+      </w:r>
+    </w:p>
+    <w:p>
+      <w:r>
+        <w:rPr>
+          <w:b/>
+          <w:bCs/>
+          <w:i/>
+          <w:iCs/>
+        </w:rPr>
+        <w:tab/>
+      </w:r>
+      <w:r>
+        <w:t>Name: Users</w:t>
+      </w:r>
+    </w:p>
+    <w:p>
+      <w:r>
+        <w:tab/>
+        <w:t>Purpose: Tracks basic user data, including in-game wallet and login details. </w:t>
+      </w:r>
+    </w:p>
+    <w:p>
+      <w:r>
+        <w:tab/>
+        <w:t>Fields: user_id, first_name, last_name, password, email, birth_date, wallet_gold, username, Team_team_id</w:t>
+      </w:r>
+    </w:p>
+    <w:p>
+      <w:r>
+        <w:tab/>
+        <w:t>Data Types: INT, VARCHAR, DATE, DOUBLE</w:t>
+      </w:r>
+    </w:p>
+    <w:p>
+      <w:r>
+        <w:tab/>
+        <w:t>Relationships: One to Many with Fighter, as a single user has multiple fighters. One to One with Team as each User has one team. </w:t>
+      </w:r>
+    </w:p>
+    <w:p>
+      <w:r>
+        <w:rPr>
+          <w:b/>
+          <w:bCs/>
+          <w:i/>
+          <w:iCs/>
+        </w:rPr>
+        <w:t>Table 2-</w:t>
+      </w:r>
+    </w:p>
+    <w:p>
+      <w:r>
+        <w:rPr>
+          <w:b/>
+          <w:bCs/>
+          <w:i/>
+          <w:iCs/>
+        </w:rPr>
+        <w:tab/>
+      </w:r>
+      <w:r>
+        <w:t>Name: Fighter</w:t>
+      </w:r>
+    </w:p>
+    <w:p>
+      <w:r>
+        <w:tab/>
+        <w:t>Purpose: Logs fighter details, including current weapon and armour ids, general skills, and cost.</w:t>
+      </w:r>
+    </w:p>
+    <w:p>
+      <w:r>
+        <w:tab/>
+        <w:t>Fields: fighter_id, first_name, last_name, appearance, strength, dexterity, constitution, intelligence, salary, Weapons_weapon_id, Armour_armour_id, User_users_id, Team_team_id</w:t>
+      </w:r>
+    </w:p>
+    <w:p>
+      <w:r>
+        <w:tab/>
+        <w:t>Data Types: INT, VARCHAR, DOUBLE</w:t>
+      </w:r>
+    </w:p>
+    <w:p>
+      <w:r>
+        <w:tab/>
+        <w:t>Relationships: Many to One with weapons, as multiple fighters can have the same weapon type. Many to One with armour, as multiple fighters can have the same armour type. One to Many with Fighter_has_Battle conjunction table, as a fighter can have many battles.Many to One with Team as each fighter only has one team.  </w:t>
+      </w:r>
+    </w:p>
+    <w:p/>
+    <w:p>
+      <w:r>
+        <w:rPr>
+          <w:b/>
+          <w:bCs/>
+          <w:i/>
+          <w:iCs/>
+        </w:rPr>
+        <w:t>Table 3-</w:t>
+      </w:r>
+    </w:p>
+    <w:p>
+      <w:r>
+        <w:rPr>
+          <w:b/>
+          <w:bCs/>
+          <w:i/>
+          <w:iCs/>
+        </w:rPr>
+        <w:tab/>
+      </w:r>
+      <w:r>
+        <w:t>Name: Weapon</w:t>
+      </w:r>
+    </w:p>
+    <w:p>
+      <w:r>
+        <w:tab/>
+        <w:t>Purpose: Stores weapon details, including their cost, damage and other stats.</w:t>
+      </w:r>
+    </w:p>
+    <w:p>
+      <w:r>
+        <w:tab/>
+        <w:t>Fields: weapon_id, name, appearance, damage, type, price, rarity</w:t>
+      </w:r>
+    </w:p>
+    <w:p>
+      <w:r>
+        <w:tab/>
+        <w:t>Data Types: INT, VARCHAR, DOUBLE</w:t>
+      </w:r>
+    </w:p>
+    <w:p>
+      <w:r>
+        <w:tab/>
+        <w:t>Relationships: One to Many with Fighter, as many fighters can have the same weapon type.</w:t>
+      </w:r>
+    </w:p>
+    <w:p/>
+    <w:p>
+      <w:r>
+        <w:rPr>
+          <w:b/>
+          <w:bCs/>
+          <w:i/>
+          <w:iCs/>
+        </w:rPr>
+        <w:t>Table 4-</w:t>
+      </w:r>
+    </w:p>
+    <w:p>
+      <w:r>
+        <w:rPr>
+          <w:b/>
+          <w:bCs/>
+          <w:i/>
+          <w:iCs/>
+        </w:rPr>
+        <w:tab/>
+      </w:r>
+      <w:r>
+        <w:t>Name: Armour</w:t>
+      </w:r>
+    </w:p>
+    <w:p>
+      <w:r>
+        <w:tab/>
+        <w:t>Purpose: Stores armour details, including damage protection, cost, and other stats.</w:t>
+      </w:r>
+    </w:p>
+    <w:p>
+      <w:r>
+        <w:tab/>
+        <w:t>Fields: armour_id, name, appearance, damage_protection, type, price, rarity</w:t>
+      </w:r>
+    </w:p>
+    <w:p>
+      <w:r>
+        <w:tab/>
+        <w:t>Data Types: INT, VARCHAR, DOUBLE</w:t>
+      </w:r>
+    </w:p>
+    <w:p>
+      <w:r>
+        <w:tab/>
+        <w:t>Relationships:</w:t>
+      </w:r>
+    </w:p>
+    <w:p/>
+    <w:p>
+      <w:r>
+        <w:rPr>
+          <w:b/>
+          <w:bCs/>
+          <w:i/>
+          <w:iCs/>
+        </w:rPr>
+        <w:t>Table 5-</w:t>
+      </w:r>
+    </w:p>
+    <w:p>
+      <w:r>
+        <w:rPr>
+          <w:b/>
+          <w:bCs/>
+          <w:i/>
+          <w:iCs/>
+        </w:rPr>
+        <w:tab/>
+      </w:r>
+      <w:r>
+        <w:t>Name: Battle</w:t>
+      </w:r>
+    </w:p>
+    <w:p>
+      <w:r>
+        <w:tab/>
+        <w:t>Purpose: Logs individual battle details for user analysis and statistics. </w:t>
+      </w:r>
+    </w:p>
+    <w:p>
+      <w:r>
+        <w:tab/>
+        <w:t>Fields: battle_id, battle_date</w:t>
+      </w:r>
+    </w:p>
+    <w:p>
+      <w:r>
+        <w:tab/>
+        <w:t>Data Types: INT, DATE</w:t>
+      </w:r>
+    </w:p>
+    <w:p>
+      <w:r>
+        <w:tab/>
+        <w:t>Relationships: One to Many relationship with Fighter_has_Battle, as a battle can have many fighters. One to Many Relationship with Team_has_Battle, as a battle has two teams. </w:t>
+      </w:r>
+    </w:p>
+    <w:p/>
+    <w:p>
+      <w:r>
+        <w:rPr>
+          <w:b/>
+          <w:bCs/>
+          <w:i/>
+          <w:iCs/>
+        </w:rPr>
+        <w:t>Table 6-</w:t>
+      </w:r>
+    </w:p>
+    <w:p>
+      <w:r>
+        <w:rPr>
+          <w:b/>
+          <w:bCs/>
+          <w:i/>
+          <w:iCs/>
+        </w:rPr>
+        <w:tab/>
+      </w:r>
+      <w:r>
+        <w:t>Name: Fighters_has_Battle</w:t>
+      </w:r>
+    </w:p>
+    <w:p>
+      <w:r>
+        <w:tab/>
+        <w:t>Purpose: Conjunction table linking the Fighter table to the Battle table, resolving the Many to Many relationship between them. Tracks result for duels and provides information about which fighters were part of which team battles. (Without this table there would be no way of knowing which fighters fought in a battle, only that the team itself did). </w:t>
+      </w:r>
+    </w:p>
+    <w:p>
+      <w:r>
+        <w:tab/>
+        <w:t>Fields: Fighter_fighter_id, Battle_battle_id, result. </w:t>
+      </w:r>
+    </w:p>
+    <w:p>
+      <w:r>
+        <w:tab/>
+        <w:t>Data Types: INT, BINARY</w:t>
+      </w:r>
+    </w:p>
+    <w:p>
+      <w:r>
+        <w:tab/>
+        <w:t>Relationships: Many to One relationship with Fighter and Battle. </w:t>
+      </w:r>
+    </w:p>
+    <w:p/>
+    <w:p>
+      <w:r>
+        <w:rPr>
+          <w:b/>
+          <w:bCs/>
+          <w:i/>
+          <w:iCs/>
+        </w:rPr>
+        <w:t>Table 7-</w:t>
+      </w:r>
+    </w:p>
+    <w:p>
+      <w:r>
+        <w:rPr>
+          <w:b/>
+          <w:bCs/>
+          <w:i/>
+          <w:iCs/>
+        </w:rPr>
+        <w:tab/>
+      </w:r>
+      <w:r>
+        <w:t>Name: Team</w:t>
+      </w:r>
+    </w:p>
+    <w:p>
+      <w:r>
+        <w:tab/>
+        <w:t>Purpose: Organizes fighters as a team for team battles. </w:t>
+      </w:r>
+    </w:p>
+    <w:p>
+      <w:r>
+        <w:tab/>
+        <w:t>Fields: team_id, team_label</w:t>
+      </w:r>
+    </w:p>
+    <w:p>
+      <w:r>
+        <w:tab/>
+        <w:t>Data Types: INT, VARCHAR</w:t>
+      </w:r>
+    </w:p>
+    <w:p>
+      <w:r>
+        <w:tab/>
+        <w:t>Relationships: One to One with User as each team only has one user. One to many with conjunction table Team_has_Battle as each team can be in multiple battles. One to Many relationship with Fighter as one team has many fighters. </w:t>
+      </w:r>
+    </w:p>
+    <w:p/>
+    <w:p>
+      <w:r>
+        <w:rPr>
+          <w:b/>
+          <w:bCs/>
+          <w:i/>
+          <w:iCs/>
+        </w:rPr>
+        <w:t>Table 8-</w:t>
+      </w:r>
+    </w:p>
+    <w:p>
+      <w:r>
+        <w:tab/>
+        <w:t>Name: Team_has_Battle</w:t>
+      </w:r>
+    </w:p>
+    <w:p>
+      <w:r>
+        <w:tab/>
+        <w:t>Purpose: Conjunction table that logs team battles, their results, and winnings. </w:t>
+      </w:r>
+    </w:p>
+    <w:p>
+      <w:r>
+        <w:tab/>
+        <w:t>Fields: Team_team_id, Battle_battle_id, result, winnings_gold</w:t>
+      </w:r>
+    </w:p>
+    <w:p>
+      <w:r>
+        <w:tab/>
+        <w:t>Data Types: INT, BINARY, DOUBLE</w:t>
+      </w:r>
+    </w:p>
+    <w:p>
+      <w:r>
+        <w:tab/>
+        <w:t>Relationships: Many to One relationship with both Team and Battle</w:t>
+      </w:r>
+    </w:p>
     <w:p>
       <w:r>
         <w:rPr>
           <w:noProof/>
         </w:rPr>
+        <w:lastRenderedPageBreak/>
         <w:drawing>
-          <wp:inline distT="0" distB="0" distL="0" distR="0" wp14:anchorId="31A86FD8" wp14:editId="7D80CF32">
+          <wp:inline distT="0" distB="0" distL="0" distR="0" wp14:anchorId="27787FE8" wp14:editId="2F539AA8">
             <wp:extent cx="5943600" cy="3180715"/>
             <wp:effectExtent l="0" t="0" r="0" b="635"/>
-            <wp:docPr id="335353758" name="Picture 1"/>
+            <wp:docPr id="2093067078" name="Picture 2"/>
             <wp:cNvGraphicFramePr>
               <a:graphicFrameLocks xmlns:a="http://schemas.openxmlformats.org/drawingml/2006/main" noChangeAspect="1"/>
             </wp:cNvGraphicFramePr>
@@ -103,13 +812,13 @@
               <a:graphicData uri="http://schemas.openxmlformats.org/drawingml/2006/picture">
                 <pic:pic xmlns:pic="http://schemas.openxmlformats.org/drawingml/2006/picture">
                   <pic:nvPicPr>
-                    <pic:cNvPr id="0" name="Picture 1"/>
+                    <pic:cNvPr id="0" name="Picture 2"/>
                     <pic:cNvPicPr>
                       <a:picLocks noChangeAspect="1" noChangeArrowheads="1"/>
                     </pic:cNvPicPr>
                   </pic:nvPicPr>
                   <pic:blipFill>
-                    <a:blip r:embed="rId8">
+                    <a:blip r:embed="rId10">
                       <a:extLst>
                         <a:ext uri="{28A0092B-C50C-407E-A947-70E740481C1C}">
                           <a14:useLocalDpi xmlns:a14="http://schemas.microsoft.com/office/drawing/2010/main" val="0"/>
@@ -141,764 +850,369 @@
         </w:drawing>
       </w:r>
     </w:p>
-    <w:p>
-      <w:pPr>
-        <w:rPr>
-          <w:b/>
-          <w:bCs/>
-          <w:i/>
-          <w:iCs/>
-        </w:rPr>
-      </w:pPr>
-    </w:p>
-    <w:p>
-      <w:r>
-        <w:rPr>
-          <w:b/>
-          <w:bCs/>
-          <w:i/>
-          <w:iCs/>
-        </w:rPr>
-        <w:t>Table 1-</w:t>
-      </w:r>
-    </w:p>
-    <w:p>
-      <w:r>
-        <w:rPr>
-          <w:b/>
-          <w:bCs/>
-          <w:i/>
-          <w:iCs/>
-        </w:rPr>
-        <w:tab/>
-      </w:r>
-      <w:r>
-        <w:t>Name: Users</w:t>
-      </w:r>
-    </w:p>
-    <w:p>
-      <w:r>
-        <w:tab/>
-        <w:t>Purpose: Tracks basic user data, including in-game wallet and login details. </w:t>
-      </w:r>
-    </w:p>
-    <w:p>
-      <w:r>
-        <w:tab/>
-        <w:t xml:space="preserve">Fields: </w:t>
-      </w:r>
-      <w:proofErr w:type="spellStart"/>
-      <w:r>
-        <w:t>user_id</w:t>
-      </w:r>
-      <w:proofErr w:type="spellEnd"/>
-      <w:r>
-        <w:t xml:space="preserve">, </w:t>
-      </w:r>
-      <w:proofErr w:type="spellStart"/>
-      <w:r>
-        <w:t>first_name</w:t>
-      </w:r>
-      <w:proofErr w:type="spellEnd"/>
-      <w:r>
-        <w:t xml:space="preserve">, </w:t>
-      </w:r>
-      <w:proofErr w:type="spellStart"/>
-      <w:r>
-        <w:t>last_name</w:t>
-      </w:r>
-      <w:proofErr w:type="spellEnd"/>
-      <w:r>
-        <w:t xml:space="preserve">, password, email, </w:t>
-      </w:r>
-      <w:proofErr w:type="spellStart"/>
-      <w:r>
-        <w:t>birth_date</w:t>
-      </w:r>
-      <w:proofErr w:type="spellEnd"/>
-      <w:r>
-        <w:t xml:space="preserve">, </w:t>
-      </w:r>
-      <w:proofErr w:type="spellStart"/>
-      <w:r>
-        <w:t>wallet_gold</w:t>
-      </w:r>
-      <w:proofErr w:type="spellEnd"/>
-      <w:r>
-        <w:t xml:space="preserve">, username, </w:t>
-      </w:r>
-      <w:proofErr w:type="spellStart"/>
-      <w:r>
-        <w:t>Team_team_id</w:t>
-      </w:r>
-      <w:proofErr w:type="spellEnd"/>
-    </w:p>
-    <w:p>
-      <w:r>
-        <w:tab/>
-        <w:t>Data Types: INT, VARCHAR, DATE, DOUBLE</w:t>
-      </w:r>
-    </w:p>
-    <w:p>
-      <w:r>
-        <w:tab/>
-        <w:t xml:space="preserve">Relationships: One </w:t>
-      </w:r>
-      <w:proofErr w:type="gramStart"/>
-      <w:r>
-        <w:t>to</w:t>
-      </w:r>
-      <w:proofErr w:type="gramEnd"/>
-      <w:r>
-        <w:t xml:space="preserve"> Many with Fighter, as a single user has multiple fighters. One to One with Team as each User has one team. </w:t>
-      </w:r>
-    </w:p>
-    <w:p>
-      <w:r>
-        <w:rPr>
-          <w:b/>
-          <w:bCs/>
-          <w:i/>
-          <w:iCs/>
-        </w:rPr>
-        <w:t>Table 2-</w:t>
-      </w:r>
-    </w:p>
-    <w:p>
-      <w:r>
-        <w:rPr>
-          <w:b/>
-          <w:bCs/>
-          <w:i/>
-          <w:iCs/>
-        </w:rPr>
-        <w:tab/>
-      </w:r>
-      <w:r>
-        <w:t>Name: Fighter</w:t>
-      </w:r>
-    </w:p>
-    <w:p>
-      <w:r>
+    <w:p/>
+    <w:p>
+      <w:pPr>
+        <w:rPr>
+          <w:b/>
+          <w:bCs/>
+          <w:sz w:val="32"/>
+          <w:szCs w:val="32"/>
+          <w:u w:val="single"/>
+        </w:rPr>
+      </w:pPr>
+      <w:r>
+        <w:rPr>
+          <w:b/>
+          <w:bCs/>
+          <w:sz w:val="32"/>
+          <w:szCs w:val="32"/>
+          <w:u w:val="single"/>
+        </w:rPr>
+        <w:t xml:space="preserve">Student </w:t>
+      </w:r>
+      <w:r>
+        <w:rPr>
+          <w:b/>
+          <w:bCs/>
+          <w:sz w:val="32"/>
+          <w:szCs w:val="32"/>
+          <w:u w:val="single"/>
+        </w:rPr>
+        <w:t>2 (Gurkirat)</w:t>
+      </w:r>
+    </w:p>
+    <w:p>
+      <w:pPr>
+        <w:rPr>
+          <w:b/>
+          <w:bCs/>
+          <w:sz w:val="32"/>
+          <w:szCs w:val="32"/>
+          <w:u w:val="single"/>
+        </w:rPr>
+      </w:pPr>
+    </w:p>
+    <w:p>
+      <w:pPr>
+        <w:rPr>
+          <w:b/>
+          <w:bCs/>
+          <w:sz w:val="32"/>
+          <w:szCs w:val="32"/>
+          <w:u w:val="single"/>
+        </w:rPr>
+      </w:pPr>
+    </w:p>
+    <w:p>
+      <w:pPr>
+        <w:rPr>
+          <w:b/>
+          <w:bCs/>
+          <w:sz w:val="32"/>
+          <w:szCs w:val="32"/>
+          <w:u w:val="single"/>
+        </w:rPr>
+      </w:pPr>
+    </w:p>
+    <w:p>
+      <w:pPr>
+        <w:rPr>
+          <w:b/>
+          <w:bCs/>
+          <w:sz w:val="32"/>
+          <w:szCs w:val="32"/>
+          <w:u w:val="single"/>
+        </w:rPr>
+      </w:pPr>
+    </w:p>
+    <w:p>
+      <w:pPr>
+        <w:rPr>
+          <w:b/>
+          <w:bCs/>
+          <w:sz w:val="32"/>
+          <w:szCs w:val="32"/>
+          <w:u w:val="single"/>
+        </w:rPr>
+      </w:pPr>
+    </w:p>
+    <w:p>
+      <w:pPr>
+        <w:rPr>
+          <w:b/>
+          <w:bCs/>
+          <w:sz w:val="32"/>
+          <w:szCs w:val="32"/>
+          <w:u w:val="single"/>
+        </w:rPr>
+      </w:pPr>
+    </w:p>
+    <w:p>
+      <w:pPr>
+        <w:rPr>
+          <w:b/>
+          <w:bCs/>
+          <w:sz w:val="32"/>
+          <w:szCs w:val="32"/>
+          <w:u w:val="single"/>
+        </w:rPr>
+      </w:pPr>
+    </w:p>
+    <w:p>
+      <w:pPr>
+        <w:rPr>
+          <w:b/>
+          <w:bCs/>
+          <w:sz w:val="32"/>
+          <w:szCs w:val="32"/>
+          <w:u w:val="single"/>
+        </w:rPr>
+      </w:pPr>
+    </w:p>
+    <w:p>
+      <w:pPr>
+        <w:rPr>
+          <w:b/>
+          <w:bCs/>
+          <w:sz w:val="32"/>
+          <w:szCs w:val="32"/>
+          <w:u w:val="single"/>
+        </w:rPr>
+      </w:pPr>
+    </w:p>
+    <w:p>
+      <w:pPr>
+        <w:rPr>
+          <w:b/>
+          <w:bCs/>
+          <w:sz w:val="32"/>
+          <w:szCs w:val="32"/>
+          <w:u w:val="single"/>
+        </w:rPr>
+      </w:pPr>
+    </w:p>
+    <w:p>
+      <w:pPr>
+        <w:rPr>
+          <w:b/>
+          <w:bCs/>
+          <w:sz w:val="32"/>
+          <w:szCs w:val="32"/>
+          <w:u w:val="single"/>
+        </w:rPr>
+      </w:pPr>
+    </w:p>
+    <w:p>
+      <w:pPr>
+        <w:rPr>
+          <w:b/>
+          <w:bCs/>
+          <w:sz w:val="32"/>
+          <w:szCs w:val="32"/>
+          <w:u w:val="single"/>
+        </w:rPr>
+      </w:pPr>
+    </w:p>
+    <w:p>
+      <w:pPr>
+        <w:rPr>
+          <w:b/>
+          <w:bCs/>
+          <w:sz w:val="32"/>
+          <w:szCs w:val="32"/>
+          <w:u w:val="single"/>
+        </w:rPr>
+      </w:pPr>
+    </w:p>
+    <w:p>
+      <w:pPr>
+        <w:rPr>
+          <w:b/>
+          <w:bCs/>
+          <w:sz w:val="32"/>
+          <w:szCs w:val="32"/>
+          <w:u w:val="single"/>
+        </w:rPr>
+      </w:pPr>
+    </w:p>
+    <w:p>
+      <w:pPr>
+        <w:rPr>
+          <w:b/>
+          <w:bCs/>
+          <w:sz w:val="32"/>
+          <w:szCs w:val="32"/>
+          <w:u w:val="single"/>
+        </w:rPr>
+      </w:pPr>
+    </w:p>
+    <w:p>
+      <w:pPr>
+        <w:rPr>
+          <w:b/>
+          <w:bCs/>
+          <w:sz w:val="32"/>
+          <w:szCs w:val="32"/>
+          <w:u w:val="single"/>
+        </w:rPr>
+      </w:pPr>
+    </w:p>
+    <w:p>
+      <w:pPr>
+        <w:rPr>
+          <w:b/>
+          <w:bCs/>
+          <w:sz w:val="32"/>
+          <w:szCs w:val="32"/>
+          <w:u w:val="single"/>
+        </w:rPr>
+      </w:pPr>
+    </w:p>
+    <w:p>
+      <w:pPr>
+        <w:rPr>
+          <w:b/>
+          <w:bCs/>
+          <w:sz w:val="32"/>
+          <w:szCs w:val="32"/>
+          <w:u w:val="single"/>
+        </w:rPr>
+      </w:pPr>
+    </w:p>
+    <w:p>
+      <w:pPr>
+        <w:rPr>
+          <w:b/>
+          <w:bCs/>
+          <w:sz w:val="32"/>
+          <w:szCs w:val="32"/>
+          <w:u w:val="single"/>
+        </w:rPr>
+      </w:pPr>
+      <w:r>
+        <w:rPr>
+          <w:b/>
+          <w:bCs/>
+          <w:sz w:val="32"/>
+          <w:szCs w:val="32"/>
+          <w:u w:val="single"/>
+        </w:rPr>
         <w:lastRenderedPageBreak/>
-        <w:tab/>
-        <w:t xml:space="preserve">Purpose: Logs fighter details, including current weapon and </w:t>
-      </w:r>
-      <w:proofErr w:type="spellStart"/>
-      <w:r>
-        <w:t>armour</w:t>
-      </w:r>
-      <w:proofErr w:type="spellEnd"/>
-      <w:r>
-        <w:t xml:space="preserve"> ids, general skills, and cost.</w:t>
-      </w:r>
-    </w:p>
-    <w:p>
-      <w:r>
-        <w:tab/>
-        <w:t xml:space="preserve">Fields: </w:t>
-      </w:r>
-      <w:proofErr w:type="spellStart"/>
-      <w:r>
-        <w:t>fighter_id</w:t>
-      </w:r>
-      <w:proofErr w:type="spellEnd"/>
-      <w:r>
-        <w:t xml:space="preserve">, </w:t>
-      </w:r>
-      <w:proofErr w:type="spellStart"/>
-      <w:r>
-        <w:t>first_name</w:t>
-      </w:r>
-      <w:proofErr w:type="spellEnd"/>
-      <w:r>
-        <w:t xml:space="preserve">, </w:t>
-      </w:r>
-      <w:proofErr w:type="spellStart"/>
-      <w:r>
-        <w:t>last_name</w:t>
-      </w:r>
-      <w:proofErr w:type="spellEnd"/>
-      <w:r>
-        <w:t xml:space="preserve">, appearance, strength, dexterity, constitution, intelligence, salary, Weapons_weapon_id, </w:t>
-      </w:r>
-      <w:proofErr w:type="spellStart"/>
-      <w:r>
-        <w:t>Armour_armour_id</w:t>
-      </w:r>
-      <w:proofErr w:type="spellEnd"/>
-      <w:r>
-        <w:t xml:space="preserve">, </w:t>
-      </w:r>
-      <w:proofErr w:type="spellStart"/>
-      <w:r>
-        <w:t>User_users_id</w:t>
-      </w:r>
-      <w:proofErr w:type="spellEnd"/>
-      <w:r>
-        <w:t xml:space="preserve">, </w:t>
-      </w:r>
-      <w:proofErr w:type="spellStart"/>
-      <w:r>
-        <w:t>Team_team_id</w:t>
-      </w:r>
-      <w:proofErr w:type="spellEnd"/>
-    </w:p>
-    <w:p>
-      <w:r>
-        <w:tab/>
-        <w:t>Data Types: INT, VARCHAR, DOUBLE</w:t>
-      </w:r>
-    </w:p>
-    <w:p>
-      <w:r>
-        <w:tab/>
-        <w:t xml:space="preserve">Relationships: Many to One with weapons, as multiple fighters can have the same weapon type. Many to One with </w:t>
-      </w:r>
-      <w:proofErr w:type="spellStart"/>
-      <w:r>
-        <w:t>armour</w:t>
-      </w:r>
-      <w:proofErr w:type="spellEnd"/>
-      <w:r>
-        <w:t xml:space="preserve">, as multiple fighters can have the same </w:t>
-      </w:r>
-      <w:proofErr w:type="spellStart"/>
-      <w:r>
-        <w:t>armour</w:t>
-      </w:r>
-      <w:proofErr w:type="spellEnd"/>
-      <w:r>
-        <w:t xml:space="preserve"> type. One to Many with </w:t>
-      </w:r>
-      <w:proofErr w:type="spellStart"/>
-      <w:r>
-        <w:t>Fighter_has_Battle</w:t>
-      </w:r>
-      <w:proofErr w:type="spellEnd"/>
-      <w:r>
-        <w:t xml:space="preserve"> conjunction table, as a fighter can have many </w:t>
-      </w:r>
-      <w:proofErr w:type="spellStart"/>
-      <w:proofErr w:type="gramStart"/>
-      <w:r>
-        <w:t>battles.Many</w:t>
-      </w:r>
-      <w:proofErr w:type="spellEnd"/>
-      <w:proofErr w:type="gramEnd"/>
-      <w:r>
-        <w:t xml:space="preserve"> to One with Team as each fighter only has one team.  </w:t>
-      </w:r>
-    </w:p>
-    <w:p/>
-    <w:p>
-      <w:r>
-        <w:rPr>
-          <w:b/>
-          <w:bCs/>
-          <w:i/>
-          <w:iCs/>
-        </w:rPr>
-        <w:t>Table 3-</w:t>
-      </w:r>
-    </w:p>
-    <w:p>
-      <w:r>
-        <w:rPr>
-          <w:b/>
-          <w:bCs/>
-          <w:i/>
-          <w:iCs/>
-        </w:rPr>
-        <w:tab/>
-      </w:r>
-      <w:r>
-        <w:t>Name: Weapon</w:t>
-      </w:r>
-    </w:p>
-    <w:p>
-      <w:r>
-        <w:tab/>
-        <w:t>Purpose: Stores weapon details, including their cost, damage and other stats.</w:t>
-      </w:r>
-    </w:p>
-    <w:p>
-      <w:r>
-        <w:tab/>
-        <w:t xml:space="preserve">Fields: </w:t>
-      </w:r>
-      <w:proofErr w:type="spellStart"/>
-      <w:r>
-        <w:t>weapon_id</w:t>
-      </w:r>
-      <w:proofErr w:type="spellEnd"/>
-      <w:r>
-        <w:t>, name, appearance, damage, type, price, rarity</w:t>
-      </w:r>
-    </w:p>
-    <w:p>
-      <w:r>
-        <w:tab/>
-        <w:t>Data Types: INT, VARCHAR, DOUBLE</w:t>
-      </w:r>
-    </w:p>
-    <w:p>
-      <w:r>
-        <w:tab/>
-        <w:t xml:space="preserve">Relationships: One </w:t>
-      </w:r>
-      <w:proofErr w:type="gramStart"/>
-      <w:r>
-        <w:t>to</w:t>
-      </w:r>
-      <w:proofErr w:type="gramEnd"/>
-      <w:r>
-        <w:t xml:space="preserve"> Many with Fighter, as many fighters can have the same weapon type.</w:t>
-      </w:r>
-    </w:p>
-    <w:p/>
-    <w:p>
-      <w:r>
-        <w:rPr>
-          <w:b/>
-          <w:bCs/>
-          <w:i/>
-          <w:iCs/>
-        </w:rPr>
-        <w:t>Table 4-</w:t>
-      </w:r>
-    </w:p>
-    <w:p>
-      <w:r>
-        <w:rPr>
-          <w:b/>
-          <w:bCs/>
-          <w:i/>
-          <w:iCs/>
-        </w:rPr>
-        <w:tab/>
-      </w:r>
-      <w:r>
-        <w:t xml:space="preserve">Name: </w:t>
-      </w:r>
-      <w:proofErr w:type="spellStart"/>
-      <w:r>
-        <w:t>Armour</w:t>
-      </w:r>
-      <w:proofErr w:type="spellEnd"/>
-    </w:p>
-    <w:p>
-      <w:r>
-        <w:tab/>
-        <w:t xml:space="preserve">Purpose: Stores </w:t>
-      </w:r>
-      <w:proofErr w:type="spellStart"/>
-      <w:r>
-        <w:t>armour</w:t>
-      </w:r>
-      <w:proofErr w:type="spellEnd"/>
-      <w:r>
-        <w:t xml:space="preserve"> details, including damage protection, cost, and other stats.</w:t>
-      </w:r>
-    </w:p>
-    <w:p>
-      <w:r>
-        <w:tab/>
-        <w:t xml:space="preserve">Fields: </w:t>
-      </w:r>
-      <w:proofErr w:type="spellStart"/>
-      <w:r>
-        <w:t>armour_id</w:t>
-      </w:r>
-      <w:proofErr w:type="spellEnd"/>
-      <w:r>
-        <w:t xml:space="preserve">, name, appearance, </w:t>
-      </w:r>
-      <w:proofErr w:type="spellStart"/>
-      <w:r>
-        <w:t>damage_protection</w:t>
-      </w:r>
-      <w:proofErr w:type="spellEnd"/>
-      <w:r>
-        <w:t>, type, price, rarity</w:t>
-      </w:r>
-    </w:p>
-    <w:p>
-      <w:r>
-        <w:tab/>
-        <w:t>Data Types: INT, VARCHAR, DOUBLE</w:t>
-      </w:r>
-    </w:p>
-    <w:p>
-      <w:r>
-        <w:tab/>
-        <w:t>Relationships:</w:t>
-      </w:r>
-    </w:p>
-    <w:p/>
-    <w:p>
-      <w:r>
-        <w:rPr>
-          <w:b/>
-          <w:bCs/>
-          <w:i/>
-          <w:iCs/>
-        </w:rPr>
-        <w:t>Table 5-</w:t>
-      </w:r>
-    </w:p>
-    <w:p>
-      <w:r>
-        <w:rPr>
-          <w:b/>
-          <w:bCs/>
-          <w:i/>
-          <w:iCs/>
-        </w:rPr>
-        <w:tab/>
-      </w:r>
-      <w:r>
-        <w:t>Name: Battle</w:t>
-      </w:r>
-    </w:p>
-    <w:p>
-      <w:r>
-        <w:tab/>
-        <w:t>Purpose: Logs individual battle details for user analysis and statistics. </w:t>
-      </w:r>
-    </w:p>
-    <w:p>
-      <w:r>
-        <w:tab/>
-        <w:t xml:space="preserve">Fields: </w:t>
-      </w:r>
-      <w:proofErr w:type="spellStart"/>
-      <w:r>
-        <w:t>battle_id</w:t>
-      </w:r>
-      <w:proofErr w:type="spellEnd"/>
-      <w:r>
-        <w:t xml:space="preserve">, </w:t>
-      </w:r>
-      <w:proofErr w:type="spellStart"/>
-      <w:r>
-        <w:t>battle_date</w:t>
-      </w:r>
-      <w:proofErr w:type="spellEnd"/>
-    </w:p>
-    <w:p>
-      <w:r>
-        <w:tab/>
-        <w:t>Data Types: INT, DATE</w:t>
-      </w:r>
-    </w:p>
-    <w:p>
-      <w:r>
-        <w:tab/>
-        <w:t xml:space="preserve">Relationships: One </w:t>
-      </w:r>
-      <w:proofErr w:type="gramStart"/>
-      <w:r>
-        <w:t>to</w:t>
-      </w:r>
-      <w:proofErr w:type="gramEnd"/>
-      <w:r>
-        <w:t xml:space="preserve"> Many </w:t>
-      </w:r>
-      <w:proofErr w:type="gramStart"/>
-      <w:r>
-        <w:t>relationship</w:t>
-      </w:r>
-      <w:proofErr w:type="gramEnd"/>
-      <w:r>
-        <w:t xml:space="preserve"> with </w:t>
-      </w:r>
-      <w:proofErr w:type="spellStart"/>
-      <w:r>
-        <w:t>Fighter_has_Battle</w:t>
-      </w:r>
-      <w:proofErr w:type="spellEnd"/>
-      <w:r>
-        <w:t xml:space="preserve">, as a battle can have many fighters. One to Many </w:t>
-      </w:r>
-      <w:proofErr w:type="gramStart"/>
-      <w:r>
-        <w:t>Relationship</w:t>
-      </w:r>
-      <w:proofErr w:type="gramEnd"/>
-      <w:r>
-        <w:t xml:space="preserve"> with </w:t>
-      </w:r>
-      <w:proofErr w:type="spellStart"/>
-      <w:r>
-        <w:t>Team_has_Battle</w:t>
-      </w:r>
-      <w:proofErr w:type="spellEnd"/>
-      <w:r>
-        <w:t>, as a battle has two teams. </w:t>
-      </w:r>
-    </w:p>
-    <w:p/>
-    <w:p>
-      <w:r>
-        <w:rPr>
-          <w:b/>
-          <w:bCs/>
-          <w:i/>
-          <w:iCs/>
-        </w:rPr>
-        <w:t>Table 6-</w:t>
-      </w:r>
-    </w:p>
-    <w:p>
-      <w:r>
-        <w:rPr>
-          <w:b/>
-          <w:bCs/>
-          <w:i/>
-          <w:iCs/>
-        </w:rPr>
-        <w:tab/>
-      </w:r>
-      <w:r>
-        <w:t xml:space="preserve">Name: </w:t>
-      </w:r>
-      <w:proofErr w:type="spellStart"/>
-      <w:r>
-        <w:t>Fighters_has_Battle</w:t>
-      </w:r>
-      <w:proofErr w:type="spellEnd"/>
-    </w:p>
-    <w:p>
-      <w:r>
-        <w:tab/>
-        <w:t xml:space="preserve">Purpose: Conjunction table linking the Fighter table to the Battle table, resolving the Many to Many </w:t>
-      </w:r>
-      <w:proofErr w:type="gramStart"/>
-      <w:r>
-        <w:t>relationship</w:t>
-      </w:r>
-      <w:proofErr w:type="gramEnd"/>
-      <w:r>
-        <w:t xml:space="preserve"> between them. Tracks </w:t>
-      </w:r>
-      <w:proofErr w:type="gramStart"/>
-      <w:r>
-        <w:t>result</w:t>
-      </w:r>
-      <w:proofErr w:type="gramEnd"/>
-      <w:r>
-        <w:t xml:space="preserve"> for duels and </w:t>
-      </w:r>
-      <w:proofErr w:type="gramStart"/>
-      <w:r>
-        <w:t>provides</w:t>
-      </w:r>
-      <w:proofErr w:type="gramEnd"/>
-      <w:r>
-        <w:t xml:space="preserve"> information about which fighters were part of which team battles. (Without this table there would be no way of knowing which fighters fought in a battle, only that the team itself did). </w:t>
-      </w:r>
-    </w:p>
-    <w:p>
-      <w:r>
-        <w:tab/>
-        <w:t xml:space="preserve">Fields: </w:t>
-      </w:r>
-      <w:proofErr w:type="spellStart"/>
-      <w:r>
-        <w:t>Fighter_fighter_id</w:t>
-      </w:r>
-      <w:proofErr w:type="spellEnd"/>
-      <w:r>
-        <w:t xml:space="preserve">, </w:t>
-      </w:r>
-      <w:proofErr w:type="spellStart"/>
-      <w:r>
-        <w:t>Battle_battle_id</w:t>
-      </w:r>
-      <w:proofErr w:type="spellEnd"/>
-      <w:r>
-        <w:t>, result. </w:t>
-      </w:r>
-    </w:p>
-    <w:p>
-      <w:r>
-        <w:tab/>
-        <w:t>Data Types: INT, BINARY</w:t>
-      </w:r>
-    </w:p>
-    <w:p>
-      <w:r>
-        <w:tab/>
-        <w:t>Relationships: Many to One relationship with Fighter and Battle. </w:t>
-      </w:r>
-    </w:p>
-    <w:p/>
-    <w:p>
-      <w:r>
-        <w:rPr>
-          <w:b/>
-          <w:bCs/>
-          <w:i/>
-          <w:iCs/>
-        </w:rPr>
-        <w:t>Table 7-</w:t>
-      </w:r>
-    </w:p>
-    <w:p>
-      <w:r>
-        <w:rPr>
-          <w:b/>
-          <w:bCs/>
-          <w:i/>
-          <w:iCs/>
-        </w:rPr>
-        <w:tab/>
-      </w:r>
-      <w:r>
-        <w:t>Name: Team</w:t>
-      </w:r>
-    </w:p>
-    <w:p>
-      <w:r>
-        <w:tab/>
-        <w:t>Purpose: Organizes fighters as a team for team battles. </w:t>
-      </w:r>
-    </w:p>
-    <w:p>
-      <w:r>
-        <w:tab/>
-        <w:t xml:space="preserve">Fields: </w:t>
-      </w:r>
-      <w:proofErr w:type="spellStart"/>
-      <w:r>
-        <w:t>team_id</w:t>
-      </w:r>
-      <w:proofErr w:type="spellEnd"/>
-      <w:r>
-        <w:t xml:space="preserve">, </w:t>
-      </w:r>
-      <w:proofErr w:type="spellStart"/>
-      <w:r>
-        <w:t>team_label</w:t>
-      </w:r>
-      <w:proofErr w:type="spellEnd"/>
-    </w:p>
-    <w:p>
-      <w:r>
-        <w:tab/>
-        <w:t>Data Types: INT, VARCHAR</w:t>
-      </w:r>
-    </w:p>
-    <w:p>
-      <w:r>
-        <w:lastRenderedPageBreak/>
-        <w:tab/>
-        <w:t xml:space="preserve">Relationships: One to One with User as each team only has one user. One </w:t>
-      </w:r>
-      <w:proofErr w:type="gramStart"/>
-      <w:r>
-        <w:t>to</w:t>
-      </w:r>
-      <w:proofErr w:type="gramEnd"/>
-      <w:r>
-        <w:t xml:space="preserve"> many with conjunction table </w:t>
-      </w:r>
-      <w:proofErr w:type="spellStart"/>
-      <w:r>
-        <w:t>Team_has_Battle</w:t>
-      </w:r>
-      <w:proofErr w:type="spellEnd"/>
-      <w:r>
-        <w:t xml:space="preserve"> as each team can be in multiple battles. One to Many </w:t>
-      </w:r>
-      <w:proofErr w:type="gramStart"/>
-      <w:r>
-        <w:t>relationship</w:t>
-      </w:r>
-      <w:proofErr w:type="gramEnd"/>
-      <w:r>
-        <w:t xml:space="preserve"> with Fighter as one team has many fighters. </w:t>
-      </w:r>
-    </w:p>
-    <w:p/>
-    <w:p>
-      <w:r>
-        <w:rPr>
-          <w:b/>
-          <w:bCs/>
-          <w:i/>
-          <w:iCs/>
-        </w:rPr>
-        <w:t>Table 8-</w:t>
-      </w:r>
-    </w:p>
-    <w:p>
-      <w:r>
-        <w:tab/>
-        <w:t xml:space="preserve">Name: </w:t>
-      </w:r>
-      <w:proofErr w:type="spellStart"/>
-      <w:r>
-        <w:t>Team_has_Battle</w:t>
-      </w:r>
-      <w:proofErr w:type="spellEnd"/>
-    </w:p>
-    <w:p>
-      <w:r>
-        <w:tab/>
-        <w:t>Purpose: Conjunction table that logs team battles, their results, and winnings. </w:t>
-      </w:r>
-    </w:p>
-    <w:p>
-      <w:r>
-        <w:tab/>
-        <w:t xml:space="preserve">Fields: </w:t>
-      </w:r>
-      <w:proofErr w:type="spellStart"/>
-      <w:r>
-        <w:t>Team_team_id</w:t>
-      </w:r>
-      <w:proofErr w:type="spellEnd"/>
-      <w:r>
-        <w:t xml:space="preserve">, </w:t>
-      </w:r>
-      <w:proofErr w:type="spellStart"/>
-      <w:r>
-        <w:t>Battle_battle_id</w:t>
-      </w:r>
-      <w:proofErr w:type="spellEnd"/>
-      <w:r>
-        <w:t xml:space="preserve">, result, </w:t>
-      </w:r>
-      <w:proofErr w:type="spellStart"/>
-      <w:r>
-        <w:t>winnings_gold</w:t>
-      </w:r>
-      <w:proofErr w:type="spellEnd"/>
-    </w:p>
-    <w:p>
-      <w:r>
-        <w:tab/>
-        <w:t>Data Types: INT, BINARY, DOUBLE</w:t>
-      </w:r>
-    </w:p>
-    <w:p>
-      <w:r>
-        <w:tab/>
-        <w:t>Relationships: Many to One relationship with both Team and Battle</w:t>
-      </w:r>
-    </w:p>
-    <w:p>
-      <w:r>
-        <w:rPr>
-          <w:noProof/>
+        <w:t xml:space="preserve">Student </w:t>
+      </w:r>
+      <w:r>
+        <w:rPr>
+          <w:b/>
+          <w:bCs/>
+          <w:sz w:val="32"/>
+          <w:szCs w:val="32"/>
+          <w:u w:val="single"/>
+        </w:rPr>
+        <w:t>3 (Alexander)</w:t>
+      </w:r>
+    </w:p>
+    <w:p>
+      <w:pPr>
+        <w:rPr>
+          <w:b/>
+          <w:bCs/>
+          <w:sz w:val="32"/>
+          <w:szCs w:val="32"/>
+          <w:u w:val="single"/>
+        </w:rPr>
+      </w:pPr>
+    </w:p>
+    <w:p>
+      <w:pPr>
+        <w:jc w:val="center"/>
+        <w:rPr>
+          <w:b/>
+          <w:bCs/>
+          <w:sz w:val="28"/>
+          <w:szCs w:val="28"/>
+          <w:lang w:val="en-CA"/>
+        </w:rPr>
+      </w:pPr>
+      <w:r>
+        <w:rPr>
+          <w:b/>
+          <w:bCs/>
+          <w:sz w:val="28"/>
+          <w:szCs w:val="28"/>
+          <w:lang w:val="en-CA"/>
+        </w:rPr>
+        <w:t>Wire</w:t>
+      </w:r>
+      <w:r>
+        <w:rPr>
+          <w:b/>
+          <w:bCs/>
+          <w:sz w:val="28"/>
+          <w:szCs w:val="28"/>
+          <w:lang w:val="en-CA"/>
+        </w:rPr>
+        <w:t xml:space="preserve"> </w:t>
+      </w:r>
+      <w:r>
+        <w:rPr>
+          <w:b/>
+          <w:bCs/>
+          <w:sz w:val="28"/>
+          <w:szCs w:val="28"/>
+          <w:lang w:val="en-CA"/>
+        </w:rPr>
+        <w:t>Frames</w:t>
+      </w:r>
+    </w:p>
+    <w:p>
+      <w:pPr>
+        <w:rPr>
+          <w:b/>
+          <w:bCs/>
+          <w:sz w:val="24"/>
+          <w:szCs w:val="24"/>
+          <w:u w:val="single"/>
+          <w:lang w:val="en-CA"/>
+        </w:rPr>
+      </w:pPr>
+      <w:r>
+        <w:rPr>
+          <w:b/>
+          <w:bCs/>
+          <w:sz w:val="24"/>
+          <w:szCs w:val="24"/>
+          <w:u w:val="single"/>
+          <w:lang w:val="en-CA"/>
+        </w:rPr>
+        <w:t>Home Page</w:t>
+      </w:r>
+    </w:p>
+    <w:p>
+      <w:pPr>
+        <w:rPr>
+          <w:b/>
+          <w:bCs/>
+          <w:sz w:val="32"/>
+          <w:szCs w:val="32"/>
+          <w:u w:val="single"/>
+          <w:lang w:val="en-CA"/>
+        </w:rPr>
+      </w:pPr>
+      <w:r>
+        <w:rPr>
+          <w:b/>
+          <w:bCs/>
+          <w:sz w:val="32"/>
+          <w:szCs w:val="32"/>
+          <w:u w:val="single"/>
+          <w:lang w:val="en-CA"/>
         </w:rPr>
         <w:drawing>
-          <wp:inline distT="0" distB="0" distL="0" distR="0" wp14:anchorId="27787FE8" wp14:editId="2F539AA8">
-            <wp:extent cx="5943600" cy="3180715"/>
-            <wp:effectExtent l="0" t="0" r="0" b="635"/>
-            <wp:docPr id="2093067078" name="Picture 2"/>
+          <wp:inline distT="0" distB="0" distL="0" distR="0" wp14:anchorId="569CD5F8" wp14:editId="5E17ABF8">
+            <wp:extent cx="5943600" cy="6598920"/>
+            <wp:effectExtent l="0" t="0" r="0" b="0"/>
+            <wp:docPr id="1540080466" name="Picture 24"/>
             <wp:cNvGraphicFramePr>
               <a:graphicFrameLocks xmlns:a="http://schemas.openxmlformats.org/drawingml/2006/main" noChangeAspect="1"/>
             </wp:cNvGraphicFramePr>
@@ -906,13 +1220,13 @@
               <a:graphicData uri="http://schemas.openxmlformats.org/drawingml/2006/picture">
                 <pic:pic xmlns:pic="http://schemas.openxmlformats.org/drawingml/2006/picture">
                   <pic:nvPicPr>
-                    <pic:cNvPr id="0" name="Picture 2"/>
+                    <pic:cNvPr id="0" name="Picture 63"/>
                     <pic:cNvPicPr>
                       <a:picLocks noChangeAspect="1" noChangeArrowheads="1"/>
                     </pic:cNvPicPr>
                   </pic:nvPicPr>
                   <pic:blipFill>
-                    <a:blip r:embed="rId8">
+                    <a:blip r:embed="rId11">
                       <a:extLst>
                         <a:ext uri="{28A0092B-C50C-407E-A947-70E740481C1C}">
                           <a14:useLocalDpi xmlns:a14="http://schemas.microsoft.com/office/drawing/2010/main" val="0"/>
@@ -927,7 +1241,7 @@
                   <pic:spPr bwMode="auto">
                     <a:xfrm>
                       <a:off x="0" y="0"/>
-                      <a:ext cx="5943600" cy="3180715"/>
+                      <a:ext cx="5943600" cy="6598920"/>
                     </a:xfrm>
                     <a:prstGeom prst="rect">
                       <a:avLst/>
@@ -943,8 +1257,1756 @@
           </wp:inline>
         </w:drawing>
       </w:r>
-    </w:p>
+      <w:r>
+        <w:rPr>
+          <w:b/>
+          <w:bCs/>
+          <w:sz w:val="32"/>
+          <w:szCs w:val="32"/>
+          <w:u w:val="single"/>
+          <w:lang w:val="en-CA"/>
+        </w:rPr>
+        <w:br/>
+      </w:r>
+      <w:r>
+        <w:rPr>
+          <w:b/>
+          <w:bCs/>
+          <w:sz w:val="32"/>
+          <w:szCs w:val="32"/>
+          <w:u w:val="single"/>
+          <w:lang w:val="en-CA"/>
+        </w:rPr>
+        <w:br/>
+      </w:r>
+    </w:p>
+    <w:p>
+      <w:pPr>
+        <w:rPr>
+          <w:b/>
+          <w:bCs/>
+          <w:sz w:val="32"/>
+          <w:szCs w:val="32"/>
+          <w:u w:val="single"/>
+          <w:lang w:val="en-CA"/>
+        </w:rPr>
+      </w:pPr>
+      <w:r>
+        <w:rPr>
+          <w:b/>
+          <w:bCs/>
+          <w:sz w:val="24"/>
+          <w:szCs w:val="24"/>
+          <w:u w:val="single"/>
+          <w:lang w:val="en-CA"/>
+        </w:rPr>
+        <w:lastRenderedPageBreak/>
+        <w:t>Home Page w/ Drop Down</w:t>
+      </w:r>
+    </w:p>
+    <w:p>
+      <w:pPr>
+        <w:rPr>
+          <w:b/>
+          <w:bCs/>
+          <w:sz w:val="32"/>
+          <w:szCs w:val="32"/>
+          <w:u w:val="single"/>
+          <w:lang w:val="en-CA"/>
+        </w:rPr>
+      </w:pPr>
+      <w:r>
+        <w:rPr>
+          <w:b/>
+          <w:bCs/>
+          <w:sz w:val="32"/>
+          <w:szCs w:val="32"/>
+          <w:u w:val="single"/>
+          <w:lang w:val="en-CA"/>
+        </w:rPr>
+        <w:tab/>
+      </w:r>
+      <w:r>
+        <w:rPr>
+          <w:b/>
+          <w:bCs/>
+          <w:sz w:val="32"/>
+          <w:szCs w:val="32"/>
+          <w:u w:val="single"/>
+          <w:lang w:val="en-CA"/>
+        </w:rPr>
+        <w:drawing>
+          <wp:inline distT="0" distB="0" distL="0" distR="0" wp14:anchorId="59C96C33" wp14:editId="3262862A">
+            <wp:extent cx="5943600" cy="6583680"/>
+            <wp:effectExtent l="0" t="0" r="0" b="7620"/>
+            <wp:docPr id="953617776" name="Picture 23"/>
+            <wp:cNvGraphicFramePr>
+              <a:graphicFrameLocks xmlns:a="http://schemas.openxmlformats.org/drawingml/2006/main" noChangeAspect="1"/>
+            </wp:cNvGraphicFramePr>
+            <a:graphic xmlns:a="http://schemas.openxmlformats.org/drawingml/2006/main">
+              <a:graphicData uri="http://schemas.openxmlformats.org/drawingml/2006/picture">
+                <pic:pic xmlns:pic="http://schemas.openxmlformats.org/drawingml/2006/picture">
+                  <pic:nvPicPr>
+                    <pic:cNvPr id="0" name="Picture 64"/>
+                    <pic:cNvPicPr>
+                      <a:picLocks noChangeAspect="1" noChangeArrowheads="1"/>
+                    </pic:cNvPicPr>
+                  </pic:nvPicPr>
+                  <pic:blipFill>
+                    <a:blip r:embed="rId12">
+                      <a:extLst>
+                        <a:ext uri="{28A0092B-C50C-407E-A947-70E740481C1C}">
+                          <a14:useLocalDpi xmlns:a14="http://schemas.microsoft.com/office/drawing/2010/main" val="0"/>
+                        </a:ext>
+                      </a:extLst>
+                    </a:blip>
+                    <a:srcRect/>
+                    <a:stretch>
+                      <a:fillRect/>
+                    </a:stretch>
+                  </pic:blipFill>
+                  <pic:spPr bwMode="auto">
+                    <a:xfrm>
+                      <a:off x="0" y="0"/>
+                      <a:ext cx="5943600" cy="6583680"/>
+                    </a:xfrm>
+                    <a:prstGeom prst="rect">
+                      <a:avLst/>
+                    </a:prstGeom>
+                    <a:noFill/>
+                    <a:ln>
+                      <a:noFill/>
+                    </a:ln>
+                  </pic:spPr>
+                </pic:pic>
+              </a:graphicData>
+            </a:graphic>
+          </wp:inline>
+        </w:drawing>
+      </w:r>
+    </w:p>
+    <w:p>
+      <w:pPr>
+        <w:rPr>
+          <w:b/>
+          <w:bCs/>
+          <w:sz w:val="24"/>
+          <w:szCs w:val="24"/>
+          <w:u w:val="single"/>
+          <w:lang w:val="en-CA"/>
+        </w:rPr>
+      </w:pPr>
+    </w:p>
+    <w:p>
+      <w:pPr>
+        <w:rPr>
+          <w:b/>
+          <w:bCs/>
+          <w:sz w:val="24"/>
+          <w:szCs w:val="24"/>
+          <w:u w:val="single"/>
+          <w:lang w:val="en-CA"/>
+        </w:rPr>
+      </w:pPr>
+    </w:p>
+    <w:p>
+      <w:pPr>
+        <w:rPr>
+          <w:b/>
+          <w:bCs/>
+          <w:sz w:val="24"/>
+          <w:szCs w:val="24"/>
+          <w:u w:val="single"/>
+          <w:lang w:val="en-CA"/>
+        </w:rPr>
+      </w:pPr>
+    </w:p>
+    <w:p>
+      <w:pPr>
+        <w:rPr>
+          <w:b/>
+          <w:bCs/>
+          <w:sz w:val="24"/>
+          <w:szCs w:val="24"/>
+          <w:u w:val="single"/>
+          <w:lang w:val="en-CA"/>
+        </w:rPr>
+      </w:pPr>
+    </w:p>
+    <w:p>
+      <w:pPr>
+        <w:rPr>
+          <w:b/>
+          <w:bCs/>
+          <w:sz w:val="24"/>
+          <w:szCs w:val="24"/>
+          <w:u w:val="single"/>
+          <w:lang w:val="en-CA"/>
+        </w:rPr>
+      </w:pPr>
+    </w:p>
+    <w:p>
+      <w:pPr>
+        <w:rPr>
+          <w:b/>
+          <w:bCs/>
+          <w:sz w:val="24"/>
+          <w:szCs w:val="24"/>
+          <w:u w:val="single"/>
+          <w:lang w:val="en-CA"/>
+        </w:rPr>
+      </w:pPr>
+    </w:p>
+    <w:p>
+      <w:pPr>
+        <w:rPr>
+          <w:b/>
+          <w:bCs/>
+          <w:sz w:val="24"/>
+          <w:szCs w:val="24"/>
+          <w:u w:val="single"/>
+          <w:lang w:val="en-CA"/>
+        </w:rPr>
+      </w:pPr>
+      <w:r>
+        <w:rPr>
+          <w:b/>
+          <w:bCs/>
+          <w:sz w:val="24"/>
+          <w:szCs w:val="24"/>
+          <w:u w:val="single"/>
+          <w:lang w:val="en-CA"/>
+        </w:rPr>
+        <w:lastRenderedPageBreak/>
+        <w:t>View Fighters(Data Listing Page)</w:t>
+      </w:r>
+    </w:p>
+    <w:p>
+      <w:pPr>
+        <w:rPr>
+          <w:b/>
+          <w:bCs/>
+          <w:sz w:val="32"/>
+          <w:szCs w:val="32"/>
+          <w:u w:val="single"/>
+          <w:lang w:val="en-CA"/>
+        </w:rPr>
+      </w:pPr>
+      <w:r>
+        <w:rPr>
+          <w:b/>
+          <w:bCs/>
+          <w:sz w:val="32"/>
+          <w:szCs w:val="32"/>
+          <w:u w:val="single"/>
+          <w:lang w:val="en-CA"/>
+        </w:rPr>
+        <w:drawing>
+          <wp:inline distT="0" distB="0" distL="0" distR="0" wp14:anchorId="1F48C9F4" wp14:editId="65414186">
+            <wp:extent cx="5943600" cy="7040880"/>
+            <wp:effectExtent l="0" t="0" r="0" b="7620"/>
+            <wp:docPr id="1807757006" name="Picture 22"/>
+            <wp:cNvGraphicFramePr>
+              <a:graphicFrameLocks xmlns:a="http://schemas.openxmlformats.org/drawingml/2006/main" noChangeAspect="1"/>
+            </wp:cNvGraphicFramePr>
+            <a:graphic xmlns:a="http://schemas.openxmlformats.org/drawingml/2006/main">
+              <a:graphicData uri="http://schemas.openxmlformats.org/drawingml/2006/picture">
+                <pic:pic xmlns:pic="http://schemas.openxmlformats.org/drawingml/2006/picture">
+                  <pic:nvPicPr>
+                    <pic:cNvPr id="0" name="Picture 65"/>
+                    <pic:cNvPicPr>
+                      <a:picLocks noChangeAspect="1" noChangeArrowheads="1"/>
+                    </pic:cNvPicPr>
+                  </pic:nvPicPr>
+                  <pic:blipFill>
+                    <a:blip r:embed="rId13">
+                      <a:extLst>
+                        <a:ext uri="{28A0092B-C50C-407E-A947-70E740481C1C}">
+                          <a14:useLocalDpi xmlns:a14="http://schemas.microsoft.com/office/drawing/2010/main" val="0"/>
+                        </a:ext>
+                      </a:extLst>
+                    </a:blip>
+                    <a:srcRect/>
+                    <a:stretch>
+                      <a:fillRect/>
+                    </a:stretch>
+                  </pic:blipFill>
+                  <pic:spPr bwMode="auto">
+                    <a:xfrm>
+                      <a:off x="0" y="0"/>
+                      <a:ext cx="5943600" cy="7040880"/>
+                    </a:xfrm>
+                    <a:prstGeom prst="rect">
+                      <a:avLst/>
+                    </a:prstGeom>
+                    <a:noFill/>
+                    <a:ln>
+                      <a:noFill/>
+                    </a:ln>
+                  </pic:spPr>
+                </pic:pic>
+              </a:graphicData>
+            </a:graphic>
+          </wp:inline>
+        </w:drawing>
+      </w:r>
+    </w:p>
+    <w:p>
+      <w:pPr>
+        <w:rPr>
+          <w:b/>
+          <w:bCs/>
+          <w:sz w:val="32"/>
+          <w:szCs w:val="32"/>
+          <w:u w:val="single"/>
+          <w:lang w:val="en-CA"/>
+        </w:rPr>
+      </w:pPr>
+    </w:p>
+    <w:p>
+      <w:pPr>
+        <w:rPr>
+          <w:b/>
+          <w:bCs/>
+          <w:sz w:val="24"/>
+          <w:szCs w:val="24"/>
+          <w:u w:val="single"/>
+          <w:lang w:val="en-CA"/>
+        </w:rPr>
+      </w:pPr>
+    </w:p>
+    <w:p>
+      <w:pPr>
+        <w:rPr>
+          <w:b/>
+          <w:bCs/>
+          <w:sz w:val="24"/>
+          <w:szCs w:val="24"/>
+          <w:u w:val="single"/>
+          <w:lang w:val="en-CA"/>
+        </w:rPr>
+      </w:pPr>
+    </w:p>
+    <w:p>
+      <w:pPr>
+        <w:rPr>
+          <w:b/>
+          <w:bCs/>
+          <w:sz w:val="24"/>
+          <w:szCs w:val="24"/>
+          <w:u w:val="single"/>
+          <w:lang w:val="en-CA"/>
+        </w:rPr>
+      </w:pPr>
+    </w:p>
+    <w:p>
+      <w:pPr>
+        <w:rPr>
+          <w:b/>
+          <w:bCs/>
+          <w:sz w:val="24"/>
+          <w:szCs w:val="24"/>
+          <w:u w:val="single"/>
+          <w:lang w:val="en-CA"/>
+        </w:rPr>
+      </w:pPr>
+      <w:r>
+        <w:rPr>
+          <w:b/>
+          <w:bCs/>
+          <w:sz w:val="24"/>
+          <w:szCs w:val="24"/>
+          <w:u w:val="single"/>
+          <w:lang w:val="en-CA"/>
+        </w:rPr>
+        <w:lastRenderedPageBreak/>
+        <w:t>Add Fighters(Data Entry Page)</w:t>
+      </w:r>
+    </w:p>
+    <w:p>
+      <w:pPr>
+        <w:rPr>
+          <w:b/>
+          <w:bCs/>
+          <w:sz w:val="32"/>
+          <w:szCs w:val="32"/>
+          <w:u w:val="single"/>
+          <w:lang w:val="en-CA"/>
+        </w:rPr>
+      </w:pPr>
+      <w:r>
+        <w:rPr>
+          <w:b/>
+          <w:bCs/>
+          <w:sz w:val="32"/>
+          <w:szCs w:val="32"/>
+          <w:u w:val="single"/>
+          <w:lang w:val="en-CA"/>
+        </w:rPr>
+        <w:drawing>
+          <wp:inline distT="0" distB="0" distL="0" distR="0" wp14:anchorId="46785EEC" wp14:editId="24DB3A92">
+            <wp:extent cx="5943600" cy="7085330"/>
+            <wp:effectExtent l="0" t="0" r="0" b="1270"/>
+            <wp:docPr id="1061161064" name="Picture 21"/>
+            <wp:cNvGraphicFramePr>
+              <a:graphicFrameLocks xmlns:a="http://schemas.openxmlformats.org/drawingml/2006/main" noChangeAspect="1"/>
+            </wp:cNvGraphicFramePr>
+            <a:graphic xmlns:a="http://schemas.openxmlformats.org/drawingml/2006/main">
+              <a:graphicData uri="http://schemas.openxmlformats.org/drawingml/2006/picture">
+                <pic:pic xmlns:pic="http://schemas.openxmlformats.org/drawingml/2006/picture">
+                  <pic:nvPicPr>
+                    <pic:cNvPr id="0" name="Picture 66"/>
+                    <pic:cNvPicPr>
+                      <a:picLocks noChangeAspect="1" noChangeArrowheads="1"/>
+                    </pic:cNvPicPr>
+                  </pic:nvPicPr>
+                  <pic:blipFill>
+                    <a:blip r:embed="rId14">
+                      <a:extLst>
+                        <a:ext uri="{28A0092B-C50C-407E-A947-70E740481C1C}">
+                          <a14:useLocalDpi xmlns:a14="http://schemas.microsoft.com/office/drawing/2010/main" val="0"/>
+                        </a:ext>
+                      </a:extLst>
+                    </a:blip>
+                    <a:srcRect/>
+                    <a:stretch>
+                      <a:fillRect/>
+                    </a:stretch>
+                  </pic:blipFill>
+                  <pic:spPr bwMode="auto">
+                    <a:xfrm>
+                      <a:off x="0" y="0"/>
+                      <a:ext cx="5943600" cy="7085330"/>
+                    </a:xfrm>
+                    <a:prstGeom prst="rect">
+                      <a:avLst/>
+                    </a:prstGeom>
+                    <a:noFill/>
+                    <a:ln>
+                      <a:noFill/>
+                    </a:ln>
+                  </pic:spPr>
+                </pic:pic>
+              </a:graphicData>
+            </a:graphic>
+          </wp:inline>
+        </w:drawing>
+      </w:r>
+    </w:p>
+    <w:p>
+      <w:pPr>
+        <w:rPr>
+          <w:b/>
+          <w:bCs/>
+          <w:sz w:val="32"/>
+          <w:szCs w:val="32"/>
+          <w:u w:val="single"/>
+          <w:lang w:val="en-CA"/>
+        </w:rPr>
+      </w:pPr>
+    </w:p>
+    <w:p>
+      <w:pPr>
+        <w:rPr>
+          <w:b/>
+          <w:bCs/>
+          <w:sz w:val="24"/>
+          <w:szCs w:val="24"/>
+          <w:u w:val="single"/>
+          <w:lang w:val="en-CA"/>
+        </w:rPr>
+      </w:pPr>
+    </w:p>
+    <w:p>
+      <w:pPr>
+        <w:rPr>
+          <w:b/>
+          <w:bCs/>
+          <w:sz w:val="24"/>
+          <w:szCs w:val="24"/>
+          <w:u w:val="single"/>
+          <w:lang w:val="en-CA"/>
+        </w:rPr>
+      </w:pPr>
+    </w:p>
+    <w:p>
+      <w:pPr>
+        <w:rPr>
+          <w:b/>
+          <w:bCs/>
+          <w:sz w:val="24"/>
+          <w:szCs w:val="24"/>
+          <w:u w:val="single"/>
+          <w:lang w:val="en-CA"/>
+        </w:rPr>
+      </w:pPr>
+    </w:p>
+    <w:p>
+      <w:pPr>
+        <w:rPr>
+          <w:b/>
+          <w:bCs/>
+          <w:sz w:val="24"/>
+          <w:szCs w:val="24"/>
+          <w:u w:val="single"/>
+          <w:lang w:val="en-CA"/>
+        </w:rPr>
+      </w:pPr>
+      <w:r>
+        <w:rPr>
+          <w:b/>
+          <w:bCs/>
+          <w:sz w:val="24"/>
+          <w:szCs w:val="24"/>
+          <w:u w:val="single"/>
+          <w:lang w:val="en-CA"/>
+        </w:rPr>
+        <w:lastRenderedPageBreak/>
+        <w:t>Edit Fighters(Edit/Update Page)</w:t>
+      </w:r>
+    </w:p>
+    <w:p>
+      <w:pPr>
+        <w:rPr>
+          <w:b/>
+          <w:bCs/>
+          <w:sz w:val="32"/>
+          <w:szCs w:val="32"/>
+          <w:u w:val="single"/>
+          <w:lang w:val="en-CA"/>
+        </w:rPr>
+      </w:pPr>
+      <w:r>
+        <w:rPr>
+          <w:b/>
+          <w:bCs/>
+          <w:sz w:val="32"/>
+          <w:szCs w:val="32"/>
+          <w:u w:val="single"/>
+          <w:lang w:val="en-CA"/>
+        </w:rPr>
+        <w:drawing>
+          <wp:inline distT="0" distB="0" distL="0" distR="0" wp14:anchorId="12DE4FF1" wp14:editId="32B789D2">
+            <wp:extent cx="5943600" cy="7085330"/>
+            <wp:effectExtent l="0" t="0" r="0" b="1270"/>
+            <wp:docPr id="676109931" name="Picture 20"/>
+            <wp:cNvGraphicFramePr>
+              <a:graphicFrameLocks xmlns:a="http://schemas.openxmlformats.org/drawingml/2006/main" noChangeAspect="1"/>
+            </wp:cNvGraphicFramePr>
+            <a:graphic xmlns:a="http://schemas.openxmlformats.org/drawingml/2006/main">
+              <a:graphicData uri="http://schemas.openxmlformats.org/drawingml/2006/picture">
+                <pic:pic xmlns:pic="http://schemas.openxmlformats.org/drawingml/2006/picture">
+                  <pic:nvPicPr>
+                    <pic:cNvPr id="0" name="Picture 67"/>
+                    <pic:cNvPicPr>
+                      <a:picLocks noChangeAspect="1" noChangeArrowheads="1"/>
+                    </pic:cNvPicPr>
+                  </pic:nvPicPr>
+                  <pic:blipFill>
+                    <a:blip r:embed="rId15">
+                      <a:extLst>
+                        <a:ext uri="{28A0092B-C50C-407E-A947-70E740481C1C}">
+                          <a14:useLocalDpi xmlns:a14="http://schemas.microsoft.com/office/drawing/2010/main" val="0"/>
+                        </a:ext>
+                      </a:extLst>
+                    </a:blip>
+                    <a:srcRect/>
+                    <a:stretch>
+                      <a:fillRect/>
+                    </a:stretch>
+                  </pic:blipFill>
+                  <pic:spPr bwMode="auto">
+                    <a:xfrm>
+                      <a:off x="0" y="0"/>
+                      <a:ext cx="5943600" cy="7085330"/>
+                    </a:xfrm>
+                    <a:prstGeom prst="rect">
+                      <a:avLst/>
+                    </a:prstGeom>
+                    <a:noFill/>
+                    <a:ln>
+                      <a:noFill/>
+                    </a:ln>
+                  </pic:spPr>
+                </pic:pic>
+              </a:graphicData>
+            </a:graphic>
+          </wp:inline>
+        </w:drawing>
+      </w:r>
+    </w:p>
+    <w:p>
+      <w:pPr>
+        <w:rPr>
+          <w:b/>
+          <w:bCs/>
+          <w:sz w:val="32"/>
+          <w:szCs w:val="32"/>
+          <w:u w:val="single"/>
+          <w:lang w:val="en-CA"/>
+        </w:rPr>
+      </w:pPr>
+    </w:p>
+    <w:p>
+      <w:pPr>
+        <w:rPr>
+          <w:b/>
+          <w:bCs/>
+          <w:sz w:val="24"/>
+          <w:szCs w:val="24"/>
+          <w:u w:val="single"/>
+          <w:lang w:val="en-CA"/>
+        </w:rPr>
+      </w:pPr>
+    </w:p>
+    <w:p>
+      <w:pPr>
+        <w:rPr>
+          <w:b/>
+          <w:bCs/>
+          <w:sz w:val="24"/>
+          <w:szCs w:val="24"/>
+          <w:u w:val="single"/>
+          <w:lang w:val="en-CA"/>
+        </w:rPr>
+      </w:pPr>
+    </w:p>
+    <w:p>
+      <w:pPr>
+        <w:rPr>
+          <w:b/>
+          <w:bCs/>
+          <w:sz w:val="24"/>
+          <w:szCs w:val="24"/>
+          <w:u w:val="single"/>
+          <w:lang w:val="en-CA"/>
+        </w:rPr>
+      </w:pPr>
+    </w:p>
+    <w:p>
+      <w:pPr>
+        <w:rPr>
+          <w:b/>
+          <w:bCs/>
+          <w:sz w:val="24"/>
+          <w:szCs w:val="24"/>
+          <w:u w:val="single"/>
+          <w:lang w:val="en-CA"/>
+        </w:rPr>
+      </w:pPr>
+      <w:r>
+        <w:rPr>
+          <w:b/>
+          <w:bCs/>
+          <w:sz w:val="24"/>
+          <w:szCs w:val="24"/>
+          <w:u w:val="single"/>
+          <w:lang w:val="en-CA"/>
+        </w:rPr>
+        <w:lastRenderedPageBreak/>
+        <w:t>Arena</w:t>
+      </w:r>
+    </w:p>
+    <w:p>
+      <w:pPr>
+        <w:rPr>
+          <w:b/>
+          <w:bCs/>
+          <w:sz w:val="32"/>
+          <w:szCs w:val="32"/>
+          <w:u w:val="single"/>
+          <w:lang w:val="en-CA"/>
+        </w:rPr>
+      </w:pPr>
+      <w:r>
+        <w:rPr>
+          <w:b/>
+          <w:bCs/>
+          <w:sz w:val="32"/>
+          <w:szCs w:val="32"/>
+          <w:u w:val="single"/>
+          <w:lang w:val="en-CA"/>
+        </w:rPr>
+        <w:drawing>
+          <wp:inline distT="0" distB="0" distL="0" distR="0" wp14:anchorId="75AD799C" wp14:editId="7334651A">
+            <wp:extent cx="5935980" cy="7040880"/>
+            <wp:effectExtent l="0" t="0" r="7620" b="7620"/>
+            <wp:docPr id="1726842745" name="Picture 19"/>
+            <wp:cNvGraphicFramePr>
+              <a:graphicFrameLocks xmlns:a="http://schemas.openxmlformats.org/drawingml/2006/main" noChangeAspect="1"/>
+            </wp:cNvGraphicFramePr>
+            <a:graphic xmlns:a="http://schemas.openxmlformats.org/drawingml/2006/main">
+              <a:graphicData uri="http://schemas.openxmlformats.org/drawingml/2006/picture">
+                <pic:pic xmlns:pic="http://schemas.openxmlformats.org/drawingml/2006/picture">
+                  <pic:nvPicPr>
+                    <pic:cNvPr id="0" name="Picture 68"/>
+                    <pic:cNvPicPr>
+                      <a:picLocks noChangeAspect="1" noChangeArrowheads="1"/>
+                    </pic:cNvPicPr>
+                  </pic:nvPicPr>
+                  <pic:blipFill>
+                    <a:blip r:embed="rId16">
+                      <a:extLst>
+                        <a:ext uri="{28A0092B-C50C-407E-A947-70E740481C1C}">
+                          <a14:useLocalDpi xmlns:a14="http://schemas.microsoft.com/office/drawing/2010/main" val="0"/>
+                        </a:ext>
+                      </a:extLst>
+                    </a:blip>
+                    <a:srcRect/>
+                    <a:stretch>
+                      <a:fillRect/>
+                    </a:stretch>
+                  </pic:blipFill>
+                  <pic:spPr bwMode="auto">
+                    <a:xfrm>
+                      <a:off x="0" y="0"/>
+                      <a:ext cx="5935980" cy="7040880"/>
+                    </a:xfrm>
+                    <a:prstGeom prst="rect">
+                      <a:avLst/>
+                    </a:prstGeom>
+                    <a:noFill/>
+                    <a:ln>
+                      <a:noFill/>
+                    </a:ln>
+                  </pic:spPr>
+                </pic:pic>
+              </a:graphicData>
+            </a:graphic>
+          </wp:inline>
+        </w:drawing>
+      </w:r>
+    </w:p>
+    <w:p>
+      <w:pPr>
+        <w:rPr>
+          <w:b/>
+          <w:bCs/>
+          <w:sz w:val="32"/>
+          <w:szCs w:val="32"/>
+          <w:u w:val="single"/>
+          <w:lang w:val="en-CA"/>
+        </w:rPr>
+      </w:pPr>
+    </w:p>
+    <w:p>
+      <w:pPr>
+        <w:rPr>
+          <w:b/>
+          <w:bCs/>
+          <w:sz w:val="24"/>
+          <w:szCs w:val="24"/>
+          <w:u w:val="single"/>
+          <w:lang w:val="en-CA"/>
+        </w:rPr>
+      </w:pPr>
+    </w:p>
+    <w:p>
+      <w:pPr>
+        <w:rPr>
+          <w:b/>
+          <w:bCs/>
+          <w:sz w:val="24"/>
+          <w:szCs w:val="24"/>
+          <w:u w:val="single"/>
+          <w:lang w:val="en-CA"/>
+        </w:rPr>
+      </w:pPr>
+    </w:p>
+    <w:p>
+      <w:pPr>
+        <w:rPr>
+          <w:b/>
+          <w:bCs/>
+          <w:sz w:val="24"/>
+          <w:szCs w:val="24"/>
+          <w:u w:val="single"/>
+          <w:lang w:val="en-CA"/>
+        </w:rPr>
+      </w:pPr>
+    </w:p>
+    <w:p>
+      <w:pPr>
+        <w:rPr>
+          <w:b/>
+          <w:bCs/>
+          <w:sz w:val="24"/>
+          <w:szCs w:val="24"/>
+          <w:u w:val="single"/>
+          <w:lang w:val="en-CA"/>
+        </w:rPr>
+      </w:pPr>
+      <w:r>
+        <w:rPr>
+          <w:b/>
+          <w:bCs/>
+          <w:sz w:val="24"/>
+          <w:szCs w:val="24"/>
+          <w:u w:val="single"/>
+          <w:lang w:val="en-CA"/>
+        </w:rPr>
+        <w:lastRenderedPageBreak/>
+        <w:t>Armory</w:t>
+      </w:r>
+    </w:p>
+    <w:p>
+      <w:pPr>
+        <w:rPr>
+          <w:b/>
+          <w:bCs/>
+          <w:sz w:val="32"/>
+          <w:szCs w:val="32"/>
+          <w:u w:val="single"/>
+          <w:lang w:val="en-CA"/>
+        </w:rPr>
+      </w:pPr>
+      <w:r>
+        <w:rPr>
+          <w:b/>
+          <w:bCs/>
+          <w:sz w:val="32"/>
+          <w:szCs w:val="32"/>
+          <w:u w:val="single"/>
+          <w:lang w:val="en-CA"/>
+        </w:rPr>
+        <w:drawing>
+          <wp:inline distT="0" distB="0" distL="0" distR="0" wp14:anchorId="1B1F4432" wp14:editId="193BFB36">
+            <wp:extent cx="5943600" cy="7155180"/>
+            <wp:effectExtent l="0" t="0" r="0" b="7620"/>
+            <wp:docPr id="143781851" name="Picture 18"/>
+            <wp:cNvGraphicFramePr>
+              <a:graphicFrameLocks xmlns:a="http://schemas.openxmlformats.org/drawingml/2006/main" noChangeAspect="1"/>
+            </wp:cNvGraphicFramePr>
+            <a:graphic xmlns:a="http://schemas.openxmlformats.org/drawingml/2006/main">
+              <a:graphicData uri="http://schemas.openxmlformats.org/drawingml/2006/picture">
+                <pic:pic xmlns:pic="http://schemas.openxmlformats.org/drawingml/2006/picture">
+                  <pic:nvPicPr>
+                    <pic:cNvPr id="0" name="Picture 69"/>
+                    <pic:cNvPicPr>
+                      <a:picLocks noChangeAspect="1" noChangeArrowheads="1"/>
+                    </pic:cNvPicPr>
+                  </pic:nvPicPr>
+                  <pic:blipFill>
+                    <a:blip r:embed="rId17">
+                      <a:extLst>
+                        <a:ext uri="{28A0092B-C50C-407E-A947-70E740481C1C}">
+                          <a14:useLocalDpi xmlns:a14="http://schemas.microsoft.com/office/drawing/2010/main" val="0"/>
+                        </a:ext>
+                      </a:extLst>
+                    </a:blip>
+                    <a:srcRect/>
+                    <a:stretch>
+                      <a:fillRect/>
+                    </a:stretch>
+                  </pic:blipFill>
+                  <pic:spPr bwMode="auto">
+                    <a:xfrm>
+                      <a:off x="0" y="0"/>
+                      <a:ext cx="5943600" cy="7155180"/>
+                    </a:xfrm>
+                    <a:prstGeom prst="rect">
+                      <a:avLst/>
+                    </a:prstGeom>
+                    <a:noFill/>
+                    <a:ln>
+                      <a:noFill/>
+                    </a:ln>
+                  </pic:spPr>
+                </pic:pic>
+              </a:graphicData>
+            </a:graphic>
+          </wp:inline>
+        </w:drawing>
+      </w:r>
+    </w:p>
+    <w:p>
+      <w:pPr>
+        <w:rPr>
+          <w:b/>
+          <w:bCs/>
+          <w:sz w:val="32"/>
+          <w:szCs w:val="32"/>
+          <w:u w:val="single"/>
+          <w:lang w:val="en-CA"/>
+        </w:rPr>
+      </w:pPr>
+    </w:p>
+    <w:p>
+      <w:pPr>
+        <w:rPr>
+          <w:b/>
+          <w:bCs/>
+          <w:sz w:val="24"/>
+          <w:szCs w:val="24"/>
+          <w:u w:val="single"/>
+          <w:lang w:val="en-CA"/>
+        </w:rPr>
+      </w:pPr>
+    </w:p>
+    <w:p>
+      <w:pPr>
+        <w:rPr>
+          <w:b/>
+          <w:bCs/>
+          <w:sz w:val="24"/>
+          <w:szCs w:val="24"/>
+          <w:u w:val="single"/>
+          <w:lang w:val="en-CA"/>
+        </w:rPr>
+      </w:pPr>
+    </w:p>
+    <w:p>
+      <w:pPr>
+        <w:rPr>
+          <w:b/>
+          <w:bCs/>
+          <w:sz w:val="24"/>
+          <w:szCs w:val="24"/>
+          <w:u w:val="single"/>
+          <w:lang w:val="en-CA"/>
+        </w:rPr>
+      </w:pPr>
+    </w:p>
+    <w:p>
+      <w:pPr>
+        <w:rPr>
+          <w:b/>
+          <w:bCs/>
+          <w:sz w:val="24"/>
+          <w:szCs w:val="24"/>
+          <w:u w:val="single"/>
+          <w:lang w:val="en-CA"/>
+        </w:rPr>
+      </w:pPr>
+      <w:r>
+        <w:rPr>
+          <w:b/>
+          <w:bCs/>
+          <w:sz w:val="24"/>
+          <w:szCs w:val="24"/>
+          <w:u w:val="single"/>
+          <w:lang w:val="en-CA"/>
+        </w:rPr>
+        <w:lastRenderedPageBreak/>
+        <w:t>Login</w:t>
+      </w:r>
+    </w:p>
+    <w:p>
+      <w:pPr>
+        <w:rPr>
+          <w:b/>
+          <w:bCs/>
+          <w:sz w:val="32"/>
+          <w:szCs w:val="32"/>
+          <w:u w:val="single"/>
+          <w:lang w:val="en-CA"/>
+        </w:rPr>
+      </w:pPr>
+      <w:r>
+        <w:rPr>
+          <w:b/>
+          <w:bCs/>
+          <w:sz w:val="32"/>
+          <w:szCs w:val="32"/>
+          <w:u w:val="single"/>
+          <w:lang w:val="en-CA"/>
+        </w:rPr>
+        <w:drawing>
+          <wp:inline distT="0" distB="0" distL="0" distR="0" wp14:anchorId="1987E2A5" wp14:editId="3E522171">
+            <wp:extent cx="5943600" cy="6598920"/>
+            <wp:effectExtent l="0" t="0" r="0" b="0"/>
+            <wp:docPr id="757948001" name="Picture 17"/>
+            <wp:cNvGraphicFramePr>
+              <a:graphicFrameLocks xmlns:a="http://schemas.openxmlformats.org/drawingml/2006/main" noChangeAspect="1"/>
+            </wp:cNvGraphicFramePr>
+            <a:graphic xmlns:a="http://schemas.openxmlformats.org/drawingml/2006/main">
+              <a:graphicData uri="http://schemas.openxmlformats.org/drawingml/2006/picture">
+                <pic:pic xmlns:pic="http://schemas.openxmlformats.org/drawingml/2006/picture">
+                  <pic:nvPicPr>
+                    <pic:cNvPr id="0" name="Picture 70"/>
+                    <pic:cNvPicPr>
+                      <a:picLocks noChangeAspect="1" noChangeArrowheads="1"/>
+                    </pic:cNvPicPr>
+                  </pic:nvPicPr>
+                  <pic:blipFill>
+                    <a:blip r:embed="rId18">
+                      <a:extLst>
+                        <a:ext uri="{28A0092B-C50C-407E-A947-70E740481C1C}">
+                          <a14:useLocalDpi xmlns:a14="http://schemas.microsoft.com/office/drawing/2010/main" val="0"/>
+                        </a:ext>
+                      </a:extLst>
+                    </a:blip>
+                    <a:srcRect/>
+                    <a:stretch>
+                      <a:fillRect/>
+                    </a:stretch>
+                  </pic:blipFill>
+                  <pic:spPr bwMode="auto">
+                    <a:xfrm>
+                      <a:off x="0" y="0"/>
+                      <a:ext cx="5943600" cy="6598920"/>
+                    </a:xfrm>
+                    <a:prstGeom prst="rect">
+                      <a:avLst/>
+                    </a:prstGeom>
+                    <a:noFill/>
+                    <a:ln>
+                      <a:noFill/>
+                    </a:ln>
+                  </pic:spPr>
+                </pic:pic>
+              </a:graphicData>
+            </a:graphic>
+          </wp:inline>
+        </w:drawing>
+      </w:r>
+    </w:p>
+    <w:p>
+      <w:pPr>
+        <w:rPr>
+          <w:b/>
+          <w:bCs/>
+          <w:sz w:val="24"/>
+          <w:szCs w:val="24"/>
+          <w:u w:val="single"/>
+          <w:lang w:val="en-CA"/>
+        </w:rPr>
+      </w:pPr>
+    </w:p>
+    <w:p>
+      <w:pPr>
+        <w:rPr>
+          <w:b/>
+          <w:bCs/>
+          <w:sz w:val="24"/>
+          <w:szCs w:val="24"/>
+          <w:u w:val="single"/>
+          <w:lang w:val="en-CA"/>
+        </w:rPr>
+      </w:pPr>
+    </w:p>
+    <w:p>
+      <w:pPr>
+        <w:rPr>
+          <w:b/>
+          <w:bCs/>
+          <w:sz w:val="24"/>
+          <w:szCs w:val="24"/>
+          <w:u w:val="single"/>
+          <w:lang w:val="en-CA"/>
+        </w:rPr>
+      </w:pPr>
+    </w:p>
+    <w:p>
+      <w:pPr>
+        <w:rPr>
+          <w:b/>
+          <w:bCs/>
+          <w:sz w:val="24"/>
+          <w:szCs w:val="24"/>
+          <w:u w:val="single"/>
+          <w:lang w:val="en-CA"/>
+        </w:rPr>
+      </w:pPr>
+    </w:p>
+    <w:p>
+      <w:pPr>
+        <w:rPr>
+          <w:b/>
+          <w:bCs/>
+          <w:sz w:val="24"/>
+          <w:szCs w:val="24"/>
+          <w:u w:val="single"/>
+          <w:lang w:val="en-CA"/>
+        </w:rPr>
+      </w:pPr>
+    </w:p>
+    <w:p>
+      <w:pPr>
+        <w:rPr>
+          <w:b/>
+          <w:bCs/>
+          <w:sz w:val="24"/>
+          <w:szCs w:val="24"/>
+          <w:u w:val="single"/>
+          <w:lang w:val="en-CA"/>
+        </w:rPr>
+      </w:pPr>
+    </w:p>
+    <w:p>
+      <w:pPr>
+        <w:rPr>
+          <w:b/>
+          <w:bCs/>
+          <w:sz w:val="24"/>
+          <w:szCs w:val="24"/>
+          <w:u w:val="single"/>
+          <w:lang w:val="en-CA"/>
+        </w:rPr>
+      </w:pPr>
+    </w:p>
+    <w:p>
+      <w:pPr>
+        <w:rPr>
+          <w:b/>
+          <w:bCs/>
+          <w:sz w:val="24"/>
+          <w:szCs w:val="24"/>
+          <w:u w:val="single"/>
+          <w:lang w:val="en-CA"/>
+        </w:rPr>
+      </w:pPr>
+      <w:r>
+        <w:rPr>
+          <w:b/>
+          <w:bCs/>
+          <w:sz w:val="24"/>
+          <w:szCs w:val="24"/>
+          <w:u w:val="single"/>
+          <w:lang w:val="en-CA"/>
+        </w:rPr>
+        <w:lastRenderedPageBreak/>
+        <w:t>Register</w:t>
+      </w:r>
+    </w:p>
+    <w:p>
+      <w:pPr>
+        <w:rPr>
+          <w:b/>
+          <w:bCs/>
+          <w:sz w:val="32"/>
+          <w:szCs w:val="32"/>
+          <w:u w:val="single"/>
+          <w:lang w:val="en-CA"/>
+        </w:rPr>
+      </w:pPr>
+      <w:r>
+        <w:rPr>
+          <w:b/>
+          <w:bCs/>
+          <w:sz w:val="32"/>
+          <w:szCs w:val="32"/>
+          <w:u w:val="single"/>
+          <w:lang w:val="en-CA"/>
+        </w:rPr>
+        <w:drawing>
+          <wp:inline distT="0" distB="0" distL="0" distR="0" wp14:anchorId="0D0E9B6D" wp14:editId="409131E3">
+            <wp:extent cx="5943600" cy="6598920"/>
+            <wp:effectExtent l="0" t="0" r="0" b="0"/>
+            <wp:docPr id="725296868" name="Picture 16"/>
+            <wp:cNvGraphicFramePr>
+              <a:graphicFrameLocks xmlns:a="http://schemas.openxmlformats.org/drawingml/2006/main" noChangeAspect="1"/>
+            </wp:cNvGraphicFramePr>
+            <a:graphic xmlns:a="http://schemas.openxmlformats.org/drawingml/2006/main">
+              <a:graphicData uri="http://schemas.openxmlformats.org/drawingml/2006/picture">
+                <pic:pic xmlns:pic="http://schemas.openxmlformats.org/drawingml/2006/picture">
+                  <pic:nvPicPr>
+                    <pic:cNvPr id="0" name="Picture 71"/>
+                    <pic:cNvPicPr>
+                      <a:picLocks noChangeAspect="1" noChangeArrowheads="1"/>
+                    </pic:cNvPicPr>
+                  </pic:nvPicPr>
+                  <pic:blipFill>
+                    <a:blip r:embed="rId19">
+                      <a:extLst>
+                        <a:ext uri="{28A0092B-C50C-407E-A947-70E740481C1C}">
+                          <a14:useLocalDpi xmlns:a14="http://schemas.microsoft.com/office/drawing/2010/main" val="0"/>
+                        </a:ext>
+                      </a:extLst>
+                    </a:blip>
+                    <a:srcRect/>
+                    <a:stretch>
+                      <a:fillRect/>
+                    </a:stretch>
+                  </pic:blipFill>
+                  <pic:spPr bwMode="auto">
+                    <a:xfrm>
+                      <a:off x="0" y="0"/>
+                      <a:ext cx="5943600" cy="6598920"/>
+                    </a:xfrm>
+                    <a:prstGeom prst="rect">
+                      <a:avLst/>
+                    </a:prstGeom>
+                    <a:noFill/>
+                    <a:ln>
+                      <a:noFill/>
+                    </a:ln>
+                  </pic:spPr>
+                </pic:pic>
+              </a:graphicData>
+            </a:graphic>
+          </wp:inline>
+        </w:drawing>
+      </w:r>
+    </w:p>
+    <w:p>
+      <w:pPr>
+        <w:rPr>
+          <w:b/>
+          <w:bCs/>
+          <w:sz w:val="32"/>
+          <w:szCs w:val="32"/>
+          <w:u w:val="single"/>
+          <w:lang w:val="en-CA"/>
+        </w:rPr>
+      </w:pPr>
+    </w:p>
+    <w:p>
+      <w:pPr>
+        <w:rPr>
+          <w:b/>
+          <w:bCs/>
+          <w:sz w:val="32"/>
+          <w:szCs w:val="32"/>
+          <w:u w:val="single"/>
+          <w:lang w:val="en-CA"/>
+        </w:rPr>
+      </w:pPr>
+    </w:p>
+    <w:p>
+      <w:pPr>
+        <w:rPr>
+          <w:b/>
+          <w:bCs/>
+          <w:sz w:val="32"/>
+          <w:szCs w:val="32"/>
+          <w:u w:val="single"/>
+          <w:lang w:val="en-CA"/>
+        </w:rPr>
+      </w:pPr>
+    </w:p>
+    <w:p>
+      <w:pPr>
+        <w:rPr>
+          <w:b/>
+          <w:bCs/>
+          <w:sz w:val="32"/>
+          <w:szCs w:val="32"/>
+          <w:u w:val="single"/>
+          <w:lang w:val="en-CA"/>
+        </w:rPr>
+      </w:pPr>
+    </w:p>
+    <w:p>
+      <w:pPr>
+        <w:rPr>
+          <w:b/>
+          <w:bCs/>
+          <w:sz w:val="32"/>
+          <w:szCs w:val="32"/>
+          <w:u w:val="single"/>
+          <w:lang w:val="en-CA"/>
+        </w:rPr>
+      </w:pPr>
+    </w:p>
+    <w:p>
+      <w:pPr>
+        <w:rPr>
+          <w:b/>
+          <w:bCs/>
+          <w:sz w:val="24"/>
+          <w:szCs w:val="24"/>
+          <w:u w:val="single"/>
+          <w:lang w:val="en-CA"/>
+        </w:rPr>
+      </w:pPr>
+      <w:r>
+        <w:rPr>
+          <w:b/>
+          <w:bCs/>
+          <w:sz w:val="24"/>
+          <w:szCs w:val="24"/>
+          <w:u w:val="single"/>
+          <w:lang w:val="en-CA"/>
+        </w:rPr>
+        <w:lastRenderedPageBreak/>
+        <w:t>User Settings</w:t>
+      </w:r>
+    </w:p>
+    <w:p>
+      <w:pPr>
+        <w:rPr>
+          <w:b/>
+          <w:bCs/>
+          <w:sz w:val="32"/>
+          <w:szCs w:val="32"/>
+          <w:u w:val="single"/>
+          <w:lang w:val="en-CA"/>
+        </w:rPr>
+      </w:pPr>
+      <w:r>
+        <w:rPr>
+          <w:b/>
+          <w:bCs/>
+          <w:sz w:val="32"/>
+          <w:szCs w:val="32"/>
+          <w:u w:val="single"/>
+          <w:lang w:val="en-CA"/>
+        </w:rPr>
+        <w:drawing>
+          <wp:inline distT="0" distB="0" distL="0" distR="0" wp14:anchorId="046D6304" wp14:editId="03241444">
+            <wp:extent cx="5943600" cy="7155180"/>
+            <wp:effectExtent l="0" t="0" r="0" b="7620"/>
+            <wp:docPr id="528285658" name="Picture 15"/>
+            <wp:cNvGraphicFramePr>
+              <a:graphicFrameLocks xmlns:a="http://schemas.openxmlformats.org/drawingml/2006/main" noChangeAspect="1"/>
+            </wp:cNvGraphicFramePr>
+            <a:graphic xmlns:a="http://schemas.openxmlformats.org/drawingml/2006/main">
+              <a:graphicData uri="http://schemas.openxmlformats.org/drawingml/2006/picture">
+                <pic:pic xmlns:pic="http://schemas.openxmlformats.org/drawingml/2006/picture">
+                  <pic:nvPicPr>
+                    <pic:cNvPr id="0" name="Picture 72"/>
+                    <pic:cNvPicPr>
+                      <a:picLocks noChangeAspect="1" noChangeArrowheads="1"/>
+                    </pic:cNvPicPr>
+                  </pic:nvPicPr>
+                  <pic:blipFill>
+                    <a:blip r:embed="rId20">
+                      <a:extLst>
+                        <a:ext uri="{28A0092B-C50C-407E-A947-70E740481C1C}">
+                          <a14:useLocalDpi xmlns:a14="http://schemas.microsoft.com/office/drawing/2010/main" val="0"/>
+                        </a:ext>
+                      </a:extLst>
+                    </a:blip>
+                    <a:srcRect/>
+                    <a:stretch>
+                      <a:fillRect/>
+                    </a:stretch>
+                  </pic:blipFill>
+                  <pic:spPr bwMode="auto">
+                    <a:xfrm>
+                      <a:off x="0" y="0"/>
+                      <a:ext cx="5943600" cy="7155180"/>
+                    </a:xfrm>
+                    <a:prstGeom prst="rect">
+                      <a:avLst/>
+                    </a:prstGeom>
+                    <a:noFill/>
+                    <a:ln>
+                      <a:noFill/>
+                    </a:ln>
+                  </pic:spPr>
+                </pic:pic>
+              </a:graphicData>
+            </a:graphic>
+          </wp:inline>
+        </w:drawing>
+      </w:r>
+    </w:p>
+    <w:p>
+      <w:pPr>
+        <w:rPr>
+          <w:b/>
+          <w:bCs/>
+          <w:sz w:val="24"/>
+          <w:szCs w:val="24"/>
+          <w:u w:val="single"/>
+          <w:lang w:val="en-CA"/>
+        </w:rPr>
+      </w:pPr>
+    </w:p>
+    <w:p>
+      <w:pPr>
+        <w:rPr>
+          <w:b/>
+          <w:bCs/>
+          <w:sz w:val="24"/>
+          <w:szCs w:val="24"/>
+          <w:u w:val="single"/>
+          <w:lang w:val="en-CA"/>
+        </w:rPr>
+      </w:pPr>
+    </w:p>
+    <w:p>
+      <w:pPr>
+        <w:rPr>
+          <w:b/>
+          <w:bCs/>
+          <w:sz w:val="24"/>
+          <w:szCs w:val="24"/>
+          <w:u w:val="single"/>
+          <w:lang w:val="en-CA"/>
+        </w:rPr>
+      </w:pPr>
+    </w:p>
+    <w:p>
+      <w:pPr>
+        <w:rPr>
+          <w:b/>
+          <w:bCs/>
+          <w:sz w:val="24"/>
+          <w:szCs w:val="24"/>
+          <w:u w:val="single"/>
+          <w:lang w:val="en-CA"/>
+        </w:rPr>
+      </w:pPr>
+    </w:p>
+    <w:p>
+      <w:pPr>
+        <w:rPr>
+          <w:b/>
+          <w:bCs/>
+          <w:sz w:val="24"/>
+          <w:szCs w:val="24"/>
+          <w:u w:val="single"/>
+          <w:lang w:val="en-CA"/>
+        </w:rPr>
+      </w:pPr>
+      <w:r>
+        <w:rPr>
+          <w:b/>
+          <w:bCs/>
+          <w:sz w:val="24"/>
+          <w:szCs w:val="24"/>
+          <w:u w:val="single"/>
+          <w:lang w:val="en-CA"/>
+        </w:rPr>
+        <w:lastRenderedPageBreak/>
+        <w:t>About Us </w:t>
+      </w:r>
+    </w:p>
+    <w:p>
+      <w:pPr>
+        <w:rPr>
+          <w:b/>
+          <w:bCs/>
+          <w:sz w:val="32"/>
+          <w:szCs w:val="32"/>
+          <w:u w:val="single"/>
+          <w:lang w:val="en-CA"/>
+        </w:rPr>
+      </w:pPr>
+      <w:r>
+        <w:rPr>
+          <w:b/>
+          <w:bCs/>
+          <w:sz w:val="32"/>
+          <w:szCs w:val="32"/>
+          <w:u w:val="single"/>
+          <w:lang w:val="en-CA"/>
+        </w:rPr>
+        <w:drawing>
+          <wp:inline distT="0" distB="0" distL="0" distR="0" wp14:anchorId="737C4FB1" wp14:editId="21CD0F5F">
+            <wp:extent cx="5943600" cy="6918960"/>
+            <wp:effectExtent l="0" t="0" r="0" b="0"/>
+            <wp:docPr id="650720657" name="Picture 14"/>
+            <wp:cNvGraphicFramePr>
+              <a:graphicFrameLocks xmlns:a="http://schemas.openxmlformats.org/drawingml/2006/main" noChangeAspect="1"/>
+            </wp:cNvGraphicFramePr>
+            <a:graphic xmlns:a="http://schemas.openxmlformats.org/drawingml/2006/main">
+              <a:graphicData uri="http://schemas.openxmlformats.org/drawingml/2006/picture">
+                <pic:pic xmlns:pic="http://schemas.openxmlformats.org/drawingml/2006/picture">
+                  <pic:nvPicPr>
+                    <pic:cNvPr id="0" name="Picture 73"/>
+                    <pic:cNvPicPr>
+                      <a:picLocks noChangeAspect="1" noChangeArrowheads="1"/>
+                    </pic:cNvPicPr>
+                  </pic:nvPicPr>
+                  <pic:blipFill>
+                    <a:blip r:embed="rId21">
+                      <a:extLst>
+                        <a:ext uri="{28A0092B-C50C-407E-A947-70E740481C1C}">
+                          <a14:useLocalDpi xmlns:a14="http://schemas.microsoft.com/office/drawing/2010/main" val="0"/>
+                        </a:ext>
+                      </a:extLst>
+                    </a:blip>
+                    <a:srcRect/>
+                    <a:stretch>
+                      <a:fillRect/>
+                    </a:stretch>
+                  </pic:blipFill>
+                  <pic:spPr bwMode="auto">
+                    <a:xfrm>
+                      <a:off x="0" y="0"/>
+                      <a:ext cx="5943600" cy="6918960"/>
+                    </a:xfrm>
+                    <a:prstGeom prst="rect">
+                      <a:avLst/>
+                    </a:prstGeom>
+                    <a:noFill/>
+                    <a:ln>
+                      <a:noFill/>
+                    </a:ln>
+                  </pic:spPr>
+                </pic:pic>
+              </a:graphicData>
+            </a:graphic>
+          </wp:inline>
+        </w:drawing>
+      </w:r>
+    </w:p>
+    <w:p>
+      <w:pPr>
+        <w:rPr>
+          <w:b/>
+          <w:bCs/>
+          <w:sz w:val="32"/>
+          <w:szCs w:val="32"/>
+          <w:u w:val="single"/>
+        </w:rPr>
+      </w:pPr>
+    </w:p>
+    <w:p/>
+    <w:p/>
+    <w:p/>
+    <w:p/>
+    <w:p>
+      <w:pPr>
+        <w:rPr>
+          <w:lang w:val="en-CA"/>
+        </w:rPr>
+      </w:pPr>
+      <w:r>
+        <w:rPr>
+          <w:b/>
+          <w:bCs/>
+          <w:lang w:val="en-CA"/>
+        </w:rPr>
+        <w:lastRenderedPageBreak/>
+        <w:t>User Interface Planning</w:t>
+      </w:r>
+    </w:p>
+    <w:p>
+      <w:pPr>
+        <w:rPr>
+          <w:lang w:val="en-CA"/>
+        </w:rPr>
+      </w:pPr>
+      <w:r>
+        <w:rPr>
+          <w:b/>
+          <w:bCs/>
+          <w:lang w:val="en-CA"/>
+        </w:rPr>
+        <w:tab/>
+      </w:r>
+      <w:r>
+        <w:rPr>
+          <w:lang w:val="en-CA"/>
+        </w:rPr>
+        <w:t xml:space="preserve">Our planning of the user interface started with the color palette figuring that is the foundation of the interface. In selecting </w:t>
+      </w:r>
+      <w:r>
+        <w:rPr>
+          <w:lang w:val="en-CA"/>
+        </w:rPr>
+        <w:t>colors,</w:t>
+      </w:r>
+      <w:r>
+        <w:rPr>
+          <w:lang w:val="en-CA"/>
+        </w:rPr>
+        <w:t xml:space="preserve"> we went with colors that represented the roman empire in its prime. The classic red that almost all cinematic gladiators are associated with, purple the color of royalty and high class in </w:t>
+      </w:r>
+      <w:r>
+        <w:rPr>
+          <w:lang w:val="en-CA"/>
+        </w:rPr>
+        <w:t>Rome</w:t>
+      </w:r>
+      <w:r>
+        <w:rPr>
+          <w:lang w:val="en-CA"/>
+        </w:rPr>
+        <w:t xml:space="preserve"> during the time period, as the pigment was expensive to acquire. Silver and gold accents felt right for gladiators representing money which was one of the main reasons for the coliseum. Then a greyish black to round out the nav bar and footer to make the page aesthetic a bit </w:t>
+      </w:r>
+      <w:r>
+        <w:rPr>
+          <w:lang w:val="en-CA"/>
+        </w:rPr>
+        <w:t>cleaner and more cohesive</w:t>
+      </w:r>
+      <w:r>
+        <w:rPr>
+          <w:lang w:val="en-CA"/>
+        </w:rPr>
+        <w:t xml:space="preserve">. There were other colors used but mostly just greys and different tones of the red and purple due to opacity. With the colors established it was onto how </w:t>
+      </w:r>
+      <w:r>
+        <w:rPr>
+          <w:lang w:val="en-CA"/>
+        </w:rPr>
+        <w:t>we do</w:t>
+      </w:r>
+      <w:r>
+        <w:rPr>
+          <w:lang w:val="en-CA"/>
+        </w:rPr>
+        <w:t xml:space="preserve"> the pages to present their main content. We tried to find the sweet spot of minimalist and maximalist designs. Giving the user important data to look at for the most part and if there were “gaps”, those are filled in with details about the website/page/fighters/etc. The goal was to make the interface </w:t>
+      </w:r>
+      <w:r>
+        <w:rPr>
+          <w:lang w:val="en-CA"/>
+        </w:rPr>
+        <w:t>streamlined</w:t>
+      </w:r>
+      <w:r>
+        <w:rPr>
+          <w:lang w:val="en-CA"/>
+        </w:rPr>
+        <w:t xml:space="preserve"> without clutter</w:t>
+      </w:r>
+      <w:r>
+        <w:rPr>
+          <w:lang w:val="en-CA"/>
+        </w:rPr>
+        <w:t>.</w:t>
+      </w:r>
+      <w:r>
+        <w:rPr>
+          <w:lang w:val="en-CA"/>
+        </w:rPr>
+        <w:t xml:space="preserve"> </w:t>
+      </w:r>
+      <w:r>
+        <w:rPr>
+          <w:lang w:val="en-CA"/>
+        </w:rPr>
+        <w:t>W</w:t>
+      </w:r>
+      <w:r>
+        <w:rPr>
+          <w:lang w:val="en-CA"/>
+        </w:rPr>
+        <w:t>e want users to be able to go where they want to go when they would most likely want to go there. The attempt to achieve this is adding buttons or ‘a tags’ at areas where a user might think “I would love to go to this page now”. In conclusion we were trying to capture a historically accurate them while also trying to step in the shoes of the user and make sure there isn’t any clunkiness in their use cases.  </w:t>
+      </w:r>
+    </w:p>
+    <w:p>
+      <w:pPr>
+        <w:rPr>
+          <w:lang w:val="en-CA"/>
+        </w:rPr>
+      </w:pPr>
+      <w:r>
+        <w:rPr>
+          <w:b/>
+          <w:bCs/>
+          <w:lang w:val="en-CA"/>
+        </w:rPr>
+        <w:t xml:space="preserve">Color </w:t>
+      </w:r>
+      <w:r>
+        <w:rPr>
+          <w:b/>
+          <w:bCs/>
+          <w:lang w:val="en-CA"/>
+        </w:rPr>
+        <w:t>Palette</w:t>
+      </w:r>
+      <w:r>
+        <w:rPr>
+          <w:b/>
+          <w:bCs/>
+          <w:lang w:val="en-CA"/>
+        </w:rPr>
+        <w:t>:</w:t>
+      </w:r>
+    </w:p>
+    <w:p>
+      <w:pPr>
+        <w:rPr>
+          <w:lang w:val="en-CA"/>
+        </w:rPr>
+      </w:pPr>
+      <w:r>
+        <w:rPr>
+          <w:lang w:val="en-CA"/>
+        </w:rPr>
+        <w:drawing>
+          <wp:inline distT="0" distB="0" distL="0" distR="0" wp14:anchorId="133973AC" wp14:editId="244BFF6A">
+            <wp:extent cx="5943600" cy="1874520"/>
+            <wp:effectExtent l="0" t="0" r="0" b="0"/>
+            <wp:docPr id="1150282457" name="Picture 2"/>
+            <wp:cNvGraphicFramePr>
+              <a:graphicFrameLocks xmlns:a="http://schemas.openxmlformats.org/drawingml/2006/main" noChangeAspect="1"/>
+            </wp:cNvGraphicFramePr>
+            <a:graphic xmlns:a="http://schemas.openxmlformats.org/drawingml/2006/main">
+              <a:graphicData uri="http://schemas.openxmlformats.org/drawingml/2006/picture">
+                <pic:pic xmlns:pic="http://schemas.openxmlformats.org/drawingml/2006/picture">
+                  <pic:nvPicPr>
+                    <pic:cNvPr id="0" name="Picture 6"/>
+                    <pic:cNvPicPr>
+                      <a:picLocks noChangeAspect="1" noChangeArrowheads="1"/>
+                    </pic:cNvPicPr>
+                  </pic:nvPicPr>
+                  <pic:blipFill>
+                    <a:blip r:embed="rId22">
+                      <a:extLst>
+                        <a:ext uri="{28A0092B-C50C-407E-A947-70E740481C1C}">
+                          <a14:useLocalDpi xmlns:a14="http://schemas.microsoft.com/office/drawing/2010/main" val="0"/>
+                        </a:ext>
+                      </a:extLst>
+                    </a:blip>
+                    <a:srcRect/>
+                    <a:stretch>
+                      <a:fillRect/>
+                    </a:stretch>
+                  </pic:blipFill>
+                  <pic:spPr bwMode="auto">
+                    <a:xfrm>
+                      <a:off x="0" y="0"/>
+                      <a:ext cx="5943600" cy="1874520"/>
+                    </a:xfrm>
+                    <a:prstGeom prst="rect">
+                      <a:avLst/>
+                    </a:prstGeom>
+                    <a:noFill/>
+                    <a:ln>
+                      <a:noFill/>
+                    </a:ln>
+                  </pic:spPr>
+                </pic:pic>
+              </a:graphicData>
+            </a:graphic>
+          </wp:inline>
+        </w:drawing>
+      </w:r>
+    </w:p>
+    <w:p>
+      <w:pPr>
+        <w:rPr>
+          <w:lang w:val="en-CA"/>
+        </w:rPr>
+      </w:pPr>
+      <w:r>
+        <w:rPr>
+          <w:b/>
+          <w:bCs/>
+          <w:lang w:val="en-CA"/>
+        </w:rPr>
+        <w:t>Navigation</w:t>
+      </w:r>
+    </w:p>
+    <w:p>
+      <w:pPr>
+        <w:rPr>
+          <w:lang w:val="en-CA"/>
+        </w:rPr>
+      </w:pPr>
+      <w:r>
+        <w:rPr>
+          <w:lang w:val="en-CA"/>
+        </w:rPr>
+        <w:tab/>
+        <w:t>The user will navigate the page primarily through the popup side bar accessed through the drawer button in the top left of the navigation bar. In the side bar there are five images that serve as buttons, these buttons direct the user to the five main pages. At the bottom of the side bar there is also a cog icon which is standard for settings, this will effectively bring the user to their account settings, their name will be clickable and prompt them to log out which will ask them to confirm they want to sign out. If a user is not logged in that will be instead of username will say login. If the user clicks the aforementioned login button in the side bar, they will be brought to the login page which has a tags under the form which send the user to a create a user form page, and the forgot password will send the user to a separate password recovery page (which you may notice has been left out because were currently unsure as how to handle that edge case). Other navigation will be on the ‘View Fighters’ page, there are buttons there for edit fighter which sends the user to the ‘Edit/Delete Fighter’ page. The other navigation component I will add that is semi page navigation related is,</w:t>
+      </w:r>
+      <w:r>
+        <w:rPr>
+          <w:lang w:val="en-CA"/>
+        </w:rPr>
+        <w:t xml:space="preserve"> </w:t>
+      </w:r>
+      <w:r>
+        <w:rPr>
+          <w:lang w:val="en-CA"/>
+        </w:rPr>
+        <w:t>in the armory there are tabs that will just be React components for ‘Weapons’ and ‘Armor’. Each of the ‘Armory’ tab you click will navigate those React components.</w:t>
+      </w:r>
+    </w:p>
+    <w:p/>
     <w:sectPr>
+      <w:headerReference w:type="default" r:id="rId23"/>
+      <w:footerReference w:type="default" r:id="rId24"/>
       <w:pgSz w:w="12240" w:h="15840"/>
       <w:pgMar w:top="1440" w:right="1440" w:bottom="1440" w:left="1440" w:header="720" w:footer="720" w:gutter="0"/>
       <w:cols w:space="720"/>
@@ -952,6 +3014,118 @@
     </w:sectPr>
   </w:body>
 </w:document>
+</file>
+
+<file path=word/endnotes.xml><?xml version="1.0" encoding="utf-8"?>
+<w:endnotes xmlns:wpc="http://schemas.microsoft.com/office/word/2010/wordprocessingCanvas" xmlns:cx="http://schemas.microsoft.com/office/drawing/2014/chartex" xmlns:cx1="http://schemas.microsoft.com/office/drawing/2015/9/8/chartex" xmlns:cx2="http://schemas.microsoft.com/office/drawing/2015/10/21/chartex" xmlns:cx3="http://schemas.microsoft.com/office/drawing/2016/5/9/chartex" xmlns:cx4="http://schemas.microsoft.com/office/drawing/2016/5/10/chartex" xmlns:cx5="http://schemas.microsoft.com/office/drawing/2016/5/11/chartex" xmlns:cx6="http://schemas.microsoft.com/office/drawing/2016/5/12/chartex" xmlns:cx7="http://schemas.microsoft.com/office/drawing/2016/5/13/chartex" xmlns:cx8="http://schemas.microsoft.com/office/drawing/2016/5/14/chartex" xmlns:mc="http://schemas.openxmlformats.org/markup-compatibility/2006" xmlns:aink="http://schemas.microsoft.com/office/drawing/2016/ink" xmlns:am3d="http://schemas.microsoft.com/office/drawing/2017/model3d" xmlns:o="urn:schemas-microsoft-com:office:office" xmlns:oel="http://schemas.microsoft.com/office/2019/extlst" xmlns:r="http://schemas.openxmlformats.org/officeDocument/2006/relationships" xmlns:m="http://schemas.openxmlformats.org/officeDocument/2006/math" xmlns:v="urn:schemas-microsoft-com:vml" xmlns:wp14="http://schemas.microsoft.com/office/word/2010/wordprocessingDrawing" xmlns:wp="http://schemas.openxmlformats.org/drawingml/2006/wordprocessingDrawing" xmlns:w10="urn:schemas-microsoft-com:office:word" xmlns:w="http://schemas.openxmlformats.org/wordprocessingml/2006/main" xmlns:w14="http://schemas.microsoft.com/office/word/2010/wordml" xmlns:w15="http://schemas.microsoft.com/office/word/2012/wordml" xmlns:w16cex="http://schemas.microsoft.com/office/word/2018/wordml/cex" xmlns:w16cid="http://schemas.microsoft.com/office/word/2016/wordml/cid" xmlns:w16="http://schemas.microsoft.com/office/word/2018/wordml" xmlns:w16du="http://schemas.microsoft.com/office/word/2023/wordml/word16du" xmlns:w16sdtdh="http://schemas.microsoft.com/office/word/2020/wordml/sdtdatahash" xmlns:w16sdtfl="http://schemas.microsoft.com/office/word/2024/wordml/sdtformatlock" xmlns:w16se="http://schemas.microsoft.com/office/word/2015/wordml/symex" xmlns:wpg="http://schemas.microsoft.com/office/word/2010/wordprocessingGroup" xmlns:wpi="http://schemas.microsoft.com/office/word/2010/wordprocessingInk" xmlns:wne="http://schemas.microsoft.com/office/word/2006/wordml" xmlns:wps="http://schemas.microsoft.com/office/word/2010/wordprocessingShape" mc:Ignorable="w14 w15 w16se w16cid w16 w16cex w16sdtdh w16sdtfl w16du wp14">
+  <w:endnote w:type="separator" w:id="-1">
+    <w:p>
+      <w:r>
+        <w:separator/>
+      </w:r>
+    </w:p>
+  </w:endnote>
+  <w:endnote w:type="continuationSeparator" w:id="0">
+    <w:p>
+      <w:r>
+        <w:continuationSeparator/>
+      </w:r>
+    </w:p>
+  </w:endnote>
+</w:endnotes>
+</file>
+
+<file path=word/footer1.xml><?xml version="1.0" encoding="utf-8"?>
+<w:ftr xmlns:wpc="http://schemas.microsoft.com/office/word/2010/wordprocessingCanvas" xmlns:cx="http://schemas.microsoft.com/office/drawing/2014/chartex" xmlns:cx1="http://schemas.microsoft.com/office/drawing/2015/9/8/chartex" xmlns:cx2="http://schemas.microsoft.com/office/drawing/2015/10/21/chartex" xmlns:cx3="http://schemas.microsoft.com/office/drawing/2016/5/9/chartex" xmlns:cx4="http://schemas.microsoft.com/office/drawing/2016/5/10/chartex" xmlns:cx5="http://schemas.microsoft.com/office/drawing/2016/5/11/chartex" xmlns:cx6="http://schemas.microsoft.com/office/drawing/2016/5/12/chartex" xmlns:cx7="http://schemas.microsoft.com/office/drawing/2016/5/13/chartex" xmlns:cx8="http://schemas.microsoft.com/office/drawing/2016/5/14/chartex" xmlns:mc="http://schemas.openxmlformats.org/markup-compatibility/2006" xmlns:aink="http://schemas.microsoft.com/office/drawing/2016/ink" xmlns:am3d="http://schemas.microsoft.com/office/drawing/2017/model3d" xmlns:o="urn:schemas-microsoft-com:office:office" xmlns:oel="http://schemas.microsoft.com/office/2019/extlst" xmlns:r="http://schemas.openxmlformats.org/officeDocument/2006/relationships" xmlns:m="http://schemas.openxmlformats.org/officeDocument/2006/math" xmlns:v="urn:schemas-microsoft-com:vml" xmlns:wp14="http://schemas.microsoft.com/office/word/2010/wordprocessingDrawing" xmlns:wp="http://schemas.openxmlformats.org/drawingml/2006/wordprocessingDrawing" xmlns:w10="urn:schemas-microsoft-com:office:word" xmlns:w="http://schemas.openxmlformats.org/wordprocessingml/2006/main" xmlns:w14="http://schemas.microsoft.com/office/word/2010/wordml" xmlns:w15="http://schemas.microsoft.com/office/word/2012/wordml" xmlns:w16cex="http://schemas.microsoft.com/office/word/2018/wordml/cex" xmlns:w16cid="http://schemas.microsoft.com/office/word/2016/wordml/cid" xmlns:w16="http://schemas.microsoft.com/office/word/2018/wordml" xmlns:w16du="http://schemas.microsoft.com/office/word/2023/wordml/word16du" xmlns:w16sdtdh="http://schemas.microsoft.com/office/word/2020/wordml/sdtdatahash" xmlns:w16sdtfl="http://schemas.microsoft.com/office/word/2024/wordml/sdtformatlock" xmlns:w16se="http://schemas.microsoft.com/office/word/2015/wordml/symex" xmlns:wpg="http://schemas.microsoft.com/office/word/2010/wordprocessingGroup" xmlns:wpi="http://schemas.microsoft.com/office/word/2010/wordprocessingInk" xmlns:wne="http://schemas.microsoft.com/office/word/2006/wordml" xmlns:wps="http://schemas.microsoft.com/office/word/2010/wordprocessingShape" mc:Ignorable="w14 w15 w16se w16cid w16 w16cex w16sdtdh w16sdtfl w16du wp14">
+  <w:sdt>
+    <w:sdtPr>
+      <w:id w:val="-428738207"/>
+      <w:docPartObj>
+        <w:docPartGallery w:val="Page Numbers (Bottom of Page)"/>
+        <w:docPartUnique/>
+      </w:docPartObj>
+    </w:sdtPr>
+    <w:sdtEndPr>
+      <w:rPr>
+        <w:noProof/>
+      </w:rPr>
+    </w:sdtEndPr>
+    <w:sdtContent>
+      <w:p>
+        <w:pPr>
+          <w:pStyle w:val="Footer"/>
+          <w:jc w:val="right"/>
+        </w:pPr>
+        <w:r>
+          <w:fldChar w:fldCharType="begin"/>
+        </w:r>
+        <w:r>
+          <w:instrText xml:space="preserve"> PAGE   \* MERGEFORMAT </w:instrText>
+        </w:r>
+        <w:r>
+          <w:fldChar w:fldCharType="separate"/>
+        </w:r>
+        <w:r>
+          <w:rPr>
+            <w:noProof/>
+          </w:rPr>
+          <w:t>2</w:t>
+        </w:r>
+        <w:r>
+          <w:rPr>
+            <w:noProof/>
+          </w:rPr>
+          <w:fldChar w:fldCharType="end"/>
+        </w:r>
+      </w:p>
+    </w:sdtContent>
+  </w:sdt>
+  <w:p>
+    <w:pPr>
+      <w:pStyle w:val="Footer"/>
+    </w:pPr>
+  </w:p>
+</w:ftr>
+</file>
+
+<file path=word/footnotes.xml><?xml version="1.0" encoding="utf-8"?>
+<w:footnotes xmlns:wpc="http://schemas.microsoft.com/office/word/2010/wordprocessingCanvas" xmlns:cx="http://schemas.microsoft.com/office/drawing/2014/chartex" xmlns:cx1="http://schemas.microsoft.com/office/drawing/2015/9/8/chartex" xmlns:cx2="http://schemas.microsoft.com/office/drawing/2015/10/21/chartex" xmlns:cx3="http://schemas.microsoft.com/office/drawing/2016/5/9/chartex" xmlns:cx4="http://schemas.microsoft.com/office/drawing/2016/5/10/chartex" xmlns:cx5="http://schemas.microsoft.com/office/drawing/2016/5/11/chartex" xmlns:cx6="http://schemas.microsoft.com/office/drawing/2016/5/12/chartex" xmlns:cx7="http://schemas.microsoft.com/office/drawing/2016/5/13/chartex" xmlns:cx8="http://schemas.microsoft.com/office/drawing/2016/5/14/chartex" xmlns:mc="http://schemas.openxmlformats.org/markup-compatibility/2006" xmlns:aink="http://schemas.microsoft.com/office/drawing/2016/ink" xmlns:am3d="http://schemas.microsoft.com/office/drawing/2017/model3d" xmlns:o="urn:schemas-microsoft-com:office:office" xmlns:oel="http://schemas.microsoft.com/office/2019/extlst" xmlns:r="http://schemas.openxmlformats.org/officeDocument/2006/relationships" xmlns:m="http://schemas.openxmlformats.org/officeDocument/2006/math" xmlns:v="urn:schemas-microsoft-com:vml" xmlns:wp14="http://schemas.microsoft.com/office/word/2010/wordprocessingDrawing" xmlns:wp="http://schemas.openxmlformats.org/drawingml/2006/wordprocessingDrawing" xmlns:w10="urn:schemas-microsoft-com:office:word" xmlns:w="http://schemas.openxmlformats.org/wordprocessingml/2006/main" xmlns:w14="http://schemas.microsoft.com/office/word/2010/wordml" xmlns:w15="http://schemas.microsoft.com/office/word/2012/wordml" xmlns:w16cex="http://schemas.microsoft.com/office/word/2018/wordml/cex" xmlns:w16cid="http://schemas.microsoft.com/office/word/2016/wordml/cid" xmlns:w16="http://schemas.microsoft.com/office/word/2018/wordml" xmlns:w16du="http://schemas.microsoft.com/office/word/2023/wordml/word16du" xmlns:w16sdtdh="http://schemas.microsoft.com/office/word/2020/wordml/sdtdatahash" xmlns:w16sdtfl="http://schemas.microsoft.com/office/word/2024/wordml/sdtformatlock" xmlns:w16se="http://schemas.microsoft.com/office/word/2015/wordml/symex" xmlns:wpg="http://schemas.microsoft.com/office/word/2010/wordprocessingGroup" xmlns:wpi="http://schemas.microsoft.com/office/word/2010/wordprocessingInk" xmlns:wne="http://schemas.microsoft.com/office/word/2006/wordml" xmlns:wps="http://schemas.microsoft.com/office/word/2010/wordprocessingShape" mc:Ignorable="w14 w15 w16se w16cid w16 w16cex w16sdtdh w16sdtfl w16du wp14">
+  <w:footnote w:type="separator" w:id="-1">
+    <w:p>
+      <w:r>
+        <w:separator/>
+      </w:r>
+    </w:p>
+  </w:footnote>
+  <w:footnote w:type="continuationSeparator" w:id="0">
+    <w:p>
+      <w:r>
+        <w:continuationSeparator/>
+      </w:r>
+    </w:p>
+  </w:footnote>
+</w:footnotes>
+</file>
+
+<file path=word/header1.xml><?xml version="1.0" encoding="utf-8"?>
+<w:hdr xmlns:wpc="http://schemas.microsoft.com/office/word/2010/wordprocessingCanvas" xmlns:cx="http://schemas.microsoft.com/office/drawing/2014/chartex" xmlns:cx1="http://schemas.microsoft.com/office/drawing/2015/9/8/chartex" xmlns:cx2="http://schemas.microsoft.com/office/drawing/2015/10/21/chartex" xmlns:cx3="http://schemas.microsoft.com/office/drawing/2016/5/9/chartex" xmlns:cx4="http://schemas.microsoft.com/office/drawing/2016/5/10/chartex" xmlns:cx5="http://schemas.microsoft.com/office/drawing/2016/5/11/chartex" xmlns:cx6="http://schemas.microsoft.com/office/drawing/2016/5/12/chartex" xmlns:cx7="http://schemas.microsoft.com/office/drawing/2016/5/13/chartex" xmlns:cx8="http://schemas.microsoft.com/office/drawing/2016/5/14/chartex" xmlns:mc="http://schemas.openxmlformats.org/markup-compatibility/2006" xmlns:aink="http://schemas.microsoft.com/office/drawing/2016/ink" xmlns:am3d="http://schemas.microsoft.com/office/drawing/2017/model3d" xmlns:o="urn:schemas-microsoft-com:office:office" xmlns:oel="http://schemas.microsoft.com/office/2019/extlst" xmlns:r="http://schemas.openxmlformats.org/officeDocument/2006/relationships" xmlns:m="http://schemas.openxmlformats.org/officeDocument/2006/math" xmlns:v="urn:schemas-microsoft-com:vml" xmlns:wp14="http://schemas.microsoft.com/office/word/2010/wordprocessingDrawing" xmlns:wp="http://schemas.openxmlformats.org/drawingml/2006/wordprocessingDrawing" xmlns:w10="urn:schemas-microsoft-com:office:word" xmlns:w="http://schemas.openxmlformats.org/wordprocessingml/2006/main" xmlns:w14="http://schemas.microsoft.com/office/word/2010/wordml" xmlns:w15="http://schemas.microsoft.com/office/word/2012/wordml" xmlns:w16cex="http://schemas.microsoft.com/office/word/2018/wordml/cex" xmlns:w16cid="http://schemas.microsoft.com/office/word/2016/wordml/cid" xmlns:w16="http://schemas.microsoft.com/office/word/2018/wordml" xmlns:w16du="http://schemas.microsoft.com/office/word/2023/wordml/word16du" xmlns:w16sdtdh="http://schemas.microsoft.com/office/word/2020/wordml/sdtdatahash" xmlns:w16sdtfl="http://schemas.microsoft.com/office/word/2024/wordml/sdtformatlock" xmlns:w16se="http://schemas.microsoft.com/office/word/2015/wordml/symex" xmlns:wpg="http://schemas.microsoft.com/office/word/2010/wordprocessingGroup" xmlns:wpi="http://schemas.microsoft.com/office/word/2010/wordprocessingInk" xmlns:wne="http://schemas.microsoft.com/office/word/2006/wordml" xmlns:wps="http://schemas.microsoft.com/office/word/2010/wordprocessingShape" mc:Ignorable="w14 w15 w16se w16cid w16 w16cex w16sdtdh w16sdtfl w16du wp14">
+  <w:p>
+    <w:pPr>
+      <w:pStyle w:val="Header"/>
+      <w:rPr>
+        <w:lang w:val="en-CA"/>
+      </w:rPr>
+    </w:pPr>
+    <w:r>
+      <w:rPr>
+        <w:b/>
+        <w:bCs/>
+        <w:lang w:val="en-CA"/>
+      </w:rPr>
+      <w:t>CRIXUS</w:t>
+    </w:r>
+  </w:p>
+</w:hdr>
 </file>
 
 <file path=word/numbering.xml><?xml version="1.0" encoding="utf-8"?>
@@ -3996,7 +6170,6 @@
     <w:basedOn w:val="Normal"/>
     <w:link w:val="HeaderChar"/>
     <w:uiPriority w:val="99"/>
-    <w:semiHidden/>
     <w:unhideWhenUsed/>
     <w:rsid w:val="006D3D74"/>
   </w:style>
@@ -4005,7 +6178,6 @@
     <w:basedOn w:val="DefaultParagraphFont"/>
     <w:link w:val="Header"/>
     <w:uiPriority w:val="99"/>
-    <w:semiHidden/>
     <w:rsid w:val="006D3D74"/>
   </w:style>
   <w:style w:type="paragraph" w:styleId="Footer">
@@ -4013,7 +6185,6 @@
     <w:basedOn w:val="Normal"/>
     <w:link w:val="FooterChar"/>
     <w:uiPriority w:val="99"/>
-    <w:semiHidden/>
     <w:unhideWhenUsed/>
     <w:rsid w:val="006D3D74"/>
   </w:style>
@@ -4022,7 +6193,6 @@
     <w:basedOn w:val="DefaultParagraphFont"/>
     <w:link w:val="Footer"/>
     <w:uiPriority w:val="99"/>
-    <w:semiHidden/>
     <w:rsid w:val="006D3D74"/>
   </w:style>
   <w:style w:type="paragraph" w:styleId="TOC9">
@@ -4304,139 +6474,12 @@
 </file>
 
 <file path=customXml/item1.xml><?xml version="1.0" encoding="utf-8"?>
-<p:properties xmlns:p="http://schemas.microsoft.com/office/2006/metadata/properties" xmlns:xsi="http://www.w3.org/2001/XMLSchema-instance" xmlns:pc="http://schemas.microsoft.com/office/infopath/2007/PartnerControls">
-  <documentManagement>
-    <LocLastLocAttemptVersionTypeLookup xmlns="4873beb7-5857-4685-be1f-d57550cc96cc" xsi:nil="true"/>
-    <MarketSpecific xmlns="4873beb7-5857-4685-be1f-d57550cc96cc">false</MarketSpecific>
-    <ApprovalStatus xmlns="4873beb7-5857-4685-be1f-d57550cc96cc">InProgress</ApprovalStatus>
-    <LocComments xmlns="4873beb7-5857-4685-be1f-d57550cc96cc" xsi:nil="true"/>
-    <DirectSourceMarket xmlns="4873beb7-5857-4685-be1f-d57550cc96cc" xsi:nil="true"/>
-    <LocPublishedLinkedAssetsLookup xmlns="4873beb7-5857-4685-be1f-d57550cc96cc" xsi:nil="true"/>
-    <ThumbnailAssetId xmlns="4873beb7-5857-4685-be1f-d57550cc96cc" xsi:nil="true"/>
-    <PrimaryImageGen xmlns="4873beb7-5857-4685-be1f-d57550cc96cc">true</PrimaryImageGen>
-    <LegacyData xmlns="4873beb7-5857-4685-be1f-d57550cc96cc" xsi:nil="true"/>
-    <LocNewPublishedVersionLookup xmlns="4873beb7-5857-4685-be1f-d57550cc96cc" xsi:nil="true"/>
-    <NumericId xmlns="4873beb7-5857-4685-be1f-d57550cc96cc">102787001</NumericId>
-    <TPFriendlyName xmlns="4873beb7-5857-4685-be1f-d57550cc96cc" xsi:nil="true"/>
-    <LocOverallPublishStatusLookup xmlns="4873beb7-5857-4685-be1f-d57550cc96cc" xsi:nil="true"/>
-    <LocRecommendedHandoff xmlns="4873beb7-5857-4685-be1f-d57550cc96cc" xsi:nil="true"/>
-    <BlockPublish xmlns="4873beb7-5857-4685-be1f-d57550cc96cc">false</BlockPublish>
-    <BusinessGroup xmlns="4873beb7-5857-4685-be1f-d57550cc96cc" xsi:nil="true"/>
-    <OpenTemplate xmlns="4873beb7-5857-4685-be1f-d57550cc96cc">true</OpenTemplate>
-    <SourceTitle xmlns="4873beb7-5857-4685-be1f-d57550cc96cc" xsi:nil="true"/>
-    <LocOverallLocStatusLookup xmlns="4873beb7-5857-4685-be1f-d57550cc96cc" xsi:nil="true"/>
-    <APEditor xmlns="4873beb7-5857-4685-be1f-d57550cc96cc">
-      <UserInfo>
-        <DisplayName/>
-        <AccountId xsi:nil="true"/>
-        <AccountType/>
-      </UserInfo>
-    </APEditor>
-    <UALocComments xmlns="4873beb7-5857-4685-be1f-d57550cc96cc" xsi:nil="true"/>
-    <IntlLangReviewDate xmlns="4873beb7-5857-4685-be1f-d57550cc96cc" xsi:nil="true"/>
-    <PublishStatusLookup xmlns="4873beb7-5857-4685-be1f-d57550cc96cc">
-      <Value>1343188</Value>
-    </PublishStatusLookup>
-    <ParentAssetId xmlns="4873beb7-5857-4685-be1f-d57550cc96cc" xsi:nil="true"/>
-    <FeatureTagsTaxHTField0 xmlns="4873beb7-5857-4685-be1f-d57550cc96cc">
-      <Terms xmlns="http://schemas.microsoft.com/office/infopath/2007/PartnerControls"/>
-    </FeatureTagsTaxHTField0>
-    <MachineTranslated xmlns="4873beb7-5857-4685-be1f-d57550cc96cc">false</MachineTranslated>
-    <Providers xmlns="4873beb7-5857-4685-be1f-d57550cc96cc" xsi:nil="true"/>
-    <OriginalSourceMarket xmlns="4873beb7-5857-4685-be1f-d57550cc96cc" xsi:nil="true"/>
-    <APDescription xmlns="4873beb7-5857-4685-be1f-d57550cc96cc" xsi:nil="true"/>
-    <ContentItem xmlns="4873beb7-5857-4685-be1f-d57550cc96cc" xsi:nil="true"/>
-    <ClipArtFilename xmlns="4873beb7-5857-4685-be1f-d57550cc96cc" xsi:nil="true"/>
-    <TPInstallLocation xmlns="4873beb7-5857-4685-be1f-d57550cc96cc" xsi:nil="true"/>
-    <TimesCloned xmlns="4873beb7-5857-4685-be1f-d57550cc96cc" xsi:nil="true"/>
-    <PublishTargets xmlns="4873beb7-5857-4685-be1f-d57550cc96cc">OfficeOnlineVNext</PublishTargets>
-    <AcquiredFrom xmlns="4873beb7-5857-4685-be1f-d57550cc96cc">Internal MS</AcquiredFrom>
-    <AssetStart xmlns="4873beb7-5857-4685-be1f-d57550cc96cc">2011-11-23T17:29:00+00:00</AssetStart>
-    <FriendlyTitle xmlns="4873beb7-5857-4685-be1f-d57550cc96cc" xsi:nil="true"/>
-    <Provider xmlns="4873beb7-5857-4685-be1f-d57550cc96cc" xsi:nil="true"/>
-    <LastHandOff xmlns="4873beb7-5857-4685-be1f-d57550cc96cc" xsi:nil="true"/>
-    <TPClientViewer xmlns="4873beb7-5857-4685-be1f-d57550cc96cc" xsi:nil="true"/>
-    <TemplateStatus xmlns="4873beb7-5857-4685-be1f-d57550cc96cc">Complete</TemplateStatus>
-    <Downloads xmlns="4873beb7-5857-4685-be1f-d57550cc96cc">0</Downloads>
-    <OOCacheId xmlns="4873beb7-5857-4685-be1f-d57550cc96cc" xsi:nil="true"/>
-    <IsDeleted xmlns="4873beb7-5857-4685-be1f-d57550cc96cc">false</IsDeleted>
-    <LocPublishedDependentAssetsLookup xmlns="4873beb7-5857-4685-be1f-d57550cc96cc" xsi:nil="true"/>
-    <AssetExpire xmlns="4873beb7-5857-4685-be1f-d57550cc96cc">2029-05-12T07:00:00+00:00</AssetExpire>
-    <CSXSubmissionMarket xmlns="4873beb7-5857-4685-be1f-d57550cc96cc" xsi:nil="true"/>
-    <DSATActionTaken xmlns="4873beb7-5857-4685-be1f-d57550cc96cc" xsi:nil="true"/>
-    <SubmitterId xmlns="4873beb7-5857-4685-be1f-d57550cc96cc" xsi:nil="true"/>
-    <EditorialTags xmlns="4873beb7-5857-4685-be1f-d57550cc96cc" xsi:nil="true"/>
-    <TPExecutable xmlns="4873beb7-5857-4685-be1f-d57550cc96cc" xsi:nil="true"/>
-    <CSXSubmissionDate xmlns="4873beb7-5857-4685-be1f-d57550cc96cc" xsi:nil="true"/>
-    <CSXUpdate xmlns="4873beb7-5857-4685-be1f-d57550cc96cc">false</CSXUpdate>
-    <AssetType xmlns="4873beb7-5857-4685-be1f-d57550cc96cc">TP</AssetType>
-    <ApprovalLog xmlns="4873beb7-5857-4685-be1f-d57550cc96cc" xsi:nil="true"/>
-    <BugNumber xmlns="4873beb7-5857-4685-be1f-d57550cc96cc" xsi:nil="true"/>
-    <OriginAsset xmlns="4873beb7-5857-4685-be1f-d57550cc96cc" xsi:nil="true"/>
-    <TPComponent xmlns="4873beb7-5857-4685-be1f-d57550cc96cc" xsi:nil="true"/>
-    <Milestone xmlns="4873beb7-5857-4685-be1f-d57550cc96cc" xsi:nil="true"/>
-    <RecommendationsModifier xmlns="4873beb7-5857-4685-be1f-d57550cc96cc" xsi:nil="true"/>
-    <AssetId xmlns="4873beb7-5857-4685-be1f-d57550cc96cc">TP102787001</AssetId>
-    <PolicheckWords xmlns="4873beb7-5857-4685-be1f-d57550cc96cc" xsi:nil="true"/>
-    <TPLaunchHelpLink xmlns="4873beb7-5857-4685-be1f-d57550cc96cc" xsi:nil="true"/>
-    <IntlLocPriority xmlns="4873beb7-5857-4685-be1f-d57550cc96cc" xsi:nil="true"/>
-    <TPApplication xmlns="4873beb7-5857-4685-be1f-d57550cc96cc" xsi:nil="true"/>
-    <IntlLangReviewer xmlns="4873beb7-5857-4685-be1f-d57550cc96cc" xsi:nil="true"/>
-    <HandoffToMSDN xmlns="4873beb7-5857-4685-be1f-d57550cc96cc" xsi:nil="true"/>
-    <PlannedPubDate xmlns="4873beb7-5857-4685-be1f-d57550cc96cc" xsi:nil="true"/>
-    <CrawlForDependencies xmlns="4873beb7-5857-4685-be1f-d57550cc96cc">false</CrawlForDependencies>
-    <LocLastLocAttemptVersionLookup xmlns="4873beb7-5857-4685-be1f-d57550cc96cc">693888</LocLastLocAttemptVersionLookup>
-    <LocProcessedForHandoffsLookup xmlns="4873beb7-5857-4685-be1f-d57550cc96cc" xsi:nil="true"/>
-    <TrustLevel xmlns="4873beb7-5857-4685-be1f-d57550cc96cc">1 Microsoft Managed Content</TrustLevel>
-    <CampaignTagsTaxHTField0 xmlns="4873beb7-5857-4685-be1f-d57550cc96cc">
-      <Terms xmlns="http://schemas.microsoft.com/office/infopath/2007/PartnerControls"/>
-    </CampaignTagsTaxHTField0>
-    <TPNamespace xmlns="4873beb7-5857-4685-be1f-d57550cc96cc" xsi:nil="true"/>
-    <LocOverallPreviewStatusLookup xmlns="4873beb7-5857-4685-be1f-d57550cc96cc" xsi:nil="true"/>
-    <TaxCatchAll xmlns="4873beb7-5857-4685-be1f-d57550cc96cc"/>
-    <IsSearchable xmlns="4873beb7-5857-4685-be1f-d57550cc96cc">false</IsSearchable>
-    <TemplateTemplateType xmlns="4873beb7-5857-4685-be1f-d57550cc96cc">Word Document Template</TemplateTemplateType>
-    <Markets xmlns="4873beb7-5857-4685-be1f-d57550cc96cc"/>
-    <IntlLangReview xmlns="4873beb7-5857-4685-be1f-d57550cc96cc" xsi:nil="true"/>
-    <UAProjectedTotalWords xmlns="4873beb7-5857-4685-be1f-d57550cc96cc" xsi:nil="true"/>
-    <OutputCachingOn xmlns="4873beb7-5857-4685-be1f-d57550cc96cc">false</OutputCachingOn>
-    <AverageRating xmlns="4873beb7-5857-4685-be1f-d57550cc96cc" xsi:nil="true"/>
-    <LocMarketGroupTiers2 xmlns="4873beb7-5857-4685-be1f-d57550cc96cc" xsi:nil="true"/>
-    <APAuthor xmlns="4873beb7-5857-4685-be1f-d57550cc96cc">
-      <UserInfo>
-        <DisplayName>REDMOND\v-namall</DisplayName>
-        <AccountId>978</AccountId>
-        <AccountType/>
-      </UserInfo>
-    </APAuthor>
-    <TPCommandLine xmlns="4873beb7-5857-4685-be1f-d57550cc96cc" xsi:nil="true"/>
-    <LocManualTestRequired xmlns="4873beb7-5857-4685-be1f-d57550cc96cc">false</LocManualTestRequired>
-    <TPAppVersion xmlns="4873beb7-5857-4685-be1f-d57550cc96cc" xsi:nil="true"/>
-    <EditorialStatus xmlns="4873beb7-5857-4685-be1f-d57550cc96cc">Complete</EditorialStatus>
-    <LocProcessedForMarketsLookup xmlns="4873beb7-5857-4685-be1f-d57550cc96cc" xsi:nil="true"/>
-    <LastModifiedDateTime xmlns="4873beb7-5857-4685-be1f-d57550cc96cc" xsi:nil="true"/>
-    <TPLaunchHelpLinkType xmlns="4873beb7-5857-4685-be1f-d57550cc96cc">Template</TPLaunchHelpLinkType>
-    <ScenarioTagsTaxHTField0 xmlns="4873beb7-5857-4685-be1f-d57550cc96cc">
-      <Terms xmlns="http://schemas.microsoft.com/office/infopath/2007/PartnerControls"/>
-    </ScenarioTagsTaxHTField0>
-    <OriginalRelease xmlns="4873beb7-5857-4685-be1f-d57550cc96cc">14</OriginalRelease>
-    <LocalizationTagsTaxHTField0 xmlns="4873beb7-5857-4685-be1f-d57550cc96cc">
-      <Terms xmlns="http://schemas.microsoft.com/office/infopath/2007/PartnerControls"/>
-    </LocalizationTagsTaxHTField0>
-    <Manager xmlns="4873beb7-5857-4685-be1f-d57550cc96cc" xsi:nil="true"/>
-    <UALocRecommendation xmlns="4873beb7-5857-4685-be1f-d57550cc96cc">Localize</UALocRecommendation>
-    <LocOverallHandbackStatusLookup xmlns="4873beb7-5857-4685-be1f-d57550cc96cc" xsi:nil="true"/>
-    <ArtSampleDocs xmlns="4873beb7-5857-4685-be1f-d57550cc96cc" xsi:nil="true"/>
-    <UACurrentWords xmlns="4873beb7-5857-4685-be1f-d57550cc96cc" xsi:nil="true"/>
-    <ShowIn xmlns="4873beb7-5857-4685-be1f-d57550cc96cc">Show everywhere</ShowIn>
-    <CSXHash xmlns="4873beb7-5857-4685-be1f-d57550cc96cc" xsi:nil="true"/>
-    <VoteCount xmlns="4873beb7-5857-4685-be1f-d57550cc96cc" xsi:nil="true"/>
-    <InternalTagsTaxHTField0 xmlns="4873beb7-5857-4685-be1f-d57550cc96cc">
-      <Terms xmlns="http://schemas.microsoft.com/office/infopath/2007/PartnerControls"/>
-    </InternalTagsTaxHTField0>
-    <UANotes xmlns="4873beb7-5857-4685-be1f-d57550cc96cc" xsi:nil="true"/>
-  </documentManagement>
-</p:properties>
+<?mso-contentType ?>
+<FormTemplates xmlns="http://schemas.microsoft.com/sharepoint/v3/contenttype/forms">
+  <Display>DocumentLibraryForm</Display>
+  <Edit>AssetEditForm</Edit>
+  <New>DocumentLibraryForm</New>
+</FormTemplates>
 </file>
 
 <file path=customXml/item2.xml><?xml version="1.0" encoding="utf-8"?>
@@ -5480,20 +7523,145 @@
 </file>
 
 <file path=customXml/item3.xml><?xml version="1.0" encoding="utf-8"?>
-<?mso-contentType ?>
-<FormTemplates xmlns="http://schemas.microsoft.com/sharepoint/v3/contenttype/forms">
-  <Display>DocumentLibraryForm</Display>
-  <Edit>AssetEditForm</Edit>
-  <New>DocumentLibraryForm</New>
-</FormTemplates>
+<p:properties xmlns:p="http://schemas.microsoft.com/office/2006/metadata/properties" xmlns:xsi="http://www.w3.org/2001/XMLSchema-instance" xmlns:pc="http://schemas.microsoft.com/office/infopath/2007/PartnerControls">
+  <documentManagement>
+    <LocLastLocAttemptVersionTypeLookup xmlns="4873beb7-5857-4685-be1f-d57550cc96cc" xsi:nil="true"/>
+    <MarketSpecific xmlns="4873beb7-5857-4685-be1f-d57550cc96cc">false</MarketSpecific>
+    <ApprovalStatus xmlns="4873beb7-5857-4685-be1f-d57550cc96cc">InProgress</ApprovalStatus>
+    <LocComments xmlns="4873beb7-5857-4685-be1f-d57550cc96cc" xsi:nil="true"/>
+    <DirectSourceMarket xmlns="4873beb7-5857-4685-be1f-d57550cc96cc" xsi:nil="true"/>
+    <LocPublishedLinkedAssetsLookup xmlns="4873beb7-5857-4685-be1f-d57550cc96cc" xsi:nil="true"/>
+    <ThumbnailAssetId xmlns="4873beb7-5857-4685-be1f-d57550cc96cc" xsi:nil="true"/>
+    <PrimaryImageGen xmlns="4873beb7-5857-4685-be1f-d57550cc96cc">true</PrimaryImageGen>
+    <LegacyData xmlns="4873beb7-5857-4685-be1f-d57550cc96cc" xsi:nil="true"/>
+    <LocNewPublishedVersionLookup xmlns="4873beb7-5857-4685-be1f-d57550cc96cc" xsi:nil="true"/>
+    <NumericId xmlns="4873beb7-5857-4685-be1f-d57550cc96cc">102787001</NumericId>
+    <TPFriendlyName xmlns="4873beb7-5857-4685-be1f-d57550cc96cc" xsi:nil="true"/>
+    <LocOverallPublishStatusLookup xmlns="4873beb7-5857-4685-be1f-d57550cc96cc" xsi:nil="true"/>
+    <LocRecommendedHandoff xmlns="4873beb7-5857-4685-be1f-d57550cc96cc" xsi:nil="true"/>
+    <BlockPublish xmlns="4873beb7-5857-4685-be1f-d57550cc96cc">false</BlockPublish>
+    <BusinessGroup xmlns="4873beb7-5857-4685-be1f-d57550cc96cc" xsi:nil="true"/>
+    <OpenTemplate xmlns="4873beb7-5857-4685-be1f-d57550cc96cc">true</OpenTemplate>
+    <SourceTitle xmlns="4873beb7-5857-4685-be1f-d57550cc96cc" xsi:nil="true"/>
+    <LocOverallLocStatusLookup xmlns="4873beb7-5857-4685-be1f-d57550cc96cc" xsi:nil="true"/>
+    <APEditor xmlns="4873beb7-5857-4685-be1f-d57550cc96cc">
+      <UserInfo>
+        <DisplayName/>
+        <AccountId xsi:nil="true"/>
+        <AccountType/>
+      </UserInfo>
+    </APEditor>
+    <UALocComments xmlns="4873beb7-5857-4685-be1f-d57550cc96cc" xsi:nil="true"/>
+    <IntlLangReviewDate xmlns="4873beb7-5857-4685-be1f-d57550cc96cc" xsi:nil="true"/>
+    <PublishStatusLookup xmlns="4873beb7-5857-4685-be1f-d57550cc96cc">
+      <Value>1343188</Value>
+    </PublishStatusLookup>
+    <ParentAssetId xmlns="4873beb7-5857-4685-be1f-d57550cc96cc" xsi:nil="true"/>
+    <FeatureTagsTaxHTField0 xmlns="4873beb7-5857-4685-be1f-d57550cc96cc">
+      <Terms xmlns="http://schemas.microsoft.com/office/infopath/2007/PartnerControls"/>
+    </FeatureTagsTaxHTField0>
+    <MachineTranslated xmlns="4873beb7-5857-4685-be1f-d57550cc96cc">false</MachineTranslated>
+    <Providers xmlns="4873beb7-5857-4685-be1f-d57550cc96cc" xsi:nil="true"/>
+    <OriginalSourceMarket xmlns="4873beb7-5857-4685-be1f-d57550cc96cc" xsi:nil="true"/>
+    <APDescription xmlns="4873beb7-5857-4685-be1f-d57550cc96cc" xsi:nil="true"/>
+    <ContentItem xmlns="4873beb7-5857-4685-be1f-d57550cc96cc" xsi:nil="true"/>
+    <ClipArtFilename xmlns="4873beb7-5857-4685-be1f-d57550cc96cc" xsi:nil="true"/>
+    <TPInstallLocation xmlns="4873beb7-5857-4685-be1f-d57550cc96cc" xsi:nil="true"/>
+    <TimesCloned xmlns="4873beb7-5857-4685-be1f-d57550cc96cc" xsi:nil="true"/>
+    <PublishTargets xmlns="4873beb7-5857-4685-be1f-d57550cc96cc">OfficeOnlineVNext</PublishTargets>
+    <AcquiredFrom xmlns="4873beb7-5857-4685-be1f-d57550cc96cc">Internal MS</AcquiredFrom>
+    <AssetStart xmlns="4873beb7-5857-4685-be1f-d57550cc96cc">2011-11-23T17:29:00+00:00</AssetStart>
+    <FriendlyTitle xmlns="4873beb7-5857-4685-be1f-d57550cc96cc" xsi:nil="true"/>
+    <Provider xmlns="4873beb7-5857-4685-be1f-d57550cc96cc" xsi:nil="true"/>
+    <LastHandOff xmlns="4873beb7-5857-4685-be1f-d57550cc96cc" xsi:nil="true"/>
+    <TPClientViewer xmlns="4873beb7-5857-4685-be1f-d57550cc96cc" xsi:nil="true"/>
+    <TemplateStatus xmlns="4873beb7-5857-4685-be1f-d57550cc96cc">Complete</TemplateStatus>
+    <Downloads xmlns="4873beb7-5857-4685-be1f-d57550cc96cc">0</Downloads>
+    <OOCacheId xmlns="4873beb7-5857-4685-be1f-d57550cc96cc" xsi:nil="true"/>
+    <IsDeleted xmlns="4873beb7-5857-4685-be1f-d57550cc96cc">false</IsDeleted>
+    <LocPublishedDependentAssetsLookup xmlns="4873beb7-5857-4685-be1f-d57550cc96cc" xsi:nil="true"/>
+    <AssetExpire xmlns="4873beb7-5857-4685-be1f-d57550cc96cc">2029-05-12T07:00:00+00:00</AssetExpire>
+    <CSXSubmissionMarket xmlns="4873beb7-5857-4685-be1f-d57550cc96cc" xsi:nil="true"/>
+    <DSATActionTaken xmlns="4873beb7-5857-4685-be1f-d57550cc96cc" xsi:nil="true"/>
+    <SubmitterId xmlns="4873beb7-5857-4685-be1f-d57550cc96cc" xsi:nil="true"/>
+    <EditorialTags xmlns="4873beb7-5857-4685-be1f-d57550cc96cc" xsi:nil="true"/>
+    <TPExecutable xmlns="4873beb7-5857-4685-be1f-d57550cc96cc" xsi:nil="true"/>
+    <CSXSubmissionDate xmlns="4873beb7-5857-4685-be1f-d57550cc96cc" xsi:nil="true"/>
+    <CSXUpdate xmlns="4873beb7-5857-4685-be1f-d57550cc96cc">false</CSXUpdate>
+    <AssetType xmlns="4873beb7-5857-4685-be1f-d57550cc96cc">TP</AssetType>
+    <ApprovalLog xmlns="4873beb7-5857-4685-be1f-d57550cc96cc" xsi:nil="true"/>
+    <BugNumber xmlns="4873beb7-5857-4685-be1f-d57550cc96cc" xsi:nil="true"/>
+    <OriginAsset xmlns="4873beb7-5857-4685-be1f-d57550cc96cc" xsi:nil="true"/>
+    <TPComponent xmlns="4873beb7-5857-4685-be1f-d57550cc96cc" xsi:nil="true"/>
+    <Milestone xmlns="4873beb7-5857-4685-be1f-d57550cc96cc" xsi:nil="true"/>
+    <RecommendationsModifier xmlns="4873beb7-5857-4685-be1f-d57550cc96cc" xsi:nil="true"/>
+    <AssetId xmlns="4873beb7-5857-4685-be1f-d57550cc96cc">TP102787001</AssetId>
+    <PolicheckWords xmlns="4873beb7-5857-4685-be1f-d57550cc96cc" xsi:nil="true"/>
+    <TPLaunchHelpLink xmlns="4873beb7-5857-4685-be1f-d57550cc96cc" xsi:nil="true"/>
+    <IntlLocPriority xmlns="4873beb7-5857-4685-be1f-d57550cc96cc" xsi:nil="true"/>
+    <TPApplication xmlns="4873beb7-5857-4685-be1f-d57550cc96cc" xsi:nil="true"/>
+    <IntlLangReviewer xmlns="4873beb7-5857-4685-be1f-d57550cc96cc" xsi:nil="true"/>
+    <HandoffToMSDN xmlns="4873beb7-5857-4685-be1f-d57550cc96cc" xsi:nil="true"/>
+    <PlannedPubDate xmlns="4873beb7-5857-4685-be1f-d57550cc96cc" xsi:nil="true"/>
+    <CrawlForDependencies xmlns="4873beb7-5857-4685-be1f-d57550cc96cc">false</CrawlForDependencies>
+    <LocLastLocAttemptVersionLookup xmlns="4873beb7-5857-4685-be1f-d57550cc96cc">693888</LocLastLocAttemptVersionLookup>
+    <LocProcessedForHandoffsLookup xmlns="4873beb7-5857-4685-be1f-d57550cc96cc" xsi:nil="true"/>
+    <TrustLevel xmlns="4873beb7-5857-4685-be1f-d57550cc96cc">1 Microsoft Managed Content</TrustLevel>
+    <CampaignTagsTaxHTField0 xmlns="4873beb7-5857-4685-be1f-d57550cc96cc">
+      <Terms xmlns="http://schemas.microsoft.com/office/infopath/2007/PartnerControls"/>
+    </CampaignTagsTaxHTField0>
+    <TPNamespace xmlns="4873beb7-5857-4685-be1f-d57550cc96cc" xsi:nil="true"/>
+    <LocOverallPreviewStatusLookup xmlns="4873beb7-5857-4685-be1f-d57550cc96cc" xsi:nil="true"/>
+    <TaxCatchAll xmlns="4873beb7-5857-4685-be1f-d57550cc96cc"/>
+    <IsSearchable xmlns="4873beb7-5857-4685-be1f-d57550cc96cc">false</IsSearchable>
+    <TemplateTemplateType xmlns="4873beb7-5857-4685-be1f-d57550cc96cc">Word Document Template</TemplateTemplateType>
+    <Markets xmlns="4873beb7-5857-4685-be1f-d57550cc96cc"/>
+    <IntlLangReview xmlns="4873beb7-5857-4685-be1f-d57550cc96cc" xsi:nil="true"/>
+    <UAProjectedTotalWords xmlns="4873beb7-5857-4685-be1f-d57550cc96cc" xsi:nil="true"/>
+    <OutputCachingOn xmlns="4873beb7-5857-4685-be1f-d57550cc96cc">false</OutputCachingOn>
+    <AverageRating xmlns="4873beb7-5857-4685-be1f-d57550cc96cc" xsi:nil="true"/>
+    <LocMarketGroupTiers2 xmlns="4873beb7-5857-4685-be1f-d57550cc96cc" xsi:nil="true"/>
+    <APAuthor xmlns="4873beb7-5857-4685-be1f-d57550cc96cc">
+      <UserInfo>
+        <DisplayName>REDMOND\v-namall</DisplayName>
+        <AccountId>978</AccountId>
+        <AccountType/>
+      </UserInfo>
+    </APAuthor>
+    <TPCommandLine xmlns="4873beb7-5857-4685-be1f-d57550cc96cc" xsi:nil="true"/>
+    <LocManualTestRequired xmlns="4873beb7-5857-4685-be1f-d57550cc96cc">false</LocManualTestRequired>
+    <TPAppVersion xmlns="4873beb7-5857-4685-be1f-d57550cc96cc" xsi:nil="true"/>
+    <EditorialStatus xmlns="4873beb7-5857-4685-be1f-d57550cc96cc">Complete</EditorialStatus>
+    <LocProcessedForMarketsLookup xmlns="4873beb7-5857-4685-be1f-d57550cc96cc" xsi:nil="true"/>
+    <LastModifiedDateTime xmlns="4873beb7-5857-4685-be1f-d57550cc96cc" xsi:nil="true"/>
+    <TPLaunchHelpLinkType xmlns="4873beb7-5857-4685-be1f-d57550cc96cc">Template</TPLaunchHelpLinkType>
+    <ScenarioTagsTaxHTField0 xmlns="4873beb7-5857-4685-be1f-d57550cc96cc">
+      <Terms xmlns="http://schemas.microsoft.com/office/infopath/2007/PartnerControls"/>
+    </ScenarioTagsTaxHTField0>
+    <OriginalRelease xmlns="4873beb7-5857-4685-be1f-d57550cc96cc">14</OriginalRelease>
+    <LocalizationTagsTaxHTField0 xmlns="4873beb7-5857-4685-be1f-d57550cc96cc">
+      <Terms xmlns="http://schemas.microsoft.com/office/infopath/2007/PartnerControls"/>
+    </LocalizationTagsTaxHTField0>
+    <Manager xmlns="4873beb7-5857-4685-be1f-d57550cc96cc" xsi:nil="true"/>
+    <UALocRecommendation xmlns="4873beb7-5857-4685-be1f-d57550cc96cc">Localize</UALocRecommendation>
+    <LocOverallHandbackStatusLookup xmlns="4873beb7-5857-4685-be1f-d57550cc96cc" xsi:nil="true"/>
+    <ArtSampleDocs xmlns="4873beb7-5857-4685-be1f-d57550cc96cc" xsi:nil="true"/>
+    <UACurrentWords xmlns="4873beb7-5857-4685-be1f-d57550cc96cc" xsi:nil="true"/>
+    <ShowIn xmlns="4873beb7-5857-4685-be1f-d57550cc96cc">Show everywhere</ShowIn>
+    <CSXHash xmlns="4873beb7-5857-4685-be1f-d57550cc96cc" xsi:nil="true"/>
+    <VoteCount xmlns="4873beb7-5857-4685-be1f-d57550cc96cc" xsi:nil="true"/>
+    <InternalTagsTaxHTField0 xmlns="4873beb7-5857-4685-be1f-d57550cc96cc">
+      <Terms xmlns="http://schemas.microsoft.com/office/infopath/2007/PartnerControls"/>
+    </InternalTagsTaxHTField0>
+    <UANotes xmlns="4873beb7-5857-4685-be1f-d57550cc96cc" xsi:nil="true"/>
+  </documentManagement>
+</p:properties>
 </file>
 
 <file path=customXml/itemProps1.xml><?xml version="1.0" encoding="utf-8"?>
-<ds:datastoreItem xmlns:ds="http://schemas.openxmlformats.org/officeDocument/2006/customXml" ds:itemID="{7FBDB1CC-CEFB-4E46-8174-1F0AA0D30B24}">
+<ds:datastoreItem xmlns:ds="http://schemas.openxmlformats.org/officeDocument/2006/customXml" ds:itemID="{C01C3C56-10DB-49F7-B061-44D8728D078A}">
   <ds:schemaRefs>
-    <ds:schemaRef ds:uri="http://schemas.microsoft.com/office/2006/metadata/properties"/>
-    <ds:schemaRef ds:uri="http://schemas.microsoft.com/office/infopath/2007/PartnerControls"/>
-    <ds:schemaRef ds:uri="4873beb7-5857-4685-be1f-d57550cc96cc"/>
+    <ds:schemaRef ds:uri="http://schemas.microsoft.com/sharepoint/v3/contenttype/forms"/>
   </ds:schemaRefs>
 </ds:datastoreItem>
 </file>
@@ -5517,9 +7685,11 @@
 </file>
 
 <file path=customXml/itemProps3.xml><?xml version="1.0" encoding="utf-8"?>
-<ds:datastoreItem xmlns:ds="http://schemas.openxmlformats.org/officeDocument/2006/customXml" ds:itemID="{C01C3C56-10DB-49F7-B061-44D8728D078A}">
+<ds:datastoreItem xmlns:ds="http://schemas.openxmlformats.org/officeDocument/2006/customXml" ds:itemID="{7FBDB1CC-CEFB-4E46-8174-1F0AA0D30B24}">
   <ds:schemaRefs>
-    <ds:schemaRef ds:uri="http://schemas.microsoft.com/sharepoint/v3/contenttype/forms"/>
+    <ds:schemaRef ds:uri="http://schemas.microsoft.com/office/2006/metadata/properties"/>
+    <ds:schemaRef ds:uri="http://schemas.microsoft.com/office/infopath/2007/PartnerControls"/>
+    <ds:schemaRef ds:uri="4873beb7-5857-4685-be1f-d57550cc96cc"/>
   </ds:schemaRefs>
 </ds:datastoreItem>
 </file>
</xml_diff>

<commit_message>
Added the Api routing logic and the express architecture
</commit_message>
<xml_diff>
--- a/Design_Doc.docx
+++ b/Design_Doc.docx
@@ -151,38 +151,32 @@
           <w:szCs w:val="40"/>
           <w:lang w:val="en-CA"/>
         </w:rPr>
-        <w:t>Xx, 00, 2026</w:t>
-      </w:r>
-    </w:p>
-    <w:p>
-      <w:pPr>
-        <w:jc w:val="center"/>
+        <w:t>June</w:t>
+      </w:r>
+      <w:r>
         <w:rPr>
           <w:sz w:val="40"/>
           <w:szCs w:val="40"/>
           <w:lang w:val="en-CA"/>
         </w:rPr>
-      </w:pPr>
-    </w:p>
-    <w:p>
-      <w:pPr>
-        <w:jc w:val="center"/>
+        <w:t xml:space="preserve">, </w:t>
+      </w:r>
+      <w:r>
         <w:rPr>
           <w:sz w:val="40"/>
           <w:szCs w:val="40"/>
           <w:lang w:val="en-CA"/>
         </w:rPr>
-      </w:pPr>
-    </w:p>
-    <w:p>
-      <w:pPr>
-        <w:jc w:val="center"/>
+        <w:t>10</w:t>
+      </w:r>
+      <w:r>
         <w:rPr>
           <w:sz w:val="40"/>
           <w:szCs w:val="40"/>
           <w:lang w:val="en-CA"/>
         </w:rPr>
-      </w:pPr>
+        <w:t>, 2026</w:t>
+      </w:r>
     </w:p>
     <w:p>
       <w:pPr>
@@ -298,7 +292,28 @@
       <w:pPr>
         <w:jc w:val="center"/>
         <w:rPr>
-          <w:u w:val="single"/>
+          <w:sz w:val="40"/>
+          <w:szCs w:val="40"/>
+          <w:lang w:val="en-CA"/>
+        </w:rPr>
+      </w:pPr>
+    </w:p>
+    <w:p>
+      <w:pPr>
+        <w:jc w:val="center"/>
+        <w:rPr>
+          <w:sz w:val="40"/>
+          <w:szCs w:val="40"/>
+          <w:lang w:val="en-CA"/>
+        </w:rPr>
+      </w:pPr>
+    </w:p>
+    <w:p>
+      <w:pPr>
+        <w:rPr>
+          <w:sz w:val="40"/>
+          <w:szCs w:val="40"/>
+          <w:lang w:val="en-CA"/>
         </w:rPr>
       </w:pPr>
     </w:p>
@@ -320,6 +335,7 @@
           <w:szCs w:val="32"/>
           <w:u w:val="single"/>
         </w:rPr>
+        <w:lastRenderedPageBreak/>
         <w:t>Student 1</w:t>
       </w:r>
       <w:r>
@@ -561,6 +577,7 @@
           <w:i/>
           <w:iCs/>
         </w:rPr>
+        <w:lastRenderedPageBreak/>
         <w:t>Table 4-</w:t>
       </w:r>
     </w:p>
@@ -861,7 +878,9 @@
           <w:u w:val="single"/>
         </w:rPr>
       </w:pPr>
-      <w:r>
+    </w:p>
+    <w:p>
+      <w:pPr>
         <w:rPr>
           <w:b/>
           <w:bCs/>
@@ -869,8 +888,7 @@
           <w:szCs w:val="32"/>
           <w:u w:val="single"/>
         </w:rPr>
-        <w:t xml:space="preserve">Student </w:t>
-      </w:r>
+      </w:pPr>
       <w:r>
         <w:rPr>
           <w:b/>
@@ -879,11 +897,9 @@
           <w:szCs w:val="32"/>
           <w:u w:val="single"/>
         </w:rPr>
-        <w:t>2 (Gurkirat)</w:t>
-      </w:r>
-    </w:p>
-    <w:p>
-      <w:pPr>
+        <w:t xml:space="preserve">Student </w:t>
+      </w:r>
+      <w:r>
         <w:rPr>
           <w:b/>
           <w:bCs/>
@@ -891,8 +907,1310 @@
           <w:szCs w:val="32"/>
           <w:u w:val="single"/>
         </w:rPr>
-      </w:pPr>
-    </w:p>
+        <w:t>2 (Gurkirat)</w:t>
+      </w:r>
+    </w:p>
+    <w:p>
+      <w:pPr>
+        <w:rPr>
+          <w:lang w:val="en-CA"/>
+        </w:rPr>
+      </w:pPr>
+    </w:p>
+    <w:p>
+      <w:pPr>
+        <w:rPr>
+          <w:b/>
+          <w:bCs/>
+          <w:sz w:val="28"/>
+          <w:szCs w:val="28"/>
+          <w:u w:val="single"/>
+          <w:lang w:val="en-CA"/>
+        </w:rPr>
+      </w:pPr>
+      <w:r>
+        <w:rPr>
+          <w:b/>
+          <w:bCs/>
+          <w:sz w:val="28"/>
+          <w:szCs w:val="28"/>
+          <w:u w:val="single"/>
+          <w:lang w:val="en-CA"/>
+        </w:rPr>
+        <w:t xml:space="preserve">API ROUTING: </w:t>
+      </w:r>
+    </w:p>
+    <w:p>
+      <w:pPr>
+        <w:rPr>
+          <w:lang w:val="en-CA"/>
+        </w:rPr>
+      </w:pPr>
+      <w:r>
+        <w:rPr>
+          <w:lang w:val="en-CA"/>
+        </w:rPr>
+        <w:t>For this application we have the backend setup in express through several API calls to access endpoints. For all the pages that need to pull some information or add some information into the database we have API calls that keep the communication between the frontend and the backend secure. These are all the API calls that we have decided upon till now for these pages respectively:</w:t>
+      </w:r>
+    </w:p>
+    <w:p>
+      <w:pPr>
+        <w:rPr>
+          <w:lang w:val="en-CA"/>
+        </w:rPr>
+      </w:pPr>
+    </w:p>
+    <w:p>
+      <w:pPr>
+        <w:rPr>
+          <w:u w:val="single"/>
+          <w:lang w:val="en-CA"/>
+        </w:rPr>
+      </w:pPr>
+      <w:r>
+        <w:rPr>
+          <w:u w:val="single"/>
+          <w:lang w:val="en-CA"/>
+        </w:rPr>
+        <w:t>Home Page</w:t>
+      </w:r>
+    </w:p>
+    <w:p>
+      <w:pPr>
+        <w:rPr>
+          <w:lang w:val="en-CA"/>
+        </w:rPr>
+      </w:pPr>
+      <w:r>
+        <w:rPr>
+          <w:lang w:val="en-CA"/>
+        </w:rPr>
+        <w:t>A very brief explanation of what the game is about and what are the biggest highlights of it along with a carousel of some items the user can get and use in the game just for preview.</w:t>
+      </w:r>
+    </w:p>
+    <w:p>
+      <w:pPr>
+        <w:rPr>
+          <w:lang w:val="en-CA"/>
+        </w:rPr>
+      </w:pPr>
+      <w:r>
+        <w:rPr>
+          <w:lang w:val="en-CA"/>
+        </w:rPr>
+        <w:t>GET /api/home :- To show a carousel of different weapons and armors users can access when logged in the game.</w:t>
+      </w:r>
+    </w:p>
+    <w:p>
+      <w:pPr>
+        <w:rPr>
+          <w:lang w:val="en-CA"/>
+        </w:rPr>
+      </w:pPr>
+    </w:p>
+    <w:p>
+      <w:pPr>
+        <w:rPr>
+          <w:u w:val="single"/>
+          <w:lang w:val="en-CA"/>
+        </w:rPr>
+      </w:pPr>
+      <w:r>
+        <w:rPr>
+          <w:u w:val="single"/>
+          <w:lang w:val="en-CA"/>
+        </w:rPr>
+        <w:t>Login Page</w:t>
+      </w:r>
+    </w:p>
+    <w:p>
+      <w:pPr>
+        <w:rPr>
+          <w:lang w:val="en-CA"/>
+        </w:rPr>
+      </w:pPr>
+      <w:r>
+        <w:rPr>
+          <w:lang w:val="en-CA"/>
+        </w:rPr>
+        <w:t xml:space="preserve">Page for the users to provide their information and login onto their account in the game. </w:t>
+      </w:r>
+    </w:p>
+    <w:p>
+      <w:pPr>
+        <w:rPr>
+          <w:lang w:val="en-CA"/>
+        </w:rPr>
+      </w:pPr>
+      <w:r>
+        <w:rPr>
+          <w:lang w:val="en-CA"/>
+        </w:rPr>
+        <w:t>POST /api/auth/login :- To get the details user provide during login so that they can be verified for the user to log-in securely.</w:t>
+      </w:r>
+    </w:p>
+    <w:p>
+      <w:pPr>
+        <w:rPr>
+          <w:lang w:val="en-CA"/>
+        </w:rPr>
+      </w:pPr>
+    </w:p>
+    <w:p>
+      <w:pPr>
+        <w:rPr>
+          <w:u w:val="single"/>
+          <w:lang w:val="en-CA"/>
+        </w:rPr>
+      </w:pPr>
+      <w:r>
+        <w:rPr>
+          <w:u w:val="single"/>
+          <w:lang w:val="en-CA"/>
+        </w:rPr>
+        <w:t>Register Page</w:t>
+      </w:r>
+    </w:p>
+    <w:p>
+      <w:pPr>
+        <w:rPr>
+          <w:lang w:val="en-CA"/>
+        </w:rPr>
+      </w:pPr>
+      <w:r>
+        <w:rPr>
+          <w:lang w:val="en-CA"/>
+        </w:rPr>
+        <w:t>Page for the users to provide all their information and make an account in the game.</w:t>
+      </w:r>
+    </w:p>
+    <w:p>
+      <w:pPr>
+        <w:rPr>
+          <w:lang w:val="en-CA"/>
+        </w:rPr>
+      </w:pPr>
+      <w:r>
+        <w:rPr>
+          <w:lang w:val="en-CA"/>
+        </w:rPr>
+        <w:t>POST /api/auth/register :- To get the details user provide to add in the users table and successfully register the user.</w:t>
+      </w:r>
+    </w:p>
+    <w:p>
+      <w:pPr>
+        <w:rPr>
+          <w:lang w:val="en-CA"/>
+        </w:rPr>
+      </w:pPr>
+    </w:p>
+    <w:p>
+      <w:pPr>
+        <w:rPr>
+          <w:u w:val="single"/>
+          <w:lang w:val="en-CA"/>
+        </w:rPr>
+      </w:pPr>
+      <w:r>
+        <w:rPr>
+          <w:u w:val="single"/>
+          <w:lang w:val="en-CA"/>
+        </w:rPr>
+        <w:t>View Fighters</w:t>
+      </w:r>
+    </w:p>
+    <w:p>
+      <w:pPr>
+        <w:rPr>
+          <w:lang w:val="en-CA"/>
+        </w:rPr>
+      </w:pPr>
+      <w:r>
+        <w:rPr>
+          <w:lang w:val="en-CA"/>
+        </w:rPr>
+        <w:t>This page will be a display page where users can see their fighters and all their individual information.</w:t>
+      </w:r>
+    </w:p>
+    <w:p>
+      <w:pPr>
+        <w:rPr>
+          <w:lang w:val="en-CA"/>
+        </w:rPr>
+      </w:pPr>
+      <w:r>
+        <w:rPr>
+          <w:lang w:val="en-CA"/>
+        </w:rPr>
+        <w:lastRenderedPageBreak/>
+        <w:t>GET /api/users/:userId/fighters :- Will be used to get the information of all the fighters user have got after logging in.</w:t>
+      </w:r>
+    </w:p>
+    <w:p>
+      <w:pPr>
+        <w:rPr>
+          <w:lang w:val="en-CA"/>
+        </w:rPr>
+      </w:pPr>
+    </w:p>
+    <w:p>
+      <w:pPr>
+        <w:rPr>
+          <w:u w:val="single"/>
+          <w:lang w:val="en-CA"/>
+        </w:rPr>
+      </w:pPr>
+      <w:r>
+        <w:rPr>
+          <w:u w:val="single"/>
+          <w:lang w:val="en-CA"/>
+        </w:rPr>
+        <w:t>Add Fighters</w:t>
+      </w:r>
+    </w:p>
+    <w:p>
+      <w:pPr>
+        <w:rPr>
+          <w:lang w:val="en-CA"/>
+        </w:rPr>
+      </w:pPr>
+      <w:r>
+        <w:rPr>
+          <w:lang w:val="en-CA"/>
+        </w:rPr>
+        <w:t>This page will have a form which the user can fill and submit to add a new fighter to their list.</w:t>
+      </w:r>
+    </w:p>
+    <w:p>
+      <w:pPr>
+        <w:rPr>
+          <w:lang w:val="en-CA"/>
+        </w:rPr>
+      </w:pPr>
+      <w:r>
+        <w:rPr>
+          <w:lang w:val="en-CA"/>
+        </w:rPr>
+        <w:t>POST /api/users/:userId/fighters :- Will be used to get the details user provide and add them successfully to the fighters table for the specific user.</w:t>
+      </w:r>
+    </w:p>
+    <w:p>
+      <w:pPr>
+        <w:rPr>
+          <w:lang w:val="en-CA"/>
+        </w:rPr>
+      </w:pPr>
+    </w:p>
+    <w:p>
+      <w:pPr>
+        <w:rPr>
+          <w:u w:val="single"/>
+          <w:lang w:val="en-CA"/>
+        </w:rPr>
+      </w:pPr>
+      <w:r>
+        <w:rPr>
+          <w:u w:val="single"/>
+          <w:lang w:val="en-CA"/>
+        </w:rPr>
+        <w:t>Edit Fighters</w:t>
+      </w:r>
+    </w:p>
+    <w:p>
+      <w:pPr>
+        <w:rPr>
+          <w:lang w:val="en-CA"/>
+        </w:rPr>
+      </w:pPr>
+      <w:r>
+        <w:rPr>
+          <w:lang w:val="en-CA"/>
+        </w:rPr>
+        <w:t>This page will give the user an option to edit the information of any of their fighters and will also give them an option to delete the fighter completely.</w:t>
+      </w:r>
+    </w:p>
+    <w:p>
+      <w:pPr>
+        <w:rPr>
+          <w:lang w:val="en-CA"/>
+        </w:rPr>
+      </w:pPr>
+      <w:r>
+        <w:rPr>
+          <w:lang w:val="en-CA"/>
+        </w:rPr>
+        <w:t>PUT  /api/users/:userId/fighters/:fighterId :- Will be used to update the changes that the user want to make in the database as well without the user having to create a new user.</w:t>
+      </w:r>
+    </w:p>
+    <w:p>
+      <w:pPr>
+        <w:rPr>
+          <w:lang w:val="en-CA"/>
+        </w:rPr>
+      </w:pPr>
+      <w:r>
+        <w:rPr>
+          <w:lang w:val="en-CA"/>
+        </w:rPr>
+        <w:t>DELETE /api/users/:userId/fighters/:fighterId :- Will be used to remove the chosen fighter for the user</w:t>
+      </w:r>
+    </w:p>
+    <w:p>
+      <w:pPr>
+        <w:rPr>
+          <w:lang w:val="en-CA"/>
+        </w:rPr>
+      </w:pPr>
+      <w:r>
+        <w:rPr>
+          <w:lang w:val="en-CA"/>
+        </w:rPr>
+        <w:br/>
+      </w:r>
+    </w:p>
+    <w:p>
+      <w:pPr>
+        <w:rPr>
+          <w:u w:val="single"/>
+          <w:lang w:val="en-CA"/>
+        </w:rPr>
+      </w:pPr>
+      <w:r>
+        <w:rPr>
+          <w:u w:val="single"/>
+          <w:lang w:val="en-CA"/>
+        </w:rPr>
+        <w:t>Arena</w:t>
+      </w:r>
+    </w:p>
+    <w:p>
+      <w:pPr>
+        <w:rPr>
+          <w:lang w:val="en-CA"/>
+        </w:rPr>
+      </w:pPr>
+      <w:r>
+        <w:rPr>
+          <w:lang w:val="en-CA"/>
+        </w:rPr>
+        <w:t>This will be the page where the user can play the battle simulations against a computer opponent.    </w:t>
+      </w:r>
+    </w:p>
+    <w:p>
+      <w:pPr>
+        <w:rPr>
+          <w:lang w:val="en-CA"/>
+        </w:rPr>
+      </w:pPr>
+      <w:r>
+        <w:rPr>
+          <w:lang w:val="en-CA"/>
+        </w:rPr>
+        <w:t>GET  /api/users/:userId/fighters</w:t>
+      </w:r>
+      <w:r>
+        <w:rPr>
+          <w:lang w:val="en-CA"/>
+        </w:rPr>
+        <w:t xml:space="preserve"> </w:t>
+      </w:r>
+      <w:r>
+        <w:rPr>
+          <w:lang w:val="en-CA"/>
+        </w:rPr>
+        <w:t>:</w:t>
+      </w:r>
+      <w:r>
+        <w:rPr>
+          <w:lang w:val="en-CA"/>
+        </w:rPr>
+        <w:t>-</w:t>
+      </w:r>
+      <w:r>
+        <w:rPr>
+          <w:lang w:val="en-CA"/>
+        </w:rPr>
+        <w:t xml:space="preserve"> Will be used to get the information of the fighters that the user chooses for the battle.</w:t>
+      </w:r>
+    </w:p>
+    <w:p>
+      <w:pPr>
+        <w:rPr>
+          <w:lang w:val="en-CA"/>
+        </w:rPr>
+      </w:pPr>
+      <w:r>
+        <w:rPr>
+          <w:lang w:val="en-CA"/>
+        </w:rPr>
+        <w:t>POST /api/battle</w:t>
+      </w:r>
+      <w:r>
+        <w:rPr>
+          <w:lang w:val="en-CA"/>
+        </w:rPr>
+        <w:t xml:space="preserve"> </w:t>
+      </w:r>
+      <w:r>
+        <w:rPr>
+          <w:lang w:val="en-CA"/>
+        </w:rPr>
+        <w:t>:</w:t>
+      </w:r>
+      <w:r>
+        <w:rPr>
+          <w:lang w:val="en-CA"/>
+        </w:rPr>
+        <w:t>-</w:t>
+      </w:r>
+      <w:r>
+        <w:rPr>
+          <w:lang w:val="en-CA"/>
+        </w:rPr>
+        <w:t xml:space="preserve"> Will be used to send the data forward so that it can be evaluated/compared alongside the logically selected computer fighters.</w:t>
+      </w:r>
+    </w:p>
+    <w:p>
+      <w:pPr>
+        <w:rPr>
+          <w:lang w:val="en-CA"/>
+        </w:rPr>
+      </w:pPr>
+    </w:p>
+    <w:p>
+      <w:pPr>
+        <w:rPr>
+          <w:u w:val="single"/>
+          <w:lang w:val="en-CA"/>
+        </w:rPr>
+      </w:pPr>
+      <w:r>
+        <w:rPr>
+          <w:u w:val="single"/>
+          <w:lang w:val="en-CA"/>
+        </w:rPr>
+        <w:t>Armoury</w:t>
+      </w:r>
+    </w:p>
+    <w:p>
+      <w:pPr>
+        <w:rPr>
+          <w:lang w:val="en-CA"/>
+        </w:rPr>
+      </w:pPr>
+      <w:r>
+        <w:rPr>
+          <w:lang w:val="en-CA"/>
+        </w:rPr>
+        <w:t>This page will be a marketplace for the user to buy different weapons and armors from the universal list and add it to their own inventory of weapons and armors.</w:t>
+      </w:r>
+    </w:p>
+    <w:p>
+      <w:pPr>
+        <w:rPr>
+          <w:lang w:val="en-CA"/>
+        </w:rPr>
+      </w:pPr>
+      <w:r>
+        <w:rPr>
+          <w:lang w:val="en-CA"/>
+        </w:rPr>
+        <w:t>GET /api/weapons</w:t>
+      </w:r>
+      <w:r>
+        <w:rPr>
+          <w:lang w:val="en-CA"/>
+        </w:rPr>
+        <w:t xml:space="preserve"> </w:t>
+      </w:r>
+      <w:r>
+        <w:rPr>
+          <w:lang w:val="en-CA"/>
+        </w:rPr>
+        <w:t>:</w:t>
+      </w:r>
+      <w:r>
+        <w:rPr>
+          <w:lang w:val="en-CA"/>
+        </w:rPr>
+        <w:t>-</w:t>
+      </w:r>
+      <w:r>
+        <w:rPr>
+          <w:lang w:val="en-CA"/>
+        </w:rPr>
+        <w:t xml:space="preserve"> To get the details of all the weapons user can get.</w:t>
+      </w:r>
+    </w:p>
+    <w:p>
+      <w:pPr>
+        <w:rPr>
+          <w:lang w:val="en-CA"/>
+        </w:rPr>
+      </w:pPr>
+      <w:r>
+        <w:rPr>
+          <w:lang w:val="en-CA"/>
+        </w:rPr>
+        <w:t>GET /api/armors</w:t>
+      </w:r>
+      <w:r>
+        <w:rPr>
+          <w:lang w:val="en-CA"/>
+        </w:rPr>
+        <w:t xml:space="preserve"> </w:t>
+      </w:r>
+      <w:r>
+        <w:rPr>
+          <w:lang w:val="en-CA"/>
+        </w:rPr>
+        <w:t>:</w:t>
+      </w:r>
+      <w:r>
+        <w:rPr>
+          <w:lang w:val="en-CA"/>
+        </w:rPr>
+        <w:t>-</w:t>
+      </w:r>
+      <w:r>
+        <w:rPr>
+          <w:lang w:val="en-CA"/>
+        </w:rPr>
+        <w:t xml:space="preserve"> To get the details of all the armors user can get.</w:t>
+      </w:r>
+    </w:p>
+    <w:p>
+      <w:pPr>
+        <w:rPr>
+          <w:lang w:val="en-CA"/>
+        </w:rPr>
+      </w:pPr>
+      <w:r>
+        <w:rPr>
+          <w:lang w:val="en-CA"/>
+        </w:rPr>
+        <w:t>POST /api/users/:userId/inventory/weapons</w:t>
+      </w:r>
+      <w:r>
+        <w:rPr>
+          <w:lang w:val="en-CA"/>
+        </w:rPr>
+        <w:t xml:space="preserve"> </w:t>
+      </w:r>
+      <w:r>
+        <w:rPr>
+          <w:lang w:val="en-CA"/>
+        </w:rPr>
+        <w:t>:</w:t>
+      </w:r>
+      <w:r>
+        <w:rPr>
+          <w:lang w:val="en-CA"/>
+        </w:rPr>
+        <w:t>-</w:t>
+      </w:r>
+      <w:r>
+        <w:rPr>
+          <w:lang w:val="en-CA"/>
+        </w:rPr>
+        <w:t xml:space="preserve"> To add the weapon user selected into the list for their specific userId by adding the data into the weapons table.</w:t>
+      </w:r>
+    </w:p>
+    <w:p>
+      <w:pPr>
+        <w:rPr>
+          <w:lang w:val="en-CA"/>
+        </w:rPr>
+      </w:pPr>
+      <w:r>
+        <w:rPr>
+          <w:lang w:val="en-CA"/>
+        </w:rPr>
+        <w:t>POST /api/users/:userId/inventory/armors</w:t>
+      </w:r>
+      <w:r>
+        <w:rPr>
+          <w:lang w:val="en-CA"/>
+        </w:rPr>
+        <w:t xml:space="preserve"> </w:t>
+      </w:r>
+      <w:r>
+        <w:rPr>
+          <w:lang w:val="en-CA"/>
+        </w:rPr>
+        <w:t>:</w:t>
+      </w:r>
+      <w:r>
+        <w:rPr>
+          <w:lang w:val="en-CA"/>
+        </w:rPr>
+        <w:t>-</w:t>
+      </w:r>
+      <w:r>
+        <w:rPr>
+          <w:lang w:val="en-CA"/>
+        </w:rPr>
+        <w:t xml:space="preserve"> To add the armor user selected into the list for their specific userId by adding the data into the Armors table.</w:t>
+      </w:r>
+    </w:p>
+    <w:p>
+      <w:pPr>
+        <w:rPr>
+          <w:lang w:val="en-CA"/>
+        </w:rPr>
+      </w:pPr>
+    </w:p>
+    <w:p>
+      <w:pPr>
+        <w:rPr>
+          <w:u w:val="single"/>
+          <w:lang w:val="en-CA"/>
+        </w:rPr>
+      </w:pPr>
+      <w:r>
+        <w:rPr>
+          <w:u w:val="single"/>
+          <w:lang w:val="en-CA"/>
+        </w:rPr>
+        <w:t>User Settings</w:t>
+      </w:r>
+    </w:p>
+    <w:p>
+      <w:pPr>
+        <w:rPr>
+          <w:lang w:val="en-CA"/>
+        </w:rPr>
+      </w:pPr>
+      <w:r>
+        <w:rPr>
+          <w:lang w:val="en-CA"/>
+        </w:rPr>
+        <w:t>This page will be used by the user to update any personal information that they want. Currently we are only having an API for changing just the password as we are still deciding on what information can the user edit.</w:t>
+      </w:r>
+    </w:p>
+    <w:p>
+      <w:pPr>
+        <w:rPr>
+          <w:lang w:val="en-CA"/>
+        </w:rPr>
+      </w:pPr>
+      <w:r>
+        <w:rPr>
+          <w:lang w:val="en-CA"/>
+        </w:rPr>
+        <w:t>GET   /api/users/:userId</w:t>
+      </w:r>
+      <w:r>
+        <w:rPr>
+          <w:lang w:val="en-CA"/>
+        </w:rPr>
+        <w:t xml:space="preserve"> </w:t>
+      </w:r>
+      <w:r>
+        <w:rPr>
+          <w:lang w:val="en-CA"/>
+        </w:rPr>
+        <w:t>:</w:t>
+      </w:r>
+      <w:r>
+        <w:rPr>
+          <w:lang w:val="en-CA"/>
+        </w:rPr>
+        <w:t>-</w:t>
+      </w:r>
+      <w:r>
+        <w:rPr>
+          <w:lang w:val="en-CA"/>
+        </w:rPr>
+        <w:t xml:space="preserve"> To get the personal information of the user so that they can update something if needed. </w:t>
+      </w:r>
+    </w:p>
+    <w:p>
+      <w:pPr>
+        <w:rPr>
+          <w:lang w:val="en-CA"/>
+        </w:rPr>
+      </w:pPr>
+      <w:r>
+        <w:rPr>
+          <w:lang w:val="en-CA"/>
+        </w:rPr>
+        <w:t>PATCH /api/users/:userId/password :</w:t>
+      </w:r>
+      <w:r>
+        <w:rPr>
+          <w:lang w:val="en-CA"/>
+        </w:rPr>
+        <w:t>-</w:t>
+      </w:r>
+      <w:r>
+        <w:rPr>
+          <w:lang w:val="en-CA"/>
+        </w:rPr>
+        <w:t xml:space="preserve"> To change just the password as we have a separate option just for it. </w:t>
+      </w:r>
+    </w:p>
+    <w:p>
+      <w:pPr>
+        <w:rPr>
+          <w:lang w:val="en-CA"/>
+        </w:rPr>
+      </w:pPr>
+    </w:p>
+    <w:p>
+      <w:pPr>
+        <w:rPr>
+          <w:lang w:val="en-CA"/>
+        </w:rPr>
+      </w:pPr>
+    </w:p>
+    <w:p>
+      <w:pPr>
+        <w:rPr>
+          <w:b/>
+          <w:bCs/>
+          <w:sz w:val="28"/>
+          <w:szCs w:val="28"/>
+          <w:u w:val="single"/>
+          <w:lang w:val="en-CA"/>
+        </w:rPr>
+      </w:pPr>
+    </w:p>
+    <w:p>
+      <w:pPr>
+        <w:rPr>
+          <w:b/>
+          <w:bCs/>
+          <w:sz w:val="28"/>
+          <w:szCs w:val="28"/>
+          <w:u w:val="single"/>
+          <w:lang w:val="en-CA"/>
+        </w:rPr>
+      </w:pPr>
+    </w:p>
+    <w:p>
+      <w:pPr>
+        <w:rPr>
+          <w:b/>
+          <w:bCs/>
+          <w:sz w:val="28"/>
+          <w:szCs w:val="28"/>
+          <w:u w:val="single"/>
+          <w:lang w:val="en-CA"/>
+        </w:rPr>
+      </w:pPr>
+    </w:p>
+    <w:p>
+      <w:pPr>
+        <w:rPr>
+          <w:b/>
+          <w:bCs/>
+          <w:sz w:val="28"/>
+          <w:szCs w:val="28"/>
+          <w:u w:val="single"/>
+          <w:lang w:val="en-CA"/>
+        </w:rPr>
+      </w:pPr>
+    </w:p>
+    <w:p>
+      <w:pPr>
+        <w:rPr>
+          <w:b/>
+          <w:bCs/>
+          <w:sz w:val="28"/>
+          <w:szCs w:val="28"/>
+          <w:u w:val="single"/>
+          <w:lang w:val="en-CA"/>
+        </w:rPr>
+      </w:pPr>
+      <w:r>
+        <w:rPr>
+          <w:b/>
+          <w:bCs/>
+          <w:sz w:val="28"/>
+          <w:szCs w:val="28"/>
+          <w:u w:val="single"/>
+          <w:lang w:val="en-CA"/>
+        </w:rPr>
+        <w:lastRenderedPageBreak/>
+        <w:t>Express Architecture/Folder Structure</w:t>
+      </w:r>
+    </w:p>
+    <w:p>
+      <w:pPr>
+        <w:rPr>
+          <w:lang w:val="en-CA"/>
+        </w:rPr>
+      </w:pPr>
+      <w:r>
+        <w:rPr>
+          <w:lang w:val="en-CA"/>
+        </w:rPr>
+        <w:t>  src/</w:t>
+      </w:r>
+    </w:p>
+    <w:p>
+      <w:pPr>
+        <w:rPr>
+          <w:lang w:val="en-CA"/>
+        </w:rPr>
+      </w:pPr>
+      <w:r>
+        <w:rPr>
+          <w:lang w:val="en-CA"/>
+        </w:rPr>
+        <w:t>    routes/</w:t>
+      </w:r>
+    </w:p>
+    <w:p>
+      <w:pPr>
+        <w:rPr>
+          <w:lang w:val="en-CA"/>
+        </w:rPr>
+      </w:pPr>
+      <w:r>
+        <w:rPr>
+          <w:lang w:val="en-CA"/>
+        </w:rPr>
+        <w:t>      home.ts/</w:t>
+      </w:r>
+    </w:p>
+    <w:p>
+      <w:pPr>
+        <w:rPr>
+          <w:lang w:val="en-CA"/>
+        </w:rPr>
+      </w:pPr>
+      <w:r>
+        <w:rPr>
+          <w:lang w:val="en-CA"/>
+        </w:rPr>
+        <w:t xml:space="preserve">    </w:t>
+      </w:r>
+      <w:r>
+        <w:rPr>
+          <w:lang w:val="en-CA"/>
+        </w:rPr>
+        <w:tab/>
+      </w:r>
+      <w:r>
+        <w:rPr>
+          <w:lang w:val="en-CA"/>
+        </w:rPr>
+        <w:t>GET  /api/home</w:t>
+      </w:r>
+    </w:p>
+    <w:p>
+      <w:pPr>
+        <w:rPr>
+          <w:lang w:val="en-CA"/>
+        </w:rPr>
+      </w:pPr>
+      <w:r>
+        <w:rPr>
+          <w:lang w:val="en-CA"/>
+        </w:rPr>
+        <w:t>      auth.ts/</w:t>
+      </w:r>
+    </w:p>
+    <w:p>
+      <w:pPr>
+        <w:rPr>
+          <w:lang w:val="en-CA"/>
+        </w:rPr>
+      </w:pPr>
+      <w:r>
+        <w:rPr>
+          <w:lang w:val="en-CA"/>
+        </w:rPr>
+        <w:t xml:space="preserve">    </w:t>
+      </w:r>
+      <w:r>
+        <w:rPr>
+          <w:lang w:val="en-CA"/>
+        </w:rPr>
+        <w:tab/>
+      </w:r>
+      <w:r>
+        <w:rPr>
+          <w:lang w:val="en-CA"/>
+        </w:rPr>
+        <w:t>POST /api/auth/login</w:t>
+      </w:r>
+    </w:p>
+    <w:p>
+      <w:pPr>
+        <w:ind w:firstLine="720"/>
+        <w:rPr>
+          <w:lang w:val="en-CA"/>
+        </w:rPr>
+      </w:pPr>
+      <w:r>
+        <w:rPr>
+          <w:lang w:val="en-CA"/>
+        </w:rPr>
+        <w:t>POST /api/auth/register</w:t>
+      </w:r>
+    </w:p>
+    <w:p>
+      <w:pPr>
+        <w:rPr>
+          <w:lang w:val="en-CA"/>
+        </w:rPr>
+      </w:pPr>
+      <w:r>
+        <w:rPr>
+          <w:lang w:val="en-CA"/>
+        </w:rPr>
+        <w:t>      viewFighters.ts/</w:t>
+      </w:r>
+    </w:p>
+    <w:p>
+      <w:pPr>
+        <w:rPr>
+          <w:lang w:val="en-CA"/>
+        </w:rPr>
+      </w:pPr>
+      <w:r>
+        <w:rPr>
+          <w:lang w:val="en-CA"/>
+        </w:rPr>
+        <w:t xml:space="preserve">    </w:t>
+      </w:r>
+      <w:r>
+        <w:rPr>
+          <w:lang w:val="en-CA"/>
+        </w:rPr>
+        <w:tab/>
+      </w:r>
+      <w:r>
+        <w:rPr>
+          <w:lang w:val="en-CA"/>
+        </w:rPr>
+        <w:t>GET    /api/users/:userId/fighters</w:t>
+      </w:r>
+    </w:p>
+    <w:p>
+      <w:pPr>
+        <w:rPr>
+          <w:lang w:val="en-CA"/>
+        </w:rPr>
+      </w:pPr>
+      <w:r>
+        <w:rPr>
+          <w:lang w:val="en-CA"/>
+        </w:rPr>
+        <w:t>      addFighters.ts/</w:t>
+      </w:r>
+    </w:p>
+    <w:p>
+      <w:pPr>
+        <w:rPr>
+          <w:lang w:val="en-CA"/>
+        </w:rPr>
+      </w:pPr>
+      <w:r>
+        <w:rPr>
+          <w:lang w:val="en-CA"/>
+        </w:rPr>
+        <w:t xml:space="preserve">    </w:t>
+      </w:r>
+      <w:r>
+        <w:rPr>
+          <w:lang w:val="en-CA"/>
+        </w:rPr>
+        <w:tab/>
+      </w:r>
+      <w:r>
+        <w:rPr>
+          <w:lang w:val="en-CA"/>
+        </w:rPr>
+        <w:t>POST   /api/users/:userId/fighters</w:t>
+      </w:r>
+    </w:p>
+    <w:p>
+      <w:pPr>
+        <w:rPr>
+          <w:lang w:val="en-CA"/>
+        </w:rPr>
+      </w:pPr>
+      <w:r>
+        <w:rPr>
+          <w:lang w:val="en-CA"/>
+        </w:rPr>
+        <w:t>      editFighters.ts/</w:t>
+      </w:r>
+    </w:p>
+    <w:p>
+      <w:pPr>
+        <w:rPr>
+          <w:lang w:val="en-CA"/>
+        </w:rPr>
+      </w:pPr>
+      <w:r>
+        <w:rPr>
+          <w:lang w:val="en-CA"/>
+        </w:rPr>
+        <w:t xml:space="preserve">    </w:t>
+      </w:r>
+      <w:r>
+        <w:rPr>
+          <w:lang w:val="en-CA"/>
+        </w:rPr>
+        <w:tab/>
+      </w:r>
+      <w:r>
+        <w:rPr>
+          <w:lang w:val="en-CA"/>
+        </w:rPr>
+        <w:t>PUT    /api/users/:userId/fighters/:fighterId</w:t>
+      </w:r>
+    </w:p>
+    <w:p>
+      <w:pPr>
+        <w:ind w:firstLine="720"/>
+        <w:rPr>
+          <w:lang w:val="en-CA"/>
+        </w:rPr>
+      </w:pPr>
+      <w:r>
+        <w:rPr>
+          <w:lang w:val="en-CA"/>
+        </w:rPr>
+        <w:t>DELETE /api/users/:userId/fighters/:fighterId</w:t>
+      </w:r>
+    </w:p>
+    <w:p>
+      <w:pPr>
+        <w:rPr>
+          <w:lang w:val="en-CA"/>
+        </w:rPr>
+      </w:pPr>
+      <w:r>
+        <w:rPr>
+          <w:lang w:val="en-CA"/>
+        </w:rPr>
+        <w:t>       arena.ts/</w:t>
+      </w:r>
+    </w:p>
+    <w:p>
+      <w:pPr>
+        <w:rPr>
+          <w:lang w:val="en-CA"/>
+        </w:rPr>
+      </w:pPr>
+      <w:r>
+        <w:rPr>
+          <w:lang w:val="en-CA"/>
+        </w:rPr>
+        <w:t xml:space="preserve">    </w:t>
+      </w:r>
+      <w:r>
+        <w:rPr>
+          <w:lang w:val="en-CA"/>
+        </w:rPr>
+        <w:tab/>
+      </w:r>
+      <w:r>
+        <w:rPr>
+          <w:lang w:val="en-CA"/>
+        </w:rPr>
+        <w:t>GET  /api/users/:userId/fighters</w:t>
+      </w:r>
+    </w:p>
+    <w:p>
+      <w:pPr>
+        <w:ind w:firstLine="720"/>
+        <w:rPr>
+          <w:lang w:val="en-CA"/>
+        </w:rPr>
+      </w:pPr>
+      <w:r>
+        <w:rPr>
+          <w:lang w:val="en-CA"/>
+        </w:rPr>
+        <w:t>POST /api/battle</w:t>
+      </w:r>
+    </w:p>
+    <w:p>
+      <w:pPr>
+        <w:rPr>
+          <w:lang w:val="en-CA"/>
+        </w:rPr>
+      </w:pPr>
+      <w:r>
+        <w:rPr>
+          <w:lang w:val="en-CA"/>
+        </w:rPr>
+        <w:t>       armoury.ts/</w:t>
+      </w:r>
+    </w:p>
+    <w:p>
+      <w:pPr>
+        <w:rPr>
+          <w:lang w:val="en-CA"/>
+        </w:rPr>
+      </w:pPr>
+      <w:r>
+        <w:rPr>
+          <w:lang w:val="en-CA"/>
+        </w:rPr>
+        <w:t xml:space="preserve">    </w:t>
+      </w:r>
+      <w:r>
+        <w:rPr>
+          <w:lang w:val="en-CA"/>
+        </w:rPr>
+        <w:tab/>
+      </w:r>
+      <w:r>
+        <w:rPr>
+          <w:lang w:val="en-CA"/>
+        </w:rPr>
+        <w:t>GET /api/weapons</w:t>
+      </w:r>
+    </w:p>
+    <w:p>
+      <w:pPr>
+        <w:ind w:firstLine="720"/>
+        <w:rPr>
+          <w:lang w:val="en-CA"/>
+        </w:rPr>
+      </w:pPr>
+      <w:r>
+        <w:rPr>
+          <w:lang w:val="en-CA"/>
+        </w:rPr>
+        <w:t>GET /api/armors</w:t>
+      </w:r>
+    </w:p>
+    <w:p>
+      <w:pPr>
+        <w:ind w:firstLine="720"/>
+        <w:rPr>
+          <w:lang w:val="en-CA"/>
+        </w:rPr>
+      </w:pPr>
+      <w:r>
+        <w:rPr>
+          <w:lang w:val="en-CA"/>
+        </w:rPr>
+        <w:t>POST /api/users/:userId/inventory/weapons</w:t>
+      </w:r>
+    </w:p>
+    <w:p>
+      <w:pPr>
+        <w:ind w:firstLine="720"/>
+        <w:rPr>
+          <w:lang w:val="en-CA"/>
+        </w:rPr>
+      </w:pPr>
+      <w:r>
+        <w:rPr>
+          <w:lang w:val="en-CA"/>
+        </w:rPr>
+        <w:t>POST /api/users/:userId/inventory/armors</w:t>
+      </w:r>
+    </w:p>
+    <w:p>
+      <w:pPr>
+        <w:rPr>
+          <w:lang w:val="en-CA"/>
+        </w:rPr>
+      </w:pPr>
+      <w:r>
+        <w:rPr>
+          <w:lang w:val="en-CA"/>
+        </w:rPr>
+        <w:t>       userSettings.ts/</w:t>
+      </w:r>
+    </w:p>
+    <w:p>
+      <w:pPr>
+        <w:rPr>
+          <w:lang w:val="en-CA"/>
+        </w:rPr>
+      </w:pPr>
+      <w:r>
+        <w:rPr>
+          <w:lang w:val="en-CA"/>
+        </w:rPr>
+        <w:t xml:space="preserve">    </w:t>
+      </w:r>
+      <w:r>
+        <w:rPr>
+          <w:lang w:val="en-CA"/>
+        </w:rPr>
+        <w:tab/>
+      </w:r>
+      <w:r>
+        <w:rPr>
+          <w:lang w:val="en-CA"/>
+        </w:rPr>
+        <w:t>GET   /api/users/:userId</w:t>
+      </w:r>
+    </w:p>
+    <w:p>
+      <w:pPr>
+        <w:ind w:firstLine="720"/>
+        <w:rPr>
+          <w:lang w:val="en-CA"/>
+        </w:rPr>
+      </w:pPr>
+      <w:r>
+        <w:rPr>
+          <w:lang w:val="en-CA"/>
+        </w:rPr>
+        <w:t>PATCH /api/users/:userId/password</w:t>
+      </w:r>
+    </w:p>
+    <w:p>
+      <w:pPr>
+        <w:rPr>
+          <w:lang w:val="en-CA"/>
+        </w:rPr>
+      </w:pPr>
+      <w:r>
+        <w:rPr>
+          <w:lang w:val="en-CA"/>
+        </w:rPr>
+        <w:t>    server.ts</w:t>
+      </w:r>
+    </w:p>
+    <w:p>
+      <w:pPr>
+        <w:rPr>
+          <w:lang w:val="en-CA"/>
+        </w:rPr>
+      </w:pPr>
+      <w:r>
+        <w:rPr>
+          <w:lang w:val="en-CA"/>
+        </w:rPr>
+        <w:t>Server.ts is where everything will be connected as the express app will be created in this.</w:t>
+      </w:r>
+    </w:p>
+    <w:p>
+      <w:pPr>
+        <w:rPr>
+          <w:lang w:val="en-CA"/>
+        </w:rPr>
+      </w:pPr>
+      <w:r>
+        <w:rPr>
+          <w:lang w:val="en-CA"/>
+        </w:rPr>
+        <w:t> </w:t>
+      </w:r>
+    </w:p>
+    <w:p>
+      <w:pPr>
+        <w:rPr>
+          <w:lang w:val="en-CA"/>
+        </w:rPr>
+      </w:pPr>
+    </w:p>
+    <w:p/>
     <w:p>
       <w:pPr>
         <w:rPr>
@@ -1024,9 +2342,7 @@
           <w:u w:val="single"/>
         </w:rPr>
       </w:pPr>
-    </w:p>
-    <w:p>
-      <w:pPr>
+      <w:r>
         <w:rPr>
           <w:b/>
           <w:bCs/>
@@ -1034,10 +2350,10 @@
           <w:szCs w:val="32"/>
           <w:u w:val="single"/>
         </w:rPr>
-      </w:pPr>
-    </w:p>
-    <w:p>
-      <w:pPr>
+        <w:lastRenderedPageBreak/>
+        <w:t xml:space="preserve">Student </w:t>
+      </w:r>
+      <w:r>
         <w:rPr>
           <w:b/>
           <w:bCs/>
@@ -1045,7 +2361,8 @@
           <w:szCs w:val="32"/>
           <w:u w:val="single"/>
         </w:rPr>
-      </w:pPr>
+        <w:t>3 (Alexander)</w:t>
+      </w:r>
     </w:p>
     <w:p>
       <w:pPr>
@@ -1060,71 +2377,6 @@
     </w:p>
     <w:p>
       <w:pPr>
-        <w:rPr>
-          <w:b/>
-          <w:bCs/>
-          <w:sz w:val="32"/>
-          <w:szCs w:val="32"/>
-          <w:u w:val="single"/>
-        </w:rPr>
-      </w:pPr>
-    </w:p>
-    <w:p>
-      <w:pPr>
-        <w:rPr>
-          <w:b/>
-          <w:bCs/>
-          <w:sz w:val="32"/>
-          <w:szCs w:val="32"/>
-          <w:u w:val="single"/>
-        </w:rPr>
-      </w:pPr>
-    </w:p>
-    <w:p>
-      <w:pPr>
-        <w:rPr>
-          <w:b/>
-          <w:bCs/>
-          <w:sz w:val="32"/>
-          <w:szCs w:val="32"/>
-          <w:u w:val="single"/>
-        </w:rPr>
-      </w:pPr>
-      <w:r>
-        <w:rPr>
-          <w:b/>
-          <w:bCs/>
-          <w:sz w:val="32"/>
-          <w:szCs w:val="32"/>
-          <w:u w:val="single"/>
-        </w:rPr>
-        <w:lastRenderedPageBreak/>
-        <w:t xml:space="preserve">Student </w:t>
-      </w:r>
-      <w:r>
-        <w:rPr>
-          <w:b/>
-          <w:bCs/>
-          <w:sz w:val="32"/>
-          <w:szCs w:val="32"/>
-          <w:u w:val="single"/>
-        </w:rPr>
-        <w:t>3 (Alexander)</w:t>
-      </w:r>
-    </w:p>
-    <w:p>
-      <w:pPr>
-        <w:rPr>
-          <w:b/>
-          <w:bCs/>
-          <w:sz w:val="32"/>
-          <w:szCs w:val="32"/>
-          <w:u w:val="single"/>
-        </w:rPr>
-      </w:pPr>
-    </w:p>
-    <w:p>
-      <w:pPr>
         <w:jc w:val="center"/>
         <w:rPr>
           <w:b/>
@@ -1167,6 +2419,16 @@
     </w:p>
     <w:p>
       <w:pPr>
+        <w:jc w:val="center"/>
+        <w:rPr>
+          <w:b/>
+          <w:bCs/>
+          <w:sz w:val="28"/>
+          <w:szCs w:val="28"/>
+          <w:lang w:val="en-CA"/>
+        </w:rPr>
+      </w:pPr>
+      <w:r>
         <w:rPr>
           <w:b/>
           <w:bCs/>
@@ -1175,34 +2437,13 @@
           <w:u w:val="single"/>
           <w:lang w:val="en-CA"/>
         </w:rPr>
-      </w:pPr>
-      <w:r>
-        <w:rPr>
-          <w:b/>
-          <w:bCs/>
-          <w:sz w:val="24"/>
-          <w:szCs w:val="24"/>
-          <w:u w:val="single"/>
-          <w:lang w:val="en-CA"/>
-        </w:rPr>
         <w:t>Home Page</w:t>
       </w:r>
-    </w:p>
-    <w:p>
-      <w:pPr>
-        <w:rPr>
-          <w:b/>
-          <w:bCs/>
-          <w:sz w:val="32"/>
-          <w:szCs w:val="32"/>
-          <w:u w:val="single"/>
-          <w:lang w:val="en-CA"/>
-        </w:rPr>
-      </w:pPr>
-      <w:r>
-        <w:rPr>
-          <w:b/>
-          <w:bCs/>
+      <w:r>
+        <w:rPr>
+          <w:b/>
+          <w:bCs/>
+          <w:noProof/>
           <w:sz w:val="32"/>
           <w:szCs w:val="32"/>
           <w:u w:val="single"/>
@@ -1285,6 +2526,18 @@
         <w:rPr>
           <w:b/>
           <w:bCs/>
+          <w:sz w:val="24"/>
+          <w:szCs w:val="24"/>
+          <w:u w:val="single"/>
+          <w:lang w:val="en-CA"/>
+        </w:rPr>
+      </w:pPr>
+    </w:p>
+    <w:p>
+      <w:pPr>
+        <w:rPr>
+          <w:b/>
+          <w:bCs/>
           <w:sz w:val="32"/>
           <w:szCs w:val="32"/>
           <w:u w:val="single"/>
@@ -1330,6 +2583,7 @@
         <w:rPr>
           <w:b/>
           <w:bCs/>
+          <w:noProof/>
           <w:sz w:val="32"/>
           <w:szCs w:val="32"/>
           <w:u w:val="single"/>
@@ -1486,6 +2740,18 @@
         <w:rPr>
           <w:b/>
           <w:bCs/>
+          <w:sz w:val="24"/>
+          <w:szCs w:val="24"/>
+          <w:u w:val="single"/>
+          <w:lang w:val="en-CA"/>
+        </w:rPr>
+      </w:pPr>
+    </w:p>
+    <w:p>
+      <w:pPr>
+        <w:rPr>
+          <w:b/>
+          <w:bCs/>
           <w:sz w:val="32"/>
           <w:szCs w:val="32"/>
           <w:u w:val="single"/>
@@ -1496,6 +2762,7 @@
         <w:rPr>
           <w:b/>
           <w:bCs/>
+          <w:noProof/>
           <w:sz w:val="32"/>
           <w:szCs w:val="32"/>
           <w:u w:val="single"/>
@@ -1598,9 +2865,7 @@
           <w:lang w:val="en-CA"/>
         </w:rPr>
       </w:pPr>
-    </w:p>
-    <w:p>
-      <w:pPr>
+      <w:r>
         <w:rPr>
           <w:b/>
           <w:bCs/>
@@ -1609,8 +2874,12 @@
           <w:u w:val="single"/>
           <w:lang w:val="en-CA"/>
         </w:rPr>
-      </w:pPr>
-      <w:r>
+        <w:lastRenderedPageBreak/>
+        <w:t>Add Fighters(Data Entry Page)</w:t>
+      </w:r>
+    </w:p>
+    <w:p>
+      <w:pPr>
         <w:rPr>
           <w:b/>
           <w:bCs/>
@@ -1619,9 +2888,7 @@
           <w:u w:val="single"/>
           <w:lang w:val="en-CA"/>
         </w:rPr>
-        <w:lastRenderedPageBreak/>
-        <w:t>Add Fighters(Data Entry Page)</w:t>
-      </w:r>
+      </w:pPr>
     </w:p>
     <w:p>
       <w:pPr>
@@ -1638,6 +2905,7 @@
         <w:rPr>
           <w:b/>
           <w:bCs/>
+          <w:noProof/>
           <w:sz w:val="32"/>
           <w:szCs w:val="32"/>
           <w:u w:val="single"/>
@@ -1740,9 +3008,7 @@
           <w:lang w:val="en-CA"/>
         </w:rPr>
       </w:pPr>
-    </w:p>
-    <w:p>
-      <w:pPr>
+      <w:r>
         <w:rPr>
           <w:b/>
           <w:bCs/>
@@ -1751,8 +3017,12 @@
           <w:u w:val="single"/>
           <w:lang w:val="en-CA"/>
         </w:rPr>
-      </w:pPr>
-      <w:r>
+        <w:lastRenderedPageBreak/>
+        <w:t>Edit Fighters(Edit/Update Page)</w:t>
+      </w:r>
+    </w:p>
+    <w:p>
+      <w:pPr>
         <w:rPr>
           <w:b/>
           <w:bCs/>
@@ -1761,9 +3031,7 @@
           <w:u w:val="single"/>
           <w:lang w:val="en-CA"/>
         </w:rPr>
-        <w:lastRenderedPageBreak/>
-        <w:t>Edit Fighters(Edit/Update Page)</w:t>
-      </w:r>
+      </w:pPr>
     </w:p>
     <w:p>
       <w:pPr>
@@ -1780,6 +3048,7 @@
         <w:rPr>
           <w:b/>
           <w:bCs/>
+          <w:noProof/>
           <w:sz w:val="32"/>
           <w:szCs w:val="32"/>
           <w:u w:val="single"/>
@@ -1882,9 +3151,7 @@
           <w:lang w:val="en-CA"/>
         </w:rPr>
       </w:pPr>
-    </w:p>
-    <w:p>
-      <w:pPr>
+      <w:r>
         <w:rPr>
           <w:b/>
           <w:bCs/>
@@ -1893,8 +3160,12 @@
           <w:u w:val="single"/>
           <w:lang w:val="en-CA"/>
         </w:rPr>
-      </w:pPr>
-      <w:r>
+        <w:lastRenderedPageBreak/>
+        <w:t>Arena</w:t>
+      </w:r>
+    </w:p>
+    <w:p>
+      <w:pPr>
         <w:rPr>
           <w:b/>
           <w:bCs/>
@@ -1903,9 +3174,7 @@
           <w:u w:val="single"/>
           <w:lang w:val="en-CA"/>
         </w:rPr>
-        <w:lastRenderedPageBreak/>
-        <w:t>Arena</w:t>
-      </w:r>
+      </w:pPr>
     </w:p>
     <w:p>
       <w:pPr>
@@ -1922,6 +3191,7 @@
         <w:rPr>
           <w:b/>
           <w:bCs/>
+          <w:noProof/>
           <w:sz w:val="32"/>
           <w:szCs w:val="32"/>
           <w:u w:val="single"/>
@@ -2024,9 +3294,7 @@
           <w:lang w:val="en-CA"/>
         </w:rPr>
       </w:pPr>
-    </w:p>
-    <w:p>
-      <w:pPr>
+      <w:r>
         <w:rPr>
           <w:b/>
           <w:bCs/>
@@ -2035,8 +3303,12 @@
           <w:u w:val="single"/>
           <w:lang w:val="en-CA"/>
         </w:rPr>
-      </w:pPr>
-      <w:r>
+        <w:lastRenderedPageBreak/>
+        <w:t>Armory</w:t>
+      </w:r>
+    </w:p>
+    <w:p>
+      <w:pPr>
         <w:rPr>
           <w:b/>
           <w:bCs/>
@@ -2045,9 +3317,7 @@
           <w:u w:val="single"/>
           <w:lang w:val="en-CA"/>
         </w:rPr>
-        <w:lastRenderedPageBreak/>
-        <w:t>Armory</w:t>
-      </w:r>
+      </w:pPr>
     </w:p>
     <w:p>
       <w:pPr>
@@ -2064,6 +3334,7 @@
         <w:rPr>
           <w:b/>
           <w:bCs/>
+          <w:noProof/>
           <w:sz w:val="32"/>
           <w:szCs w:val="32"/>
           <w:u w:val="single"/>
@@ -2166,9 +3437,7 @@
           <w:lang w:val="en-CA"/>
         </w:rPr>
       </w:pPr>
-    </w:p>
-    <w:p>
-      <w:pPr>
+      <w:r>
         <w:rPr>
           <w:b/>
           <w:bCs/>
@@ -2177,8 +3446,12 @@
           <w:u w:val="single"/>
           <w:lang w:val="en-CA"/>
         </w:rPr>
-      </w:pPr>
-      <w:r>
+        <w:lastRenderedPageBreak/>
+        <w:t>Login</w:t>
+      </w:r>
+    </w:p>
+    <w:p>
+      <w:pPr>
         <w:rPr>
           <w:b/>
           <w:bCs/>
@@ -2187,9 +3460,7 @@
           <w:u w:val="single"/>
           <w:lang w:val="en-CA"/>
         </w:rPr>
-        <w:lastRenderedPageBreak/>
-        <w:t>Login</w:t>
-      </w:r>
+      </w:pPr>
     </w:p>
     <w:p>
       <w:pPr>
@@ -2206,6 +3477,7 @@
         <w:rPr>
           <w:b/>
           <w:bCs/>
+          <w:noProof/>
           <w:sz w:val="32"/>
           <w:szCs w:val="32"/>
           <w:u w:val="single"/>
@@ -2344,9 +3616,7 @@
           <w:lang w:val="en-CA"/>
         </w:rPr>
       </w:pPr>
-    </w:p>
-    <w:p>
-      <w:pPr>
+      <w:r>
         <w:rPr>
           <w:b/>
           <w:bCs/>
@@ -2355,8 +3625,12 @@
           <w:u w:val="single"/>
           <w:lang w:val="en-CA"/>
         </w:rPr>
-      </w:pPr>
-      <w:r>
+        <w:lastRenderedPageBreak/>
+        <w:t>Register</w:t>
+      </w:r>
+    </w:p>
+    <w:p>
+      <w:pPr>
         <w:rPr>
           <w:b/>
           <w:bCs/>
@@ -2365,9 +3639,7 @@
           <w:u w:val="single"/>
           <w:lang w:val="en-CA"/>
         </w:rPr>
-        <w:lastRenderedPageBreak/>
-        <w:t>Register</w:t>
-      </w:r>
+      </w:pPr>
     </w:p>
     <w:p>
       <w:pPr>
@@ -2384,6 +3656,7 @@
         <w:rPr>
           <w:b/>
           <w:bCs/>
+          <w:noProof/>
           <w:sz w:val="32"/>
           <w:szCs w:val="32"/>
           <w:u w:val="single"/>
@@ -2492,52 +3765,65 @@
         <w:rPr>
           <w:b/>
           <w:bCs/>
+          <w:sz w:val="24"/>
+          <w:szCs w:val="24"/>
+          <w:u w:val="single"/>
+          <w:lang w:val="en-CA"/>
+        </w:rPr>
+      </w:pPr>
+    </w:p>
+    <w:p>
+      <w:pPr>
+        <w:rPr>
+          <w:b/>
+          <w:bCs/>
+          <w:sz w:val="24"/>
+          <w:szCs w:val="24"/>
+          <w:u w:val="single"/>
+          <w:lang w:val="en-CA"/>
+        </w:rPr>
+      </w:pPr>
+      <w:r>
+        <w:rPr>
+          <w:b/>
+          <w:bCs/>
+          <w:sz w:val="24"/>
+          <w:szCs w:val="24"/>
+          <w:u w:val="single"/>
+          <w:lang w:val="en-CA"/>
+        </w:rPr>
+        <w:lastRenderedPageBreak/>
+        <w:t>User Settings</w:t>
+      </w:r>
+    </w:p>
+    <w:p>
+      <w:pPr>
+        <w:rPr>
+          <w:b/>
+          <w:bCs/>
+          <w:sz w:val="24"/>
+          <w:szCs w:val="24"/>
+          <w:u w:val="single"/>
+          <w:lang w:val="en-CA"/>
+        </w:rPr>
+      </w:pPr>
+    </w:p>
+    <w:p>
+      <w:pPr>
+        <w:rPr>
+          <w:b/>
+          <w:bCs/>
           <w:sz w:val="32"/>
           <w:szCs w:val="32"/>
           <w:u w:val="single"/>
           <w:lang w:val="en-CA"/>
         </w:rPr>
       </w:pPr>
-    </w:p>
-    <w:p>
-      <w:pPr>
-        <w:rPr>
-          <w:b/>
-          <w:bCs/>
-          <w:sz w:val="24"/>
-          <w:szCs w:val="24"/>
-          <w:u w:val="single"/>
-          <w:lang w:val="en-CA"/>
-        </w:rPr>
-      </w:pPr>
-      <w:r>
-        <w:rPr>
-          <w:b/>
-          <w:bCs/>
-          <w:sz w:val="24"/>
-          <w:szCs w:val="24"/>
-          <w:u w:val="single"/>
-          <w:lang w:val="en-CA"/>
-        </w:rPr>
-        <w:lastRenderedPageBreak/>
-        <w:t>User Settings</w:t>
-      </w:r>
-    </w:p>
-    <w:p>
-      <w:pPr>
-        <w:rPr>
-          <w:b/>
-          <w:bCs/>
-          <w:sz w:val="32"/>
-          <w:szCs w:val="32"/>
-          <w:u w:val="single"/>
-          <w:lang w:val="en-CA"/>
-        </w:rPr>
-      </w:pPr>
-      <w:r>
-        <w:rPr>
-          <w:b/>
-          <w:bCs/>
+      <w:r>
+        <w:rPr>
+          <w:b/>
+          <w:bCs/>
+          <w:noProof/>
           <w:sz w:val="32"/>
           <w:szCs w:val="32"/>
           <w:u w:val="single"/>
@@ -2640,9 +3926,7 @@
           <w:lang w:val="en-CA"/>
         </w:rPr>
       </w:pPr>
-    </w:p>
-    <w:p>
-      <w:pPr>
+      <w:r>
         <w:rPr>
           <w:b/>
           <w:bCs/>
@@ -2651,8 +3935,12 @@
           <w:u w:val="single"/>
           <w:lang w:val="en-CA"/>
         </w:rPr>
-      </w:pPr>
-      <w:r>
+        <w:lastRenderedPageBreak/>
+        <w:t>About Us </w:t>
+      </w:r>
+    </w:p>
+    <w:p>
+      <w:pPr>
         <w:rPr>
           <w:b/>
           <w:bCs/>
@@ -2661,9 +3949,7 @@
           <w:u w:val="single"/>
           <w:lang w:val="en-CA"/>
         </w:rPr>
-        <w:lastRenderedPageBreak/>
-        <w:t>About Us </w:t>
-      </w:r>
+      </w:pPr>
     </w:p>
     <w:p>
       <w:pPr>
@@ -2680,6 +3966,7 @@
         <w:rPr>
           <w:b/>
           <w:bCs/>
+          <w:noProof/>
           <w:sz w:val="32"/>
           <w:szCs w:val="32"/>
           <w:u w:val="single"/>
@@ -2762,7 +4049,6 @@
           <w:bCs/>
           <w:lang w:val="en-CA"/>
         </w:rPr>
-        <w:lastRenderedPageBreak/>
         <w:t>User Interface Planning</w:t>
       </w:r>
     </w:p>
@@ -2784,67 +4070,7 @@
         <w:rPr>
           <w:lang w:val="en-CA"/>
         </w:rPr>
-        <w:t xml:space="preserve">Our planning of the user interface started with the color palette figuring that is the foundation of the interface. In selecting </w:t>
-      </w:r>
-      <w:r>
-        <w:rPr>
-          <w:lang w:val="en-CA"/>
-        </w:rPr>
-        <w:t>colors,</w:t>
-      </w:r>
-      <w:r>
-        <w:rPr>
-          <w:lang w:val="en-CA"/>
-        </w:rPr>
-        <w:t xml:space="preserve"> we went with colors that represented the roman empire in its prime. The classic red that almost all cinematic gladiators are associated with, purple the color of royalty and high class in </w:t>
-      </w:r>
-      <w:r>
-        <w:rPr>
-          <w:lang w:val="en-CA"/>
-        </w:rPr>
-        <w:t>Rome</w:t>
-      </w:r>
-      <w:r>
-        <w:rPr>
-          <w:lang w:val="en-CA"/>
-        </w:rPr>
-        <w:t xml:space="preserve"> during the time period, as the pigment was expensive to acquire. Silver and gold accents felt right for gladiators representing money which was one of the main reasons for the coliseum. Then a greyish black to round out the nav bar and footer to make the page aesthetic a bit </w:t>
-      </w:r>
-      <w:r>
-        <w:rPr>
-          <w:lang w:val="en-CA"/>
-        </w:rPr>
-        <w:t>cleaner and more cohesive</w:t>
-      </w:r>
-      <w:r>
-        <w:rPr>
-          <w:lang w:val="en-CA"/>
-        </w:rPr>
-        <w:t xml:space="preserve">. There were other colors used but mostly just greys and different tones of the red and purple due to opacity. With the colors established it was onto how </w:t>
-      </w:r>
-      <w:r>
-        <w:rPr>
-          <w:lang w:val="en-CA"/>
-        </w:rPr>
-        <w:t>we do</w:t>
-      </w:r>
-      <w:r>
-        <w:rPr>
-          <w:lang w:val="en-CA"/>
-        </w:rPr>
-        <w:t xml:space="preserve"> the pages to present their main content. We tried to find the sweet spot of minimalist and maximalist designs. Giving the user important data to look at for the most part and if there were “gaps”, those are filled in with details about the website/page/fighters/etc. The goal was to make the interface </w:t>
-      </w:r>
-      <w:r>
-        <w:rPr>
-          <w:lang w:val="en-CA"/>
-        </w:rPr>
-        <w:t>streamlined</w:t>
-      </w:r>
-      <w:r>
-        <w:rPr>
-          <w:lang w:val="en-CA"/>
-        </w:rPr>
-        <w:t xml:space="preserve"> without clutter</w:t>
+        <w:t>Our planning of the user interface started with the color palette figuring that is the foundation of the interface. In selecting colors, we went with colors that represented the roman empire in its prime. The classic red that almost all cinematic gladiators are associated with, purple the color of royalty and high class in Rome during the time period, as the pigment was expensive to acquire. Silver and gold accents felt right for gladiators representing money which was one of the main reasons for the coliseum. Then a greyish black to round out the nav bar and footer to make the page aesthetic a bit cleaner and more cohesive. There were other colors used but mostly just greys and different tones of the red and purple due to opacity. With the colors established it was onto how we do the pages to present their main content. We tried to find the sweet spot of minimalist and maximalist designs. Giving the user important data to look at for the most part and if there were “gaps”, those are filled in with details about the website/page/fighters/etc. The goal was to make the interface streamlined without clutter</w:t>
       </w:r>
       <w:r>
         <w:rPr>
@@ -2883,33 +4109,18 @@
           <w:bCs/>
           <w:lang w:val="en-CA"/>
         </w:rPr>
-        <w:t xml:space="preserve">Color </w:t>
-      </w:r>
-      <w:r>
-        <w:rPr>
-          <w:b/>
-          <w:bCs/>
-          <w:lang w:val="en-CA"/>
-        </w:rPr>
-        <w:t>Palette</w:t>
-      </w:r>
-      <w:r>
-        <w:rPr>
-          <w:b/>
-          <w:bCs/>
-          <w:lang w:val="en-CA"/>
-        </w:rPr>
-        <w:t>:</w:t>
-      </w:r>
-    </w:p>
-    <w:p>
-      <w:pPr>
-        <w:rPr>
-          <w:lang w:val="en-CA"/>
-        </w:rPr>
-      </w:pPr>
-      <w:r>
-        <w:rPr>
+        <w:t>Color Palette:</w:t>
+      </w:r>
+    </w:p>
+    <w:p>
+      <w:pPr>
+        <w:rPr>
+          <w:lang w:val="en-CA"/>
+        </w:rPr>
+      </w:pPr>
+      <w:r>
+        <w:rPr>
+          <w:noProof/>
           <w:lang w:val="en-CA"/>
         </w:rPr>
         <w:drawing>
@@ -6483,6 +7694,142 @@
 </file>
 
 <file path=customXml/item2.xml><?xml version="1.0" encoding="utf-8"?>
+<p:properties xmlns:p="http://schemas.microsoft.com/office/2006/metadata/properties" xmlns:xsi="http://www.w3.org/2001/XMLSchema-instance" xmlns:pc="http://schemas.microsoft.com/office/infopath/2007/PartnerControls">
+  <documentManagement>
+    <LocLastLocAttemptVersionTypeLookup xmlns="4873beb7-5857-4685-be1f-d57550cc96cc" xsi:nil="true"/>
+    <MarketSpecific xmlns="4873beb7-5857-4685-be1f-d57550cc96cc">false</MarketSpecific>
+    <ApprovalStatus xmlns="4873beb7-5857-4685-be1f-d57550cc96cc">InProgress</ApprovalStatus>
+    <LocComments xmlns="4873beb7-5857-4685-be1f-d57550cc96cc" xsi:nil="true"/>
+    <DirectSourceMarket xmlns="4873beb7-5857-4685-be1f-d57550cc96cc" xsi:nil="true"/>
+    <LocPublishedLinkedAssetsLookup xmlns="4873beb7-5857-4685-be1f-d57550cc96cc" xsi:nil="true"/>
+    <ThumbnailAssetId xmlns="4873beb7-5857-4685-be1f-d57550cc96cc" xsi:nil="true"/>
+    <PrimaryImageGen xmlns="4873beb7-5857-4685-be1f-d57550cc96cc">true</PrimaryImageGen>
+    <LegacyData xmlns="4873beb7-5857-4685-be1f-d57550cc96cc" xsi:nil="true"/>
+    <LocNewPublishedVersionLookup xmlns="4873beb7-5857-4685-be1f-d57550cc96cc" xsi:nil="true"/>
+    <NumericId xmlns="4873beb7-5857-4685-be1f-d57550cc96cc">102787001</NumericId>
+    <TPFriendlyName xmlns="4873beb7-5857-4685-be1f-d57550cc96cc" xsi:nil="true"/>
+    <LocOverallPublishStatusLookup xmlns="4873beb7-5857-4685-be1f-d57550cc96cc" xsi:nil="true"/>
+    <LocRecommendedHandoff xmlns="4873beb7-5857-4685-be1f-d57550cc96cc" xsi:nil="true"/>
+    <BlockPublish xmlns="4873beb7-5857-4685-be1f-d57550cc96cc">false</BlockPublish>
+    <BusinessGroup xmlns="4873beb7-5857-4685-be1f-d57550cc96cc" xsi:nil="true"/>
+    <OpenTemplate xmlns="4873beb7-5857-4685-be1f-d57550cc96cc">true</OpenTemplate>
+    <SourceTitle xmlns="4873beb7-5857-4685-be1f-d57550cc96cc" xsi:nil="true"/>
+    <LocOverallLocStatusLookup xmlns="4873beb7-5857-4685-be1f-d57550cc96cc" xsi:nil="true"/>
+    <APEditor xmlns="4873beb7-5857-4685-be1f-d57550cc96cc">
+      <UserInfo>
+        <DisplayName/>
+        <AccountId xsi:nil="true"/>
+        <AccountType/>
+      </UserInfo>
+    </APEditor>
+    <UALocComments xmlns="4873beb7-5857-4685-be1f-d57550cc96cc" xsi:nil="true"/>
+    <IntlLangReviewDate xmlns="4873beb7-5857-4685-be1f-d57550cc96cc" xsi:nil="true"/>
+    <PublishStatusLookup xmlns="4873beb7-5857-4685-be1f-d57550cc96cc">
+      <Value>1343188</Value>
+    </PublishStatusLookup>
+    <ParentAssetId xmlns="4873beb7-5857-4685-be1f-d57550cc96cc" xsi:nil="true"/>
+    <FeatureTagsTaxHTField0 xmlns="4873beb7-5857-4685-be1f-d57550cc96cc">
+      <Terms xmlns="http://schemas.microsoft.com/office/infopath/2007/PartnerControls"/>
+    </FeatureTagsTaxHTField0>
+    <MachineTranslated xmlns="4873beb7-5857-4685-be1f-d57550cc96cc">false</MachineTranslated>
+    <Providers xmlns="4873beb7-5857-4685-be1f-d57550cc96cc" xsi:nil="true"/>
+    <OriginalSourceMarket xmlns="4873beb7-5857-4685-be1f-d57550cc96cc" xsi:nil="true"/>
+    <APDescription xmlns="4873beb7-5857-4685-be1f-d57550cc96cc" xsi:nil="true"/>
+    <ContentItem xmlns="4873beb7-5857-4685-be1f-d57550cc96cc" xsi:nil="true"/>
+    <ClipArtFilename xmlns="4873beb7-5857-4685-be1f-d57550cc96cc" xsi:nil="true"/>
+    <TPInstallLocation xmlns="4873beb7-5857-4685-be1f-d57550cc96cc" xsi:nil="true"/>
+    <TimesCloned xmlns="4873beb7-5857-4685-be1f-d57550cc96cc" xsi:nil="true"/>
+    <PublishTargets xmlns="4873beb7-5857-4685-be1f-d57550cc96cc">OfficeOnlineVNext</PublishTargets>
+    <AcquiredFrom xmlns="4873beb7-5857-4685-be1f-d57550cc96cc">Internal MS</AcquiredFrom>
+    <AssetStart xmlns="4873beb7-5857-4685-be1f-d57550cc96cc">2011-11-23T17:29:00+00:00</AssetStart>
+    <FriendlyTitle xmlns="4873beb7-5857-4685-be1f-d57550cc96cc" xsi:nil="true"/>
+    <Provider xmlns="4873beb7-5857-4685-be1f-d57550cc96cc" xsi:nil="true"/>
+    <LastHandOff xmlns="4873beb7-5857-4685-be1f-d57550cc96cc" xsi:nil="true"/>
+    <TPClientViewer xmlns="4873beb7-5857-4685-be1f-d57550cc96cc" xsi:nil="true"/>
+    <TemplateStatus xmlns="4873beb7-5857-4685-be1f-d57550cc96cc">Complete</TemplateStatus>
+    <Downloads xmlns="4873beb7-5857-4685-be1f-d57550cc96cc">0</Downloads>
+    <OOCacheId xmlns="4873beb7-5857-4685-be1f-d57550cc96cc" xsi:nil="true"/>
+    <IsDeleted xmlns="4873beb7-5857-4685-be1f-d57550cc96cc">false</IsDeleted>
+    <LocPublishedDependentAssetsLookup xmlns="4873beb7-5857-4685-be1f-d57550cc96cc" xsi:nil="true"/>
+    <AssetExpire xmlns="4873beb7-5857-4685-be1f-d57550cc96cc">2029-05-12T07:00:00+00:00</AssetExpire>
+    <CSXSubmissionMarket xmlns="4873beb7-5857-4685-be1f-d57550cc96cc" xsi:nil="true"/>
+    <DSATActionTaken xmlns="4873beb7-5857-4685-be1f-d57550cc96cc" xsi:nil="true"/>
+    <SubmitterId xmlns="4873beb7-5857-4685-be1f-d57550cc96cc" xsi:nil="true"/>
+    <EditorialTags xmlns="4873beb7-5857-4685-be1f-d57550cc96cc" xsi:nil="true"/>
+    <TPExecutable xmlns="4873beb7-5857-4685-be1f-d57550cc96cc" xsi:nil="true"/>
+    <CSXSubmissionDate xmlns="4873beb7-5857-4685-be1f-d57550cc96cc" xsi:nil="true"/>
+    <CSXUpdate xmlns="4873beb7-5857-4685-be1f-d57550cc96cc">false</CSXUpdate>
+    <AssetType xmlns="4873beb7-5857-4685-be1f-d57550cc96cc">TP</AssetType>
+    <ApprovalLog xmlns="4873beb7-5857-4685-be1f-d57550cc96cc" xsi:nil="true"/>
+    <BugNumber xmlns="4873beb7-5857-4685-be1f-d57550cc96cc" xsi:nil="true"/>
+    <OriginAsset xmlns="4873beb7-5857-4685-be1f-d57550cc96cc" xsi:nil="true"/>
+    <TPComponent xmlns="4873beb7-5857-4685-be1f-d57550cc96cc" xsi:nil="true"/>
+    <Milestone xmlns="4873beb7-5857-4685-be1f-d57550cc96cc" xsi:nil="true"/>
+    <RecommendationsModifier xmlns="4873beb7-5857-4685-be1f-d57550cc96cc" xsi:nil="true"/>
+    <AssetId xmlns="4873beb7-5857-4685-be1f-d57550cc96cc">TP102787001</AssetId>
+    <PolicheckWords xmlns="4873beb7-5857-4685-be1f-d57550cc96cc" xsi:nil="true"/>
+    <TPLaunchHelpLink xmlns="4873beb7-5857-4685-be1f-d57550cc96cc" xsi:nil="true"/>
+    <IntlLocPriority xmlns="4873beb7-5857-4685-be1f-d57550cc96cc" xsi:nil="true"/>
+    <TPApplication xmlns="4873beb7-5857-4685-be1f-d57550cc96cc" xsi:nil="true"/>
+    <IntlLangReviewer xmlns="4873beb7-5857-4685-be1f-d57550cc96cc" xsi:nil="true"/>
+    <HandoffToMSDN xmlns="4873beb7-5857-4685-be1f-d57550cc96cc" xsi:nil="true"/>
+    <PlannedPubDate xmlns="4873beb7-5857-4685-be1f-d57550cc96cc" xsi:nil="true"/>
+    <CrawlForDependencies xmlns="4873beb7-5857-4685-be1f-d57550cc96cc">false</CrawlForDependencies>
+    <LocLastLocAttemptVersionLookup xmlns="4873beb7-5857-4685-be1f-d57550cc96cc">693888</LocLastLocAttemptVersionLookup>
+    <LocProcessedForHandoffsLookup xmlns="4873beb7-5857-4685-be1f-d57550cc96cc" xsi:nil="true"/>
+    <TrustLevel xmlns="4873beb7-5857-4685-be1f-d57550cc96cc">1 Microsoft Managed Content</TrustLevel>
+    <CampaignTagsTaxHTField0 xmlns="4873beb7-5857-4685-be1f-d57550cc96cc">
+      <Terms xmlns="http://schemas.microsoft.com/office/infopath/2007/PartnerControls"/>
+    </CampaignTagsTaxHTField0>
+    <TPNamespace xmlns="4873beb7-5857-4685-be1f-d57550cc96cc" xsi:nil="true"/>
+    <LocOverallPreviewStatusLookup xmlns="4873beb7-5857-4685-be1f-d57550cc96cc" xsi:nil="true"/>
+    <TaxCatchAll xmlns="4873beb7-5857-4685-be1f-d57550cc96cc"/>
+    <IsSearchable xmlns="4873beb7-5857-4685-be1f-d57550cc96cc">false</IsSearchable>
+    <TemplateTemplateType xmlns="4873beb7-5857-4685-be1f-d57550cc96cc">Word Document Template</TemplateTemplateType>
+    <Markets xmlns="4873beb7-5857-4685-be1f-d57550cc96cc"/>
+    <IntlLangReview xmlns="4873beb7-5857-4685-be1f-d57550cc96cc" xsi:nil="true"/>
+    <UAProjectedTotalWords xmlns="4873beb7-5857-4685-be1f-d57550cc96cc" xsi:nil="true"/>
+    <OutputCachingOn xmlns="4873beb7-5857-4685-be1f-d57550cc96cc">false</OutputCachingOn>
+    <AverageRating xmlns="4873beb7-5857-4685-be1f-d57550cc96cc" xsi:nil="true"/>
+    <LocMarketGroupTiers2 xmlns="4873beb7-5857-4685-be1f-d57550cc96cc" xsi:nil="true"/>
+    <APAuthor xmlns="4873beb7-5857-4685-be1f-d57550cc96cc">
+      <UserInfo>
+        <DisplayName>REDMOND\v-namall</DisplayName>
+        <AccountId>978</AccountId>
+        <AccountType/>
+      </UserInfo>
+    </APAuthor>
+    <TPCommandLine xmlns="4873beb7-5857-4685-be1f-d57550cc96cc" xsi:nil="true"/>
+    <LocManualTestRequired xmlns="4873beb7-5857-4685-be1f-d57550cc96cc">false</LocManualTestRequired>
+    <TPAppVersion xmlns="4873beb7-5857-4685-be1f-d57550cc96cc" xsi:nil="true"/>
+    <EditorialStatus xmlns="4873beb7-5857-4685-be1f-d57550cc96cc">Complete</EditorialStatus>
+    <LocProcessedForMarketsLookup xmlns="4873beb7-5857-4685-be1f-d57550cc96cc" xsi:nil="true"/>
+    <LastModifiedDateTime xmlns="4873beb7-5857-4685-be1f-d57550cc96cc" xsi:nil="true"/>
+    <TPLaunchHelpLinkType xmlns="4873beb7-5857-4685-be1f-d57550cc96cc">Template</TPLaunchHelpLinkType>
+    <ScenarioTagsTaxHTField0 xmlns="4873beb7-5857-4685-be1f-d57550cc96cc">
+      <Terms xmlns="http://schemas.microsoft.com/office/infopath/2007/PartnerControls"/>
+    </ScenarioTagsTaxHTField0>
+    <OriginalRelease xmlns="4873beb7-5857-4685-be1f-d57550cc96cc">14</OriginalRelease>
+    <LocalizationTagsTaxHTField0 xmlns="4873beb7-5857-4685-be1f-d57550cc96cc">
+      <Terms xmlns="http://schemas.microsoft.com/office/infopath/2007/PartnerControls"/>
+    </LocalizationTagsTaxHTField0>
+    <Manager xmlns="4873beb7-5857-4685-be1f-d57550cc96cc" xsi:nil="true"/>
+    <UALocRecommendation xmlns="4873beb7-5857-4685-be1f-d57550cc96cc">Localize</UALocRecommendation>
+    <LocOverallHandbackStatusLookup xmlns="4873beb7-5857-4685-be1f-d57550cc96cc" xsi:nil="true"/>
+    <ArtSampleDocs xmlns="4873beb7-5857-4685-be1f-d57550cc96cc" xsi:nil="true"/>
+    <UACurrentWords xmlns="4873beb7-5857-4685-be1f-d57550cc96cc" xsi:nil="true"/>
+    <ShowIn xmlns="4873beb7-5857-4685-be1f-d57550cc96cc">Show everywhere</ShowIn>
+    <CSXHash xmlns="4873beb7-5857-4685-be1f-d57550cc96cc" xsi:nil="true"/>
+    <VoteCount xmlns="4873beb7-5857-4685-be1f-d57550cc96cc" xsi:nil="true"/>
+    <InternalTagsTaxHTField0 xmlns="4873beb7-5857-4685-be1f-d57550cc96cc">
+      <Terms xmlns="http://schemas.microsoft.com/office/infopath/2007/PartnerControls"/>
+    </InternalTagsTaxHTField0>
+    <UANotes xmlns="4873beb7-5857-4685-be1f-d57550cc96cc" xsi:nil="true"/>
+  </documentManagement>
+</p:properties>
+</file>
+
+<file path=customXml/item3.xml><?xml version="1.0" encoding="utf-8"?>
 <ct:contentTypeSchema xmlns:ct="http://schemas.microsoft.com/office/2006/metadata/contentType" xmlns:ma="http://schemas.microsoft.com/office/2006/metadata/properties/metaAttributes" ct:_="" ma:_="" ma:contentTypeName="TemplateFile" ma:contentTypeID="0x0101006EDDDB5EE6D98C44930B742096920B300400F5B6D36B3EF94B4E9A635CDF2A18F5B8" ma:contentTypeVersion="72" ma:contentTypeDescription="Create a new document." ma:contentTypeScope="" ma:versionID="a23e56308344d904b51738559c3d67c9">
   <xsd:schema xmlns:xsd="http://www.w3.org/2001/XMLSchema" xmlns:xs="http://www.w3.org/2001/XMLSchema" xmlns:p="http://schemas.microsoft.com/office/2006/metadata/properties" xmlns:ns2="4873beb7-5857-4685-be1f-d57550cc96cc" targetNamespace="http://schemas.microsoft.com/office/2006/metadata/properties" ma:root="true" ma:fieldsID="cd0908cc4600e77bf5da051303e00c8d" ns2:_="">
     <xsd:import namespace="4873beb7-5857-4685-be1f-d57550cc96cc"/>
@@ -7522,142 +8869,6 @@
 </ct:contentTypeSchema>
 </file>
 
-<file path=customXml/item3.xml><?xml version="1.0" encoding="utf-8"?>
-<p:properties xmlns:p="http://schemas.microsoft.com/office/2006/metadata/properties" xmlns:xsi="http://www.w3.org/2001/XMLSchema-instance" xmlns:pc="http://schemas.microsoft.com/office/infopath/2007/PartnerControls">
-  <documentManagement>
-    <LocLastLocAttemptVersionTypeLookup xmlns="4873beb7-5857-4685-be1f-d57550cc96cc" xsi:nil="true"/>
-    <MarketSpecific xmlns="4873beb7-5857-4685-be1f-d57550cc96cc">false</MarketSpecific>
-    <ApprovalStatus xmlns="4873beb7-5857-4685-be1f-d57550cc96cc">InProgress</ApprovalStatus>
-    <LocComments xmlns="4873beb7-5857-4685-be1f-d57550cc96cc" xsi:nil="true"/>
-    <DirectSourceMarket xmlns="4873beb7-5857-4685-be1f-d57550cc96cc" xsi:nil="true"/>
-    <LocPublishedLinkedAssetsLookup xmlns="4873beb7-5857-4685-be1f-d57550cc96cc" xsi:nil="true"/>
-    <ThumbnailAssetId xmlns="4873beb7-5857-4685-be1f-d57550cc96cc" xsi:nil="true"/>
-    <PrimaryImageGen xmlns="4873beb7-5857-4685-be1f-d57550cc96cc">true</PrimaryImageGen>
-    <LegacyData xmlns="4873beb7-5857-4685-be1f-d57550cc96cc" xsi:nil="true"/>
-    <LocNewPublishedVersionLookup xmlns="4873beb7-5857-4685-be1f-d57550cc96cc" xsi:nil="true"/>
-    <NumericId xmlns="4873beb7-5857-4685-be1f-d57550cc96cc">102787001</NumericId>
-    <TPFriendlyName xmlns="4873beb7-5857-4685-be1f-d57550cc96cc" xsi:nil="true"/>
-    <LocOverallPublishStatusLookup xmlns="4873beb7-5857-4685-be1f-d57550cc96cc" xsi:nil="true"/>
-    <LocRecommendedHandoff xmlns="4873beb7-5857-4685-be1f-d57550cc96cc" xsi:nil="true"/>
-    <BlockPublish xmlns="4873beb7-5857-4685-be1f-d57550cc96cc">false</BlockPublish>
-    <BusinessGroup xmlns="4873beb7-5857-4685-be1f-d57550cc96cc" xsi:nil="true"/>
-    <OpenTemplate xmlns="4873beb7-5857-4685-be1f-d57550cc96cc">true</OpenTemplate>
-    <SourceTitle xmlns="4873beb7-5857-4685-be1f-d57550cc96cc" xsi:nil="true"/>
-    <LocOverallLocStatusLookup xmlns="4873beb7-5857-4685-be1f-d57550cc96cc" xsi:nil="true"/>
-    <APEditor xmlns="4873beb7-5857-4685-be1f-d57550cc96cc">
-      <UserInfo>
-        <DisplayName/>
-        <AccountId xsi:nil="true"/>
-        <AccountType/>
-      </UserInfo>
-    </APEditor>
-    <UALocComments xmlns="4873beb7-5857-4685-be1f-d57550cc96cc" xsi:nil="true"/>
-    <IntlLangReviewDate xmlns="4873beb7-5857-4685-be1f-d57550cc96cc" xsi:nil="true"/>
-    <PublishStatusLookup xmlns="4873beb7-5857-4685-be1f-d57550cc96cc">
-      <Value>1343188</Value>
-    </PublishStatusLookup>
-    <ParentAssetId xmlns="4873beb7-5857-4685-be1f-d57550cc96cc" xsi:nil="true"/>
-    <FeatureTagsTaxHTField0 xmlns="4873beb7-5857-4685-be1f-d57550cc96cc">
-      <Terms xmlns="http://schemas.microsoft.com/office/infopath/2007/PartnerControls"/>
-    </FeatureTagsTaxHTField0>
-    <MachineTranslated xmlns="4873beb7-5857-4685-be1f-d57550cc96cc">false</MachineTranslated>
-    <Providers xmlns="4873beb7-5857-4685-be1f-d57550cc96cc" xsi:nil="true"/>
-    <OriginalSourceMarket xmlns="4873beb7-5857-4685-be1f-d57550cc96cc" xsi:nil="true"/>
-    <APDescription xmlns="4873beb7-5857-4685-be1f-d57550cc96cc" xsi:nil="true"/>
-    <ContentItem xmlns="4873beb7-5857-4685-be1f-d57550cc96cc" xsi:nil="true"/>
-    <ClipArtFilename xmlns="4873beb7-5857-4685-be1f-d57550cc96cc" xsi:nil="true"/>
-    <TPInstallLocation xmlns="4873beb7-5857-4685-be1f-d57550cc96cc" xsi:nil="true"/>
-    <TimesCloned xmlns="4873beb7-5857-4685-be1f-d57550cc96cc" xsi:nil="true"/>
-    <PublishTargets xmlns="4873beb7-5857-4685-be1f-d57550cc96cc">OfficeOnlineVNext</PublishTargets>
-    <AcquiredFrom xmlns="4873beb7-5857-4685-be1f-d57550cc96cc">Internal MS</AcquiredFrom>
-    <AssetStart xmlns="4873beb7-5857-4685-be1f-d57550cc96cc">2011-11-23T17:29:00+00:00</AssetStart>
-    <FriendlyTitle xmlns="4873beb7-5857-4685-be1f-d57550cc96cc" xsi:nil="true"/>
-    <Provider xmlns="4873beb7-5857-4685-be1f-d57550cc96cc" xsi:nil="true"/>
-    <LastHandOff xmlns="4873beb7-5857-4685-be1f-d57550cc96cc" xsi:nil="true"/>
-    <TPClientViewer xmlns="4873beb7-5857-4685-be1f-d57550cc96cc" xsi:nil="true"/>
-    <TemplateStatus xmlns="4873beb7-5857-4685-be1f-d57550cc96cc">Complete</TemplateStatus>
-    <Downloads xmlns="4873beb7-5857-4685-be1f-d57550cc96cc">0</Downloads>
-    <OOCacheId xmlns="4873beb7-5857-4685-be1f-d57550cc96cc" xsi:nil="true"/>
-    <IsDeleted xmlns="4873beb7-5857-4685-be1f-d57550cc96cc">false</IsDeleted>
-    <LocPublishedDependentAssetsLookup xmlns="4873beb7-5857-4685-be1f-d57550cc96cc" xsi:nil="true"/>
-    <AssetExpire xmlns="4873beb7-5857-4685-be1f-d57550cc96cc">2029-05-12T07:00:00+00:00</AssetExpire>
-    <CSXSubmissionMarket xmlns="4873beb7-5857-4685-be1f-d57550cc96cc" xsi:nil="true"/>
-    <DSATActionTaken xmlns="4873beb7-5857-4685-be1f-d57550cc96cc" xsi:nil="true"/>
-    <SubmitterId xmlns="4873beb7-5857-4685-be1f-d57550cc96cc" xsi:nil="true"/>
-    <EditorialTags xmlns="4873beb7-5857-4685-be1f-d57550cc96cc" xsi:nil="true"/>
-    <TPExecutable xmlns="4873beb7-5857-4685-be1f-d57550cc96cc" xsi:nil="true"/>
-    <CSXSubmissionDate xmlns="4873beb7-5857-4685-be1f-d57550cc96cc" xsi:nil="true"/>
-    <CSXUpdate xmlns="4873beb7-5857-4685-be1f-d57550cc96cc">false</CSXUpdate>
-    <AssetType xmlns="4873beb7-5857-4685-be1f-d57550cc96cc">TP</AssetType>
-    <ApprovalLog xmlns="4873beb7-5857-4685-be1f-d57550cc96cc" xsi:nil="true"/>
-    <BugNumber xmlns="4873beb7-5857-4685-be1f-d57550cc96cc" xsi:nil="true"/>
-    <OriginAsset xmlns="4873beb7-5857-4685-be1f-d57550cc96cc" xsi:nil="true"/>
-    <TPComponent xmlns="4873beb7-5857-4685-be1f-d57550cc96cc" xsi:nil="true"/>
-    <Milestone xmlns="4873beb7-5857-4685-be1f-d57550cc96cc" xsi:nil="true"/>
-    <RecommendationsModifier xmlns="4873beb7-5857-4685-be1f-d57550cc96cc" xsi:nil="true"/>
-    <AssetId xmlns="4873beb7-5857-4685-be1f-d57550cc96cc">TP102787001</AssetId>
-    <PolicheckWords xmlns="4873beb7-5857-4685-be1f-d57550cc96cc" xsi:nil="true"/>
-    <TPLaunchHelpLink xmlns="4873beb7-5857-4685-be1f-d57550cc96cc" xsi:nil="true"/>
-    <IntlLocPriority xmlns="4873beb7-5857-4685-be1f-d57550cc96cc" xsi:nil="true"/>
-    <TPApplication xmlns="4873beb7-5857-4685-be1f-d57550cc96cc" xsi:nil="true"/>
-    <IntlLangReviewer xmlns="4873beb7-5857-4685-be1f-d57550cc96cc" xsi:nil="true"/>
-    <HandoffToMSDN xmlns="4873beb7-5857-4685-be1f-d57550cc96cc" xsi:nil="true"/>
-    <PlannedPubDate xmlns="4873beb7-5857-4685-be1f-d57550cc96cc" xsi:nil="true"/>
-    <CrawlForDependencies xmlns="4873beb7-5857-4685-be1f-d57550cc96cc">false</CrawlForDependencies>
-    <LocLastLocAttemptVersionLookup xmlns="4873beb7-5857-4685-be1f-d57550cc96cc">693888</LocLastLocAttemptVersionLookup>
-    <LocProcessedForHandoffsLookup xmlns="4873beb7-5857-4685-be1f-d57550cc96cc" xsi:nil="true"/>
-    <TrustLevel xmlns="4873beb7-5857-4685-be1f-d57550cc96cc">1 Microsoft Managed Content</TrustLevel>
-    <CampaignTagsTaxHTField0 xmlns="4873beb7-5857-4685-be1f-d57550cc96cc">
-      <Terms xmlns="http://schemas.microsoft.com/office/infopath/2007/PartnerControls"/>
-    </CampaignTagsTaxHTField0>
-    <TPNamespace xmlns="4873beb7-5857-4685-be1f-d57550cc96cc" xsi:nil="true"/>
-    <LocOverallPreviewStatusLookup xmlns="4873beb7-5857-4685-be1f-d57550cc96cc" xsi:nil="true"/>
-    <TaxCatchAll xmlns="4873beb7-5857-4685-be1f-d57550cc96cc"/>
-    <IsSearchable xmlns="4873beb7-5857-4685-be1f-d57550cc96cc">false</IsSearchable>
-    <TemplateTemplateType xmlns="4873beb7-5857-4685-be1f-d57550cc96cc">Word Document Template</TemplateTemplateType>
-    <Markets xmlns="4873beb7-5857-4685-be1f-d57550cc96cc"/>
-    <IntlLangReview xmlns="4873beb7-5857-4685-be1f-d57550cc96cc" xsi:nil="true"/>
-    <UAProjectedTotalWords xmlns="4873beb7-5857-4685-be1f-d57550cc96cc" xsi:nil="true"/>
-    <OutputCachingOn xmlns="4873beb7-5857-4685-be1f-d57550cc96cc">false</OutputCachingOn>
-    <AverageRating xmlns="4873beb7-5857-4685-be1f-d57550cc96cc" xsi:nil="true"/>
-    <LocMarketGroupTiers2 xmlns="4873beb7-5857-4685-be1f-d57550cc96cc" xsi:nil="true"/>
-    <APAuthor xmlns="4873beb7-5857-4685-be1f-d57550cc96cc">
-      <UserInfo>
-        <DisplayName>REDMOND\v-namall</DisplayName>
-        <AccountId>978</AccountId>
-        <AccountType/>
-      </UserInfo>
-    </APAuthor>
-    <TPCommandLine xmlns="4873beb7-5857-4685-be1f-d57550cc96cc" xsi:nil="true"/>
-    <LocManualTestRequired xmlns="4873beb7-5857-4685-be1f-d57550cc96cc">false</LocManualTestRequired>
-    <TPAppVersion xmlns="4873beb7-5857-4685-be1f-d57550cc96cc" xsi:nil="true"/>
-    <EditorialStatus xmlns="4873beb7-5857-4685-be1f-d57550cc96cc">Complete</EditorialStatus>
-    <LocProcessedForMarketsLookup xmlns="4873beb7-5857-4685-be1f-d57550cc96cc" xsi:nil="true"/>
-    <LastModifiedDateTime xmlns="4873beb7-5857-4685-be1f-d57550cc96cc" xsi:nil="true"/>
-    <TPLaunchHelpLinkType xmlns="4873beb7-5857-4685-be1f-d57550cc96cc">Template</TPLaunchHelpLinkType>
-    <ScenarioTagsTaxHTField0 xmlns="4873beb7-5857-4685-be1f-d57550cc96cc">
-      <Terms xmlns="http://schemas.microsoft.com/office/infopath/2007/PartnerControls"/>
-    </ScenarioTagsTaxHTField0>
-    <OriginalRelease xmlns="4873beb7-5857-4685-be1f-d57550cc96cc">14</OriginalRelease>
-    <LocalizationTagsTaxHTField0 xmlns="4873beb7-5857-4685-be1f-d57550cc96cc">
-      <Terms xmlns="http://schemas.microsoft.com/office/infopath/2007/PartnerControls"/>
-    </LocalizationTagsTaxHTField0>
-    <Manager xmlns="4873beb7-5857-4685-be1f-d57550cc96cc" xsi:nil="true"/>
-    <UALocRecommendation xmlns="4873beb7-5857-4685-be1f-d57550cc96cc">Localize</UALocRecommendation>
-    <LocOverallHandbackStatusLookup xmlns="4873beb7-5857-4685-be1f-d57550cc96cc" xsi:nil="true"/>
-    <ArtSampleDocs xmlns="4873beb7-5857-4685-be1f-d57550cc96cc" xsi:nil="true"/>
-    <UACurrentWords xmlns="4873beb7-5857-4685-be1f-d57550cc96cc" xsi:nil="true"/>
-    <ShowIn xmlns="4873beb7-5857-4685-be1f-d57550cc96cc">Show everywhere</ShowIn>
-    <CSXHash xmlns="4873beb7-5857-4685-be1f-d57550cc96cc" xsi:nil="true"/>
-    <VoteCount xmlns="4873beb7-5857-4685-be1f-d57550cc96cc" xsi:nil="true"/>
-    <InternalTagsTaxHTField0 xmlns="4873beb7-5857-4685-be1f-d57550cc96cc">
-      <Terms xmlns="http://schemas.microsoft.com/office/infopath/2007/PartnerControls"/>
-    </InternalTagsTaxHTField0>
-    <UANotes xmlns="4873beb7-5857-4685-be1f-d57550cc96cc" xsi:nil="true"/>
-  </documentManagement>
-</p:properties>
-</file>
-
 <file path=customXml/itemProps1.xml><?xml version="1.0" encoding="utf-8"?>
 <ds:datastoreItem xmlns:ds="http://schemas.openxmlformats.org/officeDocument/2006/customXml" ds:itemID="{C01C3C56-10DB-49F7-B061-44D8728D078A}">
   <ds:schemaRefs>
@@ -7667,6 +8878,16 @@
 </file>
 
 <file path=customXml/itemProps2.xml><?xml version="1.0" encoding="utf-8"?>
+<ds:datastoreItem xmlns:ds="http://schemas.openxmlformats.org/officeDocument/2006/customXml" ds:itemID="{7FBDB1CC-CEFB-4E46-8174-1F0AA0D30B24}">
+  <ds:schemaRefs>
+    <ds:schemaRef ds:uri="http://schemas.microsoft.com/office/2006/metadata/properties"/>
+    <ds:schemaRef ds:uri="http://schemas.microsoft.com/office/infopath/2007/PartnerControls"/>
+    <ds:schemaRef ds:uri="4873beb7-5857-4685-be1f-d57550cc96cc"/>
+  </ds:schemaRefs>
+</ds:datastoreItem>
+</file>
+
+<file path=customXml/itemProps3.xml><?xml version="1.0" encoding="utf-8"?>
 <ds:datastoreItem xmlns:ds="http://schemas.openxmlformats.org/officeDocument/2006/customXml" ds:itemID="{4B3A7E92-E05A-4924-9E8A-9F6659E5855B}">
   <ds:schemaRefs>
     <ds:schemaRef ds:uri="http://schemas.microsoft.com/office/2006/metadata/contentType"/>
@@ -7682,14 +8903,4 @@
     <ds:schemaRef ds:uri="http://schemas.microsoft.com/internal/obd"/>
   </ds:schemaRefs>
 </ds:datastoreItem>
-</file>
-
-<file path=customXml/itemProps3.xml><?xml version="1.0" encoding="utf-8"?>
-<ds:datastoreItem xmlns:ds="http://schemas.openxmlformats.org/officeDocument/2006/customXml" ds:itemID="{7FBDB1CC-CEFB-4E46-8174-1F0AA0D30B24}">
-  <ds:schemaRefs>
-    <ds:schemaRef ds:uri="http://schemas.microsoft.com/office/2006/metadata/properties"/>
-    <ds:schemaRef ds:uri="http://schemas.microsoft.com/office/infopath/2007/PartnerControls"/>
-    <ds:schemaRef ds:uri="4873beb7-5857-4685-be1f-d57550cc96cc"/>
-  </ds:schemaRefs>
-</ds:datastoreItem>
 </file>
</xml_diff>